<commit_message>
Format both contents indexes as per-chapter table blocks like the sample
Co-Authored-By: Claude Fable 5 <noreply@anthropic.com>
Claude-Session: https://claude.ai/code/session_01ESPDZE2KAqBUfzv5HLVvG7
</commit_message>
<xml_diff>
--- a/seminar/Khaled Othman Baransi 212165096.docx
+++ b/seminar/Khaled Othman Baransi 212165096.docx
@@ -1612,6 +1612,49 @@
           </w:p>
         </w:tc>
       </w:tr>
+    </w:tbl>
+    <w:p>
+      <w:pPr>
+        <w:spacing w:before="160" w:after="0"/>
+      </w:pPr>
+    </w:p>
+    <w:p>
+      <w:pPr>
+        <w:bidi/>
+        <w:spacing w:after="140" w:line="360" w:lineRule="auto"/>
+        <w:jc w:val="center"/>
+      </w:pPr>
+      <w:r>
+        <w:rPr>
+          <w:rFonts w:ascii="Simplified Arabic" w:hAnsi="Simplified Arabic" w:cs="Simplified Arabic"/>
+          <w:b/>
+          <w:bCs/>
+          <w:sz w:val="30"/>
+          <w:szCs w:val="30"/>
+          <w:rtl/>
+        </w:rPr>
+        <w:t xml:space="preserve">الفصل الأوّل</w:t>
+      </w:r>
+    </w:p>
+    <w:tbl>
+      <w:tblPr>
+        <w:tblW w:w="9000" w:type="dxa"/>
+        <w:jc w:val="center"/>
+        <w:bidiVisual/>
+        <w:tblBorders>
+          <w:top w:val="single" w:sz="6" w:space="0" w:color="000000"/>
+          <w:left w:val="single" w:sz="6" w:space="0" w:color="000000"/>
+          <w:bottom w:val="single" w:sz="6" w:space="0" w:color="000000"/>
+          <w:right w:val="single" w:sz="6" w:space="0" w:color="000000"/>
+          <w:insideH w:val="single" w:sz="6" w:space="0" w:color="000000"/>
+          <w:insideV w:val="single" w:sz="6" w:space="0" w:color="000000"/>
+        </w:tblBorders>
+        <w:tblLayout w:type="fixed"/>
+      </w:tblPr>
+      <w:tblGrid>
+        <w:gridCol w:w="7700"/>
+        <w:gridCol w:w="1300"/>
+      </w:tblGrid>
       <w:tr>
         <w:tc>
           <w:tcPr>
@@ -1754,6 +1797,49 @@
           </w:p>
         </w:tc>
       </w:tr>
+    </w:tbl>
+    <w:p>
+      <w:pPr>
+        <w:spacing w:before="160" w:after="0"/>
+      </w:pPr>
+    </w:p>
+    <w:p>
+      <w:pPr>
+        <w:bidi/>
+        <w:spacing w:after="140" w:line="360" w:lineRule="auto"/>
+        <w:jc w:val="center"/>
+      </w:pPr>
+      <w:r>
+        <w:rPr>
+          <w:rFonts w:ascii="Simplified Arabic" w:hAnsi="Simplified Arabic" w:cs="Simplified Arabic"/>
+          <w:b/>
+          <w:bCs/>
+          <w:sz w:val="30"/>
+          <w:szCs w:val="30"/>
+          <w:rtl/>
+        </w:rPr>
+        <w:t xml:space="preserve">الفصل الثاني (التمهيديّ)</w:t>
+      </w:r>
+    </w:p>
+    <w:tbl>
+      <w:tblPr>
+        <w:tblW w:w="9000" w:type="dxa"/>
+        <w:jc w:val="center"/>
+        <w:bidiVisual/>
+        <w:tblBorders>
+          <w:top w:val="single" w:sz="6" w:space="0" w:color="000000"/>
+          <w:left w:val="single" w:sz="6" w:space="0" w:color="000000"/>
+          <w:bottom w:val="single" w:sz="6" w:space="0" w:color="000000"/>
+          <w:right w:val="single" w:sz="6" w:space="0" w:color="000000"/>
+          <w:insideH w:val="single" w:sz="6" w:space="0" w:color="000000"/>
+          <w:insideV w:val="single" w:sz="6" w:space="0" w:color="000000"/>
+        </w:tblBorders>
+        <w:tblLayout w:type="fixed"/>
+      </w:tblPr>
+      <w:tblGrid>
+        <w:gridCol w:w="7700"/>
+        <w:gridCol w:w="1300"/>
+      </w:tblGrid>
       <w:tr>
         <w:tc>
           <w:tcPr>
@@ -2133,6 +2219,49 @@
           </w:p>
         </w:tc>
       </w:tr>
+    </w:tbl>
+    <w:p>
+      <w:pPr>
+        <w:spacing w:before="160" w:after="0"/>
+      </w:pPr>
+    </w:p>
+    <w:p>
+      <w:pPr>
+        <w:bidi/>
+        <w:spacing w:after="140" w:line="360" w:lineRule="auto"/>
+        <w:jc w:val="center"/>
+      </w:pPr>
+      <w:r>
+        <w:rPr>
+          <w:rFonts w:ascii="Simplified Arabic" w:hAnsi="Simplified Arabic" w:cs="Simplified Arabic"/>
+          <w:b/>
+          <w:bCs/>
+          <w:sz w:val="30"/>
+          <w:szCs w:val="30"/>
+          <w:rtl/>
+        </w:rPr>
+        <w:t xml:space="preserve">الفصل الثالث</w:t>
+      </w:r>
+    </w:p>
+    <w:tbl>
+      <w:tblPr>
+        <w:tblW w:w="9000" w:type="dxa"/>
+        <w:jc w:val="center"/>
+        <w:bidiVisual/>
+        <w:tblBorders>
+          <w:top w:val="single" w:sz="6" w:space="0" w:color="000000"/>
+          <w:left w:val="single" w:sz="6" w:space="0" w:color="000000"/>
+          <w:bottom w:val="single" w:sz="6" w:space="0" w:color="000000"/>
+          <w:right w:val="single" w:sz="6" w:space="0" w:color="000000"/>
+          <w:insideH w:val="single" w:sz="6" w:space="0" w:color="000000"/>
+          <w:insideV w:val="single" w:sz="6" w:space="0" w:color="000000"/>
+        </w:tblBorders>
+        <w:tblLayout w:type="fixed"/>
+      </w:tblPr>
+      <w:tblGrid>
+        <w:gridCol w:w="7700"/>
+        <w:gridCol w:w="1300"/>
+      </w:tblGrid>
       <w:tr>
         <w:tc>
           <w:tcPr>
@@ -2322,6 +2451,49 @@
           </w:p>
         </w:tc>
       </w:tr>
+    </w:tbl>
+    <w:p>
+      <w:pPr>
+        <w:spacing w:before="160" w:after="0"/>
+      </w:pPr>
+    </w:p>
+    <w:p>
+      <w:pPr>
+        <w:bidi/>
+        <w:spacing w:after="140" w:line="360" w:lineRule="auto"/>
+        <w:jc w:val="center"/>
+      </w:pPr>
+      <w:r>
+        <w:rPr>
+          <w:rFonts w:ascii="Simplified Arabic" w:hAnsi="Simplified Arabic" w:cs="Simplified Arabic"/>
+          <w:b/>
+          <w:bCs/>
+          <w:sz w:val="30"/>
+          <w:szCs w:val="30"/>
+          <w:rtl/>
+        </w:rPr>
+        <w:t xml:space="preserve">الفصل الرابع</w:t>
+      </w:r>
+    </w:p>
+    <w:tbl>
+      <w:tblPr>
+        <w:tblW w:w="9000" w:type="dxa"/>
+        <w:jc w:val="center"/>
+        <w:bidiVisual/>
+        <w:tblBorders>
+          <w:top w:val="single" w:sz="6" w:space="0" w:color="000000"/>
+          <w:left w:val="single" w:sz="6" w:space="0" w:color="000000"/>
+          <w:bottom w:val="single" w:sz="6" w:space="0" w:color="000000"/>
+          <w:right w:val="single" w:sz="6" w:space="0" w:color="000000"/>
+          <w:insideH w:val="single" w:sz="6" w:space="0" w:color="000000"/>
+          <w:insideV w:val="single" w:sz="6" w:space="0" w:color="000000"/>
+        </w:tblBorders>
+        <w:tblLayout w:type="fixed"/>
+      </w:tblPr>
+      <w:tblGrid>
+        <w:gridCol w:w="7700"/>
+        <w:gridCol w:w="1300"/>
+      </w:tblGrid>
       <w:tr>
         <w:tc>
           <w:tcPr>
@@ -3317,6 +3489,49 @@
           </w:p>
         </w:tc>
       </w:tr>
+    </w:tbl>
+    <w:p>
+      <w:pPr>
+        <w:spacing w:before="160" w:after="0"/>
+      </w:pPr>
+    </w:p>
+    <w:p>
+      <w:pPr>
+        <w:bidi/>
+        <w:spacing w:after="140" w:line="360" w:lineRule="auto"/>
+        <w:jc w:val="center"/>
+      </w:pPr>
+      <w:r>
+        <w:rPr>
+          <w:rFonts w:ascii="Simplified Arabic" w:hAnsi="Simplified Arabic" w:cs="Simplified Arabic"/>
+          <w:b/>
+          <w:bCs/>
+          <w:sz w:val="30"/>
+          <w:szCs w:val="30"/>
+          <w:rtl/>
+        </w:rPr>
+        <w:t xml:space="preserve">الفصل الخامس</w:t>
+      </w:r>
+    </w:p>
+    <w:tbl>
+      <w:tblPr>
+        <w:tblW w:w="9000" w:type="dxa"/>
+        <w:jc w:val="center"/>
+        <w:bidiVisual/>
+        <w:tblBorders>
+          <w:top w:val="single" w:sz="6" w:space="0" w:color="000000"/>
+          <w:left w:val="single" w:sz="6" w:space="0" w:color="000000"/>
+          <w:bottom w:val="single" w:sz="6" w:space="0" w:color="000000"/>
+          <w:right w:val="single" w:sz="6" w:space="0" w:color="000000"/>
+          <w:insideH w:val="single" w:sz="6" w:space="0" w:color="000000"/>
+          <w:insideV w:val="single" w:sz="6" w:space="0" w:color="000000"/>
+        </w:tblBorders>
+        <w:tblLayout w:type="fixed"/>
+      </w:tblPr>
+      <w:tblGrid>
+        <w:gridCol w:w="7700"/>
+        <w:gridCol w:w="1300"/>
+      </w:tblGrid>
       <w:tr>
         <w:tc>
           <w:tcPr>
@@ -42202,6 +42417,49 @@
           </w:p>
         </w:tc>
       </w:tr>
+    </w:tbl>
+    <w:p>
+      <w:pPr>
+        <w:spacing w:before="160" w:after="0"/>
+      </w:pPr>
+    </w:p>
+    <w:p>
+      <w:pPr>
+        <w:bidi/>
+        <w:spacing w:after="140" w:line="360" w:lineRule="auto"/>
+        <w:jc w:val="center"/>
+      </w:pPr>
+      <w:r>
+        <w:rPr>
+          <w:rFonts w:ascii="Simplified Arabic" w:hAnsi="Simplified Arabic" w:cs="Simplified Arabic"/>
+          <w:b/>
+          <w:bCs/>
+          <w:sz w:val="30"/>
+          <w:szCs w:val="30"/>
+          <w:rtl/>
+        </w:rPr>
+        <w:t xml:space="preserve">الفصل الأوّل</w:t>
+      </w:r>
+    </w:p>
+    <w:tbl>
+      <w:tblPr>
+        <w:tblW w:w="9000" w:type="dxa"/>
+        <w:jc w:val="center"/>
+        <w:bidiVisual/>
+        <w:tblBorders>
+          <w:top w:val="single" w:sz="6" w:space="0" w:color="000000"/>
+          <w:left w:val="single" w:sz="6" w:space="0" w:color="000000"/>
+          <w:bottom w:val="single" w:sz="6" w:space="0" w:color="000000"/>
+          <w:right w:val="single" w:sz="6" w:space="0" w:color="000000"/>
+          <w:insideH w:val="single" w:sz="6" w:space="0" w:color="000000"/>
+          <w:insideV w:val="single" w:sz="6" w:space="0" w:color="000000"/>
+        </w:tblBorders>
+        <w:tblLayout w:type="fixed"/>
+      </w:tblPr>
+      <w:tblGrid>
+        <w:gridCol w:w="7700"/>
+        <w:gridCol w:w="1300"/>
+      </w:tblGrid>
       <w:tr>
         <w:tc>
           <w:tcPr>
@@ -42344,6 +42602,49 @@
           </w:p>
         </w:tc>
       </w:tr>
+    </w:tbl>
+    <w:p>
+      <w:pPr>
+        <w:spacing w:before="160" w:after="0"/>
+      </w:pPr>
+    </w:p>
+    <w:p>
+      <w:pPr>
+        <w:bidi/>
+        <w:spacing w:after="140" w:line="360" w:lineRule="auto"/>
+        <w:jc w:val="center"/>
+      </w:pPr>
+      <w:r>
+        <w:rPr>
+          <w:rFonts w:ascii="Simplified Arabic" w:hAnsi="Simplified Arabic" w:cs="Simplified Arabic"/>
+          <w:b/>
+          <w:bCs/>
+          <w:sz w:val="30"/>
+          <w:szCs w:val="30"/>
+          <w:rtl/>
+        </w:rPr>
+        <w:t xml:space="preserve">الفصل الثاني (التمهيديّ)</w:t>
+      </w:r>
+    </w:p>
+    <w:tbl>
+      <w:tblPr>
+        <w:tblW w:w="9000" w:type="dxa"/>
+        <w:jc w:val="center"/>
+        <w:bidiVisual/>
+        <w:tblBorders>
+          <w:top w:val="single" w:sz="6" w:space="0" w:color="000000"/>
+          <w:left w:val="single" w:sz="6" w:space="0" w:color="000000"/>
+          <w:bottom w:val="single" w:sz="6" w:space="0" w:color="000000"/>
+          <w:right w:val="single" w:sz="6" w:space="0" w:color="000000"/>
+          <w:insideH w:val="single" w:sz="6" w:space="0" w:color="000000"/>
+          <w:insideV w:val="single" w:sz="6" w:space="0" w:color="000000"/>
+        </w:tblBorders>
+        <w:tblLayout w:type="fixed"/>
+      </w:tblPr>
+      <w:tblGrid>
+        <w:gridCol w:w="7700"/>
+        <w:gridCol w:w="1300"/>
+      </w:tblGrid>
       <w:tr>
         <w:tc>
           <w:tcPr>
@@ -42723,6 +43024,49 @@
           </w:p>
         </w:tc>
       </w:tr>
+    </w:tbl>
+    <w:p>
+      <w:pPr>
+        <w:spacing w:before="160" w:after="0"/>
+      </w:pPr>
+    </w:p>
+    <w:p>
+      <w:pPr>
+        <w:bidi/>
+        <w:spacing w:after="140" w:line="360" w:lineRule="auto"/>
+        <w:jc w:val="center"/>
+      </w:pPr>
+      <w:r>
+        <w:rPr>
+          <w:rFonts w:ascii="Simplified Arabic" w:hAnsi="Simplified Arabic" w:cs="Simplified Arabic"/>
+          <w:b/>
+          <w:bCs/>
+          <w:sz w:val="30"/>
+          <w:szCs w:val="30"/>
+          <w:rtl/>
+        </w:rPr>
+        <w:t xml:space="preserve">الفصل الثالث</w:t>
+      </w:r>
+    </w:p>
+    <w:tbl>
+      <w:tblPr>
+        <w:tblW w:w="9000" w:type="dxa"/>
+        <w:jc w:val="center"/>
+        <w:bidiVisual/>
+        <w:tblBorders>
+          <w:top w:val="single" w:sz="6" w:space="0" w:color="000000"/>
+          <w:left w:val="single" w:sz="6" w:space="0" w:color="000000"/>
+          <w:bottom w:val="single" w:sz="6" w:space="0" w:color="000000"/>
+          <w:right w:val="single" w:sz="6" w:space="0" w:color="000000"/>
+          <w:insideH w:val="single" w:sz="6" w:space="0" w:color="000000"/>
+          <w:insideV w:val="single" w:sz="6" w:space="0" w:color="000000"/>
+        </w:tblBorders>
+        <w:tblLayout w:type="fixed"/>
+      </w:tblPr>
+      <w:tblGrid>
+        <w:gridCol w:w="7700"/>
+        <w:gridCol w:w="1300"/>
+      </w:tblGrid>
       <w:tr>
         <w:tc>
           <w:tcPr>
@@ -42912,6 +43256,49 @@
           </w:p>
         </w:tc>
       </w:tr>
+    </w:tbl>
+    <w:p>
+      <w:pPr>
+        <w:spacing w:before="160" w:after="0"/>
+      </w:pPr>
+    </w:p>
+    <w:p>
+      <w:pPr>
+        <w:bidi/>
+        <w:spacing w:after="140" w:line="360" w:lineRule="auto"/>
+        <w:jc w:val="center"/>
+      </w:pPr>
+      <w:r>
+        <w:rPr>
+          <w:rFonts w:ascii="Simplified Arabic" w:hAnsi="Simplified Arabic" w:cs="Simplified Arabic"/>
+          <w:b/>
+          <w:bCs/>
+          <w:sz w:val="30"/>
+          <w:szCs w:val="30"/>
+          <w:rtl/>
+        </w:rPr>
+        <w:t xml:space="preserve">الفصل الرابع</w:t>
+      </w:r>
+    </w:p>
+    <w:tbl>
+      <w:tblPr>
+        <w:tblW w:w="9000" w:type="dxa"/>
+        <w:jc w:val="center"/>
+        <w:bidiVisual/>
+        <w:tblBorders>
+          <w:top w:val="single" w:sz="6" w:space="0" w:color="000000"/>
+          <w:left w:val="single" w:sz="6" w:space="0" w:color="000000"/>
+          <w:bottom w:val="single" w:sz="6" w:space="0" w:color="000000"/>
+          <w:right w:val="single" w:sz="6" w:space="0" w:color="000000"/>
+          <w:insideH w:val="single" w:sz="6" w:space="0" w:color="000000"/>
+          <w:insideV w:val="single" w:sz="6" w:space="0" w:color="000000"/>
+        </w:tblBorders>
+        <w:tblLayout w:type="fixed"/>
+      </w:tblPr>
+      <w:tblGrid>
+        <w:gridCol w:w="7700"/>
+        <w:gridCol w:w="1300"/>
+      </w:tblGrid>
       <w:tr>
         <w:tc>
           <w:tcPr>
@@ -43907,6 +44294,49 @@
           </w:p>
         </w:tc>
       </w:tr>
+    </w:tbl>
+    <w:p>
+      <w:pPr>
+        <w:spacing w:before="160" w:after="0"/>
+      </w:pPr>
+    </w:p>
+    <w:p>
+      <w:pPr>
+        <w:bidi/>
+        <w:spacing w:after="140" w:line="360" w:lineRule="auto"/>
+        <w:jc w:val="center"/>
+      </w:pPr>
+      <w:r>
+        <w:rPr>
+          <w:rFonts w:ascii="Simplified Arabic" w:hAnsi="Simplified Arabic" w:cs="Simplified Arabic"/>
+          <w:b/>
+          <w:bCs/>
+          <w:sz w:val="30"/>
+          <w:szCs w:val="30"/>
+          <w:rtl/>
+        </w:rPr>
+        <w:t xml:space="preserve">الفصل الخامس</w:t>
+      </w:r>
+    </w:p>
+    <w:tbl>
+      <w:tblPr>
+        <w:tblW w:w="9000" w:type="dxa"/>
+        <w:jc w:val="center"/>
+        <w:bidiVisual/>
+        <w:tblBorders>
+          <w:top w:val="single" w:sz="6" w:space="0" w:color="000000"/>
+          <w:left w:val="single" w:sz="6" w:space="0" w:color="000000"/>
+          <w:bottom w:val="single" w:sz="6" w:space="0" w:color="000000"/>
+          <w:right w:val="single" w:sz="6" w:space="0" w:color="000000"/>
+          <w:insideH w:val="single" w:sz="6" w:space="0" w:color="000000"/>
+          <w:insideV w:val="single" w:sz="6" w:space="0" w:color="000000"/>
+        </w:tblBorders>
+        <w:tblLayout w:type="fixed"/>
+      </w:tblPr>
+      <w:tblGrid>
+        <w:gridCol w:w="7700"/>
+        <w:gridCol w:w="1300"/>
+      </w:tblGrid>
       <w:tr>
         <w:tc>
           <w:tcPr>

</xml_diff>

<commit_message>
Further expand Baransi seminar: qawaid-maqasid mabhath, women's work, modern work forms
- Chapter 4: new mabhath on governing fiqh maxims and maqasid applied to the
  research questions; new mabhath on Muslim women's work conditions (filling a
  gap promised in the introduction) and contemporary forms (remote work, gig
  platforms, tech companies)
- Chapter 3: new mabhath on psychological and family effects
- Chapter 5: sixth entry - ECFR fourth-session mortgage resolution with review
- Front matter: six research sub-questions; two more recommendations
- Rebuilt both contents indexes over the expanded layout (~101 pages)

Co-Authored-By: Claude Fable 5 <noreply@anthropic.com>
Claude-Session: https://claude.ai/code/session_01ESPDZE2KAqBUfzv5HLVvG7
</commit_message>
<xml_diff>
--- a/seminar/Khaled Othman Baransi 212165096.docx
+++ b/seminar/Khaled Othman Baransi 212165096.docx
@@ -749,7 +749,7 @@
                 <w:szCs w:val="26"/>
                 <w:rtl/>
               </w:rPr>
-              <w:t xml:space="preserve">7</w:t>
+              <w:t xml:space="preserve">8</w:t>
             </w:r>
           </w:p>
         </w:tc>
@@ -844,7 +844,7 @@
                 <w:szCs w:val="26"/>
                 <w:rtl/>
               </w:rPr>
-              <w:t xml:space="preserve">8</w:t>
+              <w:t xml:space="preserve">9</w:t>
             </w:r>
           </w:p>
         </w:tc>
@@ -891,7 +891,7 @@
                 <w:szCs w:val="26"/>
                 <w:rtl/>
               </w:rPr>
-              <w:t xml:space="preserve">9</w:t>
+              <w:t xml:space="preserve">10</w:t>
             </w:r>
           </w:p>
         </w:tc>
@@ -938,7 +938,7 @@
                 <w:szCs w:val="26"/>
                 <w:rtl/>
               </w:rPr>
-              <w:t xml:space="preserve">9</w:t>
+              <w:t xml:space="preserve">10</w:t>
             </w:r>
           </w:p>
         </w:tc>
@@ -985,7 +985,7 @@
                 <w:szCs w:val="26"/>
                 <w:rtl/>
               </w:rPr>
-              <w:t xml:space="preserve">10</w:t>
+              <w:t xml:space="preserve">11</w:t>
             </w:r>
           </w:p>
         </w:tc>
@@ -1032,7 +1032,7 @@
                 <w:szCs w:val="26"/>
                 <w:rtl/>
               </w:rPr>
-              <w:t xml:space="preserve">10</w:t>
+              <w:t xml:space="preserve">11</w:t>
             </w:r>
           </w:p>
         </w:tc>
@@ -1079,7 +1079,7 @@
                 <w:szCs w:val="26"/>
                 <w:rtl/>
               </w:rPr>
-              <w:t xml:space="preserve">11</w:t>
+              <w:t xml:space="preserve">12</w:t>
             </w:r>
           </w:p>
         </w:tc>
@@ -1127,7 +1127,7 @@
                 <w:szCs w:val="26"/>
                 <w:rtl/>
               </w:rPr>
-              <w:t xml:space="preserve">7</w:t>
+              <w:t xml:space="preserve">8</w:t>
             </w:r>
           </w:p>
         </w:tc>
@@ -1319,7 +1319,7 @@
                 <w:szCs w:val="26"/>
                 <w:rtl/>
               </w:rPr>
-              <w:t xml:space="preserve">7</w:t>
+              <w:t xml:space="preserve">8</w:t>
             </w:r>
           </w:p>
         </w:tc>
@@ -1367,7 +1367,7 @@
                 <w:szCs w:val="26"/>
                 <w:rtl/>
               </w:rPr>
-              <w:t xml:space="preserve">9</w:t>
+              <w:t xml:space="preserve">10</w:t>
             </w:r>
           </w:p>
         </w:tc>
@@ -1415,7 +1415,7 @@
                 <w:szCs w:val="26"/>
                 <w:rtl/>
               </w:rPr>
-              <w:t xml:space="preserve">9</w:t>
+              <w:t xml:space="preserve">10</w:t>
             </w:r>
           </w:p>
         </w:tc>
@@ -1463,7 +1463,7 @@
                 <w:szCs w:val="26"/>
                 <w:rtl/>
               </w:rPr>
-              <w:t xml:space="preserve">9</w:t>
+              <w:t xml:space="preserve">10</w:t>
             </w:r>
           </w:p>
         </w:tc>
@@ -1511,7 +1511,7 @@
                 <w:szCs w:val="26"/>
                 <w:rtl/>
               </w:rPr>
-              <w:t xml:space="preserve">10</w:t>
+              <w:t xml:space="preserve">11</w:t>
             </w:r>
           </w:p>
         </w:tc>
@@ -1559,7 +1559,7 @@
                 <w:szCs w:val="26"/>
                 <w:rtl/>
               </w:rPr>
-              <w:t xml:space="preserve">10</w:t>
+              <w:t xml:space="preserve">11</w:t>
             </w:r>
           </w:p>
         </w:tc>
@@ -1607,7 +1607,7 @@
                 <w:szCs w:val="26"/>
                 <w:rtl/>
               </w:rPr>
-              <w:t xml:space="preserve">11</w:t>
+              <w:t xml:space="preserve">12</w:t>
             </w:r>
           </w:p>
         </w:tc>
@@ -1698,7 +1698,7 @@
                 <w:szCs w:val="26"/>
                 <w:rtl/>
               </w:rPr>
-              <w:t xml:space="preserve">19</w:t>
+              <w:t xml:space="preserve">20</w:t>
             </w:r>
           </w:p>
         </w:tc>
@@ -1745,7 +1745,7 @@
                 <w:szCs w:val="26"/>
                 <w:rtl/>
               </w:rPr>
-              <w:t xml:space="preserve">19</w:t>
+              <w:t xml:space="preserve">20</w:t>
             </w:r>
           </w:p>
         </w:tc>
@@ -1792,7 +1792,7 @@
                 <w:szCs w:val="26"/>
                 <w:rtl/>
               </w:rPr>
-              <w:t xml:space="preserve">20</w:t>
+              <w:t xml:space="preserve">21</w:t>
             </w:r>
           </w:p>
         </w:tc>
@@ -1883,7 +1883,7 @@
                 <w:szCs w:val="26"/>
                 <w:rtl/>
               </w:rPr>
-              <w:t xml:space="preserve">23</w:t>
+              <w:t xml:space="preserve">24</w:t>
             </w:r>
           </w:p>
         </w:tc>
@@ -1930,7 +1930,7 @@
                 <w:szCs w:val="26"/>
                 <w:rtl/>
               </w:rPr>
-              <w:t xml:space="preserve">23</w:t>
+              <w:t xml:space="preserve">24</w:t>
             </w:r>
           </w:p>
         </w:tc>
@@ -1977,7 +1977,7 @@
                 <w:szCs w:val="26"/>
                 <w:rtl/>
               </w:rPr>
-              <w:t xml:space="preserve">23</w:t>
+              <w:t xml:space="preserve">24</w:t>
             </w:r>
           </w:p>
         </w:tc>
@@ -2024,7 +2024,7 @@
                 <w:szCs w:val="26"/>
                 <w:rtl/>
               </w:rPr>
-              <w:t xml:space="preserve">24</w:t>
+              <w:t xml:space="preserve">25</w:t>
             </w:r>
           </w:p>
         </w:tc>
@@ -2167,7 +2167,7 @@
                 <w:szCs w:val="26"/>
                 <w:rtl/>
               </w:rPr>
-              <w:t xml:space="preserve">26</w:t>
+              <w:t xml:space="preserve">27</w:t>
             </w:r>
           </w:p>
         </w:tc>
@@ -2214,7 +2214,7 @@
                 <w:szCs w:val="26"/>
                 <w:rtl/>
               </w:rPr>
-              <w:t xml:space="preserve">26</w:t>
+              <w:t xml:space="preserve">27</w:t>
             </w:r>
           </w:p>
         </w:tc>
@@ -2305,7 +2305,7 @@
                 <w:szCs w:val="26"/>
                 <w:rtl/>
               </w:rPr>
-              <w:t xml:space="preserve">28</w:t>
+              <w:t xml:space="preserve">29</w:t>
             </w:r>
           </w:p>
         </w:tc>
@@ -2352,7 +2352,7 @@
                 <w:szCs w:val="26"/>
                 <w:rtl/>
               </w:rPr>
-              <w:t xml:space="preserve">28</w:t>
+              <w:t xml:space="preserve">29</w:t>
             </w:r>
           </w:p>
         </w:tc>
@@ -2399,7 +2399,7 @@
                 <w:szCs w:val="26"/>
                 <w:rtl/>
               </w:rPr>
-              <w:t xml:space="preserve">28</w:t>
+              <w:t xml:space="preserve">29</w:t>
             </w:r>
           </w:p>
         </w:tc>
@@ -2446,7 +2446,54 @@
                 <w:szCs w:val="26"/>
                 <w:rtl/>
               </w:rPr>
-              <w:t xml:space="preserve">29</w:t>
+              <w:t xml:space="preserve">30</w:t>
+            </w:r>
+          </w:p>
+        </w:tc>
+      </w:tr>
+      <w:tr>
+        <w:tc>
+          <w:tcPr>
+            <w:tcW w:w="7700" w:type="dxa"/>
+            <w:vAlign w:val="center"/>
+          </w:tcPr>
+          <w:p>
+            <w:pPr>
+              <w:bidi/>
+              <w:ind w:right="340"/>
+              <w:spacing w:before="30" w:after="30" w:line="276" w:lineRule="auto"/>
+              <w:jc w:val="right"/>
+            </w:pPr>
+            <w:r>
+              <w:rPr>
+                <w:rFonts w:ascii="Simplified Arabic" w:hAnsi="Simplified Arabic" w:cs="Simplified Arabic"/>
+                <w:sz w:val="26"/>
+                <w:szCs w:val="26"/>
+                <w:rtl/>
+              </w:rPr>
+              <w:t xml:space="preserve">المبحث الرابع: الآثار النفسيّة والأسريّة.</w:t>
+            </w:r>
+          </w:p>
+        </w:tc>
+        <w:tc>
+          <w:tcPr>
+            <w:tcW w:w="1300" w:type="dxa"/>
+            <w:vAlign w:val="center"/>
+          </w:tcPr>
+          <w:p>
+            <w:pPr>
+              <w:bidi/>
+              <w:spacing w:before="30" w:after="30" w:line="276" w:lineRule="auto"/>
+              <w:jc w:val="center"/>
+            </w:pPr>
+            <w:r>
+              <w:rPr>
+                <w:rFonts w:ascii="Simplified Arabic" w:hAnsi="Simplified Arabic" w:cs="Simplified Arabic"/>
+                <w:sz w:val="26"/>
+                <w:szCs w:val="26"/>
+                <w:rtl/>
+              </w:rPr>
+              <w:t xml:space="preserve">31</w:t>
             </w:r>
           </w:p>
         </w:tc>
@@ -2537,7 +2584,7 @@
                 <w:szCs w:val="26"/>
                 <w:rtl/>
               </w:rPr>
-              <w:t xml:space="preserve">31</w:t>
+              <w:t xml:space="preserve">32</w:t>
             </w:r>
           </w:p>
         </w:tc>
@@ -2584,7 +2631,7 @@
                 <w:szCs w:val="26"/>
                 <w:rtl/>
               </w:rPr>
-              <w:t xml:space="preserve">31</w:t>
+              <w:t xml:space="preserve">32</w:t>
             </w:r>
           </w:p>
         </w:tc>
@@ -2631,7 +2678,7 @@
                 <w:szCs w:val="26"/>
                 <w:rtl/>
               </w:rPr>
-              <w:t xml:space="preserve">34</w:t>
+              <w:t xml:space="preserve">35</w:t>
             </w:r>
           </w:p>
         </w:tc>
@@ -2678,7 +2725,7 @@
                 <w:szCs w:val="26"/>
                 <w:rtl/>
               </w:rPr>
-              <w:t xml:space="preserve">35</w:t>
+              <w:t xml:space="preserve">36</w:t>
             </w:r>
           </w:p>
         </w:tc>
@@ -2725,7 +2772,7 @@
                 <w:szCs w:val="26"/>
                 <w:rtl/>
               </w:rPr>
-              <w:t xml:space="preserve">39</w:t>
+              <w:t xml:space="preserve">40</w:t>
             </w:r>
           </w:p>
         </w:tc>
@@ -2772,7 +2819,7 @@
                 <w:szCs w:val="26"/>
                 <w:rtl/>
               </w:rPr>
-              <w:t xml:space="preserve">45</w:t>
+              <w:t xml:space="preserve">46</w:t>
             </w:r>
           </w:p>
         </w:tc>
@@ -2819,7 +2866,7 @@
                 <w:szCs w:val="26"/>
                 <w:rtl/>
               </w:rPr>
-              <w:t xml:space="preserve">48</w:t>
+              <w:t xml:space="preserve">49</w:t>
             </w:r>
           </w:p>
         </w:tc>
@@ -2866,7 +2913,7 @@
                 <w:szCs w:val="26"/>
                 <w:rtl/>
               </w:rPr>
-              <w:t xml:space="preserve">55</w:t>
+              <w:t xml:space="preserve">56</w:t>
             </w:r>
           </w:p>
         </w:tc>
@@ -2913,7 +2960,7 @@
                 <w:szCs w:val="26"/>
                 <w:rtl/>
               </w:rPr>
-              <w:t xml:space="preserve">60</w:t>
+              <w:t xml:space="preserve">61</w:t>
             </w:r>
           </w:p>
         </w:tc>
@@ -2960,7 +3007,7 @@
                 <w:szCs w:val="26"/>
                 <w:rtl/>
               </w:rPr>
-              <w:t xml:space="preserve">66</w:t>
+              <w:t xml:space="preserve">67</w:t>
             </w:r>
           </w:p>
         </w:tc>
@@ -3007,7 +3054,7 @@
                 <w:szCs w:val="26"/>
                 <w:rtl/>
               </w:rPr>
-              <w:t xml:space="preserve">70</w:t>
+              <w:t xml:space="preserve">71</w:t>
             </w:r>
           </w:p>
         </w:tc>
@@ -3055,7 +3102,7 @@
                 <w:szCs w:val="26"/>
                 <w:rtl/>
               </w:rPr>
-              <w:t xml:space="preserve">70</w:t>
+              <w:t xml:space="preserve">71</w:t>
             </w:r>
           </w:p>
         </w:tc>
@@ -3103,7 +3150,7 @@
                 <w:szCs w:val="26"/>
                 <w:rtl/>
               </w:rPr>
-              <w:t xml:space="preserve">71</w:t>
+              <w:t xml:space="preserve">72</w:t>
             </w:r>
           </w:p>
         </w:tc>
@@ -3151,7 +3198,7 @@
                 <w:szCs w:val="26"/>
                 <w:rtl/>
               </w:rPr>
-              <w:t xml:space="preserve">73</w:t>
+              <w:t xml:space="preserve">74</w:t>
             </w:r>
           </w:p>
         </w:tc>
@@ -3198,7 +3245,7 @@
                 <w:szCs w:val="26"/>
                 <w:rtl/>
               </w:rPr>
-              <w:t xml:space="preserve">74</w:t>
+              <w:t xml:space="preserve">75</w:t>
             </w:r>
           </w:p>
         </w:tc>
@@ -3246,7 +3293,7 @@
                 <w:szCs w:val="26"/>
                 <w:rtl/>
               </w:rPr>
-              <w:t xml:space="preserve">74</w:t>
+              <w:t xml:space="preserve">75</w:t>
             </w:r>
           </w:p>
         </w:tc>
@@ -3294,7 +3341,7 @@
                 <w:szCs w:val="26"/>
                 <w:rtl/>
               </w:rPr>
-              <w:t xml:space="preserve">76</w:t>
+              <w:t xml:space="preserve">77</w:t>
             </w:r>
           </w:p>
         </w:tc>
@@ -3341,7 +3388,7 @@
                 <w:szCs w:val="26"/>
                 <w:rtl/>
               </w:rPr>
-              <w:t xml:space="preserve">78</w:t>
+              <w:t xml:space="preserve">79</w:t>
             </w:r>
           </w:p>
         </w:tc>
@@ -3389,7 +3436,7 @@
                 <w:szCs w:val="26"/>
                 <w:rtl/>
               </w:rPr>
-              <w:t xml:space="preserve">78</w:t>
+              <w:t xml:space="preserve">79</w:t>
             </w:r>
           </w:p>
         </w:tc>
@@ -3437,7 +3484,7 @@
                 <w:szCs w:val="26"/>
                 <w:rtl/>
               </w:rPr>
-              <w:t xml:space="preserve">80</w:t>
+              <w:t xml:space="preserve">81</w:t>
             </w:r>
           </w:p>
         </w:tc>
@@ -3484,7 +3531,101 @@
                 <w:szCs w:val="26"/>
                 <w:rtl/>
               </w:rPr>
-              <w:t xml:space="preserve">82</w:t>
+              <w:t xml:space="preserve">83</w:t>
+            </w:r>
+          </w:p>
+        </w:tc>
+      </w:tr>
+      <w:tr>
+        <w:tc>
+          <w:tcPr>
+            <w:tcW w:w="7700" w:type="dxa"/>
+            <w:vAlign w:val="center"/>
+          </w:tcPr>
+          <w:p>
+            <w:pPr>
+              <w:bidi/>
+              <w:ind w:right="340"/>
+              <w:spacing w:before="30" w:after="30" w:line="276" w:lineRule="auto"/>
+              <w:jc w:val="right"/>
+            </w:pPr>
+            <w:r>
+              <w:rPr>
+                <w:rFonts w:ascii="Simplified Arabic" w:hAnsi="Simplified Arabic" w:cs="Simplified Arabic"/>
+                <w:sz w:val="26"/>
+                <w:szCs w:val="26"/>
+                <w:rtl/>
+              </w:rPr>
+              <w:t xml:space="preserve">المبحث الرابع عشر: القواعد الفقهيّة ومقاصد الشريعة الحاكمة لمسائل البحث.</w:t>
+            </w:r>
+          </w:p>
+        </w:tc>
+        <w:tc>
+          <w:tcPr>
+            <w:tcW w:w="1300" w:type="dxa"/>
+            <w:vAlign w:val="center"/>
+          </w:tcPr>
+          <w:p>
+            <w:pPr>
+              <w:bidi/>
+              <w:spacing w:before="30" w:after="30" w:line="276" w:lineRule="auto"/>
+              <w:jc w:val="center"/>
+            </w:pPr>
+            <w:r>
+              <w:rPr>
+                <w:rFonts w:ascii="Simplified Arabic" w:hAnsi="Simplified Arabic" w:cs="Simplified Arabic"/>
+                <w:sz w:val="26"/>
+                <w:szCs w:val="26"/>
+                <w:rtl/>
+              </w:rPr>
+              <w:t xml:space="preserve">87</w:t>
+            </w:r>
+          </w:p>
+        </w:tc>
+      </w:tr>
+      <w:tr>
+        <w:tc>
+          <w:tcPr>
+            <w:tcW w:w="7700" w:type="dxa"/>
+            <w:vAlign w:val="center"/>
+          </w:tcPr>
+          <w:p>
+            <w:pPr>
+              <w:bidi/>
+              <w:ind w:right="340"/>
+              <w:spacing w:before="30" w:after="30" w:line="276" w:lineRule="auto"/>
+              <w:jc w:val="right"/>
+            </w:pPr>
+            <w:r>
+              <w:rPr>
+                <w:rFonts w:ascii="Simplified Arabic" w:hAnsi="Simplified Arabic" w:cs="Simplified Arabic"/>
+                <w:sz w:val="26"/>
+                <w:szCs w:val="26"/>
+                <w:rtl/>
+              </w:rPr>
+              <w:t xml:space="preserve">المبحث الخامس عشر: ضوابط عمل المرأة المسلمة لدى غير المسلمين، وصور العمل المعاصرة.</w:t>
+            </w:r>
+          </w:p>
+        </w:tc>
+        <w:tc>
+          <w:tcPr>
+            <w:tcW w:w="1300" w:type="dxa"/>
+            <w:vAlign w:val="center"/>
+          </w:tcPr>
+          <w:p>
+            <w:pPr>
+              <w:bidi/>
+              <w:spacing w:before="30" w:after="30" w:line="276" w:lineRule="auto"/>
+              <w:jc w:val="center"/>
+            </w:pPr>
+            <w:r>
+              <w:rPr>
+                <w:rFonts w:ascii="Simplified Arabic" w:hAnsi="Simplified Arabic" w:cs="Simplified Arabic"/>
+                <w:sz w:val="26"/>
+                <w:szCs w:val="26"/>
+                <w:rtl/>
+              </w:rPr>
+              <w:t xml:space="preserve">89</w:t>
             </w:r>
           </w:p>
         </w:tc>
@@ -3575,7 +3716,7 @@
                 <w:szCs w:val="26"/>
                 <w:rtl/>
               </w:rPr>
-              <w:t xml:space="preserve">87</w:t>
+              <w:t xml:space="preserve">91</w:t>
             </w:r>
           </w:p>
         </w:tc>
@@ -3623,7 +3764,7 @@
                 <w:szCs w:val="26"/>
                 <w:rtl/>
               </w:rPr>
-              <w:t xml:space="preserve">89</w:t>
+              <w:t xml:space="preserve">93</w:t>
             </w:r>
           </w:p>
         </w:tc>
@@ -3671,7 +3812,7 @@
                 <w:szCs w:val="26"/>
                 <w:rtl/>
               </w:rPr>
-              <w:t xml:space="preserve">89</w:t>
+              <w:t xml:space="preserve">94</w:t>
             </w:r>
           </w:p>
         </w:tc>
@@ -3719,7 +3860,7 @@
                 <w:szCs w:val="26"/>
                 <w:rtl/>
               </w:rPr>
-              <w:t xml:space="preserve">89</w:t>
+              <w:t xml:space="preserve">94</w:t>
             </w:r>
           </w:p>
         </w:tc>
@@ -3815,7 +3956,7 @@
                 <w:szCs w:val="26"/>
                 <w:rtl/>
               </w:rPr>
-              <w:t xml:space="preserve">91</w:t>
+              <w:t xml:space="preserve">96</w:t>
             </w:r>
           </w:p>
         </w:tc>
@@ -3863,7 +4004,7 @@
                 <w:szCs w:val="26"/>
                 <w:rtl/>
               </w:rPr>
-              <w:t xml:space="preserve">91</w:t>
+              <w:t xml:space="preserve">96</w:t>
             </w:r>
           </w:p>
         </w:tc>
@@ -5447,6 +5588,136 @@
           <w:rtl/>
         </w:rPr>
         <w:footnoteReference w:id="2"/>
+      </w:r>
+    </w:p>
+    <w:p>
+      <w:pPr>
+        <w:bidi/>
+        <w:spacing w:after="100" w:line="360" w:lineRule="auto"/>
+        <w:jc w:val="right"/>
+      </w:pPr>
+      <w:r>
+        <w:rPr>
+          <w:rFonts w:ascii="Simplified Arabic" w:hAnsi="Simplified Arabic" w:cs="Simplified Arabic"/>
+          <w:b/>
+          <w:bCs/>
+          <w:sz w:val="28"/>
+          <w:szCs w:val="28"/>
+          <w:rtl/>
+        </w:rPr>
+        <w:t xml:space="preserve">أسئلة البحث الفرعيّة:</w:t>
+      </w:r>
+    </w:p>
+    <w:p>
+      <w:pPr>
+        <w:bidi/>
+        <w:spacing w:after="100" w:line="360" w:lineRule="auto"/>
+        <w:jc w:val="both"/>
+      </w:pPr>
+      <w:r>
+        <w:rPr>
+          <w:rFonts w:ascii="Simplified Arabic" w:hAnsi="Simplified Arabic" w:cs="Simplified Arabic"/>
+          <w:sz w:val="28"/>
+          <w:szCs w:val="28"/>
+          <w:rtl/>
+        </w:rPr>
+        <w:t xml:space="preserve">ينبثق عن إشكاليّة البحث الأسئلة الفرعيّة الآتية:</w:t>
+      </w:r>
+    </w:p>
+    <w:p>
+      <w:pPr>
+        <w:bidi/>
+        <w:spacing w:after="100" w:line="360" w:lineRule="auto"/>
+        <w:jc w:val="both"/>
+      </w:pPr>
+      <w:r>
+        <w:rPr>
+          <w:rFonts w:ascii="Simplified Arabic" w:hAnsi="Simplified Arabic" w:cs="Simplified Arabic"/>
+          <w:sz w:val="28"/>
+          <w:szCs w:val="28"/>
+          <w:rtl/>
+        </w:rPr>
+        <w:t xml:space="preserve">1. ما حكم عمل المسلم عند غير المسلم في الأعمال المباحة، وما ضوابطه؟</w:t>
+      </w:r>
+    </w:p>
+    <w:p>
+      <w:pPr>
+        <w:bidi/>
+        <w:spacing w:after="100" w:line="360" w:lineRule="auto"/>
+        <w:jc w:val="both"/>
+      </w:pPr>
+      <w:r>
+        <w:rPr>
+          <w:rFonts w:ascii="Simplified Arabic" w:hAnsi="Simplified Arabic" w:cs="Simplified Arabic"/>
+          <w:sz w:val="28"/>
+          <w:szCs w:val="28"/>
+          <w:rtl/>
+        </w:rPr>
+        <w:t xml:space="preserve">2. ما حكم الاشتغال في الأعمال المحرّمة وما يفضي إليها في الدول الأجنبيّة؟</w:t>
+      </w:r>
+    </w:p>
+    <w:p>
+      <w:pPr>
+        <w:bidi/>
+        <w:spacing w:after="100" w:line="360" w:lineRule="auto"/>
+        <w:jc w:val="both"/>
+      </w:pPr>
+      <w:r>
+        <w:rPr>
+          <w:rFonts w:ascii="Simplified Arabic" w:hAnsi="Simplified Arabic" w:cs="Simplified Arabic"/>
+          <w:sz w:val="28"/>
+          <w:szCs w:val="28"/>
+          <w:rtl/>
+        </w:rPr>
+        <w:t xml:space="preserve">3. ما حكم التعامل بالربا والتأمين والأسهم المختلطة في تلك الدول؟</w:t>
+      </w:r>
+    </w:p>
+    <w:p>
+      <w:pPr>
+        <w:bidi/>
+        <w:spacing w:after="100" w:line="360" w:lineRule="auto"/>
+        <w:jc w:val="both"/>
+      </w:pPr>
+      <w:r>
+        <w:rPr>
+          <w:rFonts w:ascii="Simplified Arabic" w:hAnsi="Simplified Arabic" w:cs="Simplified Arabic"/>
+          <w:sz w:val="28"/>
+          <w:szCs w:val="28"/>
+          <w:rtl/>
+        </w:rPr>
+        <w:t xml:space="preserve">4. ما الفرق بين ضوابط عمل الرجل وضوابط عمل المرأة المسلمة لدى غير المسلمين؟</w:t>
+      </w:r>
+    </w:p>
+    <w:p>
+      <w:pPr>
+        <w:bidi/>
+        <w:spacing w:after="100" w:line="360" w:lineRule="auto"/>
+        <w:jc w:val="both"/>
+      </w:pPr>
+      <w:r>
+        <w:rPr>
+          <w:rFonts w:ascii="Simplified Arabic" w:hAnsi="Simplified Arabic" w:cs="Simplified Arabic"/>
+          <w:sz w:val="28"/>
+          <w:szCs w:val="28"/>
+          <w:rtl/>
+        </w:rPr>
+        <w:t xml:space="preserve">5. ما أثر تغيّر وصف الدار (حرب، عهد، أمان) في الأحكام المتقدّمة؟</w:t>
+      </w:r>
+    </w:p>
+    <w:p>
+      <w:pPr>
+        <w:bidi/>
+        <w:spacing w:after="200" w:line="360" w:lineRule="auto"/>
+        <w:jc w:val="both"/>
+      </w:pPr>
+      <w:r>
+        <w:rPr>
+          <w:rFonts w:ascii="Simplified Arabic" w:hAnsi="Simplified Arabic" w:cs="Simplified Arabic"/>
+          <w:sz w:val="28"/>
+          <w:szCs w:val="28"/>
+          <w:rtl/>
+        </w:rPr>
+        <w:t xml:space="preserve">6. ما موقف الفتاوى المعاصرة من هذه المسائل، وما قيمتها عند الفحص العلميّ؟</w:t>
       </w:r>
     </w:p>
     <w:p>
@@ -11202,7 +11473,7 @@
           <w:szCs w:val="28"/>
           <w:rtl/>
         </w:rPr>
-        <w:t xml:space="preserve">وفيه ثلاثة مباحث: الآثار العامّة وصور المسائل؛ الآثار الاقتصاديّة والاجتماعيّة؛ الآثار القانونيّة.</w:t>
+        <w:t xml:space="preserve">وفيه أربعة مباحث: الآثار العامّة وصور المسائل؛ الآثار الاقتصاديّة والاجتماعيّة؛ الآثار القانونيّة؛ الآثار النفسيّة والأسريّة.</w:t>
       </w:r>
     </w:p>
     <w:p>
@@ -11716,6 +11987,98 @@
     </w:p>
     <w:p>
       <w:pPr>
+        <w:bidi/>
+        <w:spacing w:after="140" w:line="360" w:lineRule="auto"/>
+        <w:jc w:val="right"/>
+      </w:pPr>
+      <w:r>
+        <w:rPr>
+          <w:rFonts w:ascii="Simplified Arabic" w:hAnsi="Simplified Arabic" w:cs="Simplified Arabic"/>
+          <w:b/>
+          <w:bCs/>
+          <w:sz w:val="30"/>
+          <w:szCs w:val="30"/>
+          <w:rtl/>
+        </w:rPr>
+        <w:t xml:space="preserve">المبحث الرابع: الآثار النفسيّة والأسريّة.</w:t>
+      </w:r>
+    </w:p>
+    <w:p>
+      <w:pPr>
+        <w:bidi/>
+        <w:spacing w:after="100" w:line="360" w:lineRule="auto"/>
+        <w:jc w:val="both"/>
+      </w:pPr>
+      <w:r>
+        <w:rPr>
+          <w:rFonts w:ascii="Simplified Arabic" w:hAnsi="Simplified Arabic" w:cs="Simplified Arabic"/>
+          <w:sz w:val="28"/>
+          <w:szCs w:val="28"/>
+          <w:rtl/>
+        </w:rPr>
+        <w:t xml:space="preserve">لا يكتمل النظر في آثار عمل المسلم لدى غير المسلمين دون الجانب النفسيّ والأسريّ: فالعامل المهاجر يعيش غربةً مزدوجة، غربةَ المكان وغربةَ القيم، وقد يطول انفصاله عن أسرته أو ينقلها معه إلى بيئة مغايرة؛ ويترتّب على ذلك مسائل شرعيّة عمليّة: تربية الأولاد على الدين في بيئة غير مسلمة، والمحافظة على الصلاة والجمعة في أوقات عمل لا تراعيها، وأحكام الأسرة من زواج وطلاق تحت أنظمة قضائيّة غير إسلاميّة.</w:t>
+      </w:r>
+    </w:p>
+    <w:p>
+      <w:pPr>
+        <w:bidi/>
+        <w:spacing w:after="100" w:line="360" w:lineRule="auto"/>
+        <w:jc w:val="both"/>
+      </w:pPr>
+      <w:r>
+        <w:rPr>
+          <w:rFonts w:ascii="Simplified Arabic" w:hAnsi="Simplified Arabic" w:cs="Simplified Arabic"/>
+          <w:sz w:val="28"/>
+          <w:szCs w:val="28"/>
+          <w:rtl/>
+        </w:rPr>
+        <w:t xml:space="preserve">ويقابل هذه التحدّيات جانب إيجابيّ قرّرته أدبيّات فقه الأقلّيّات: فالوجود المسلم العامل المنضبط في تلك المجتمعات صار قناة تعريف عمليّ بالإسلام، وأداة نفي للصور النمطيّة، حتى عدّ بعض الباحثين إتقان العمل والأمانة فيه من فروض الدعوة بالحال</w:t>
+      </w:r>
+      <w:r>
+        <w:rPr>
+          <w:rStyle w:val="a8"/>
+        </w:rPr>
+        <w:footnoteReference w:id="207"/>
+      </w:r>
+      <w:r>
+        <w:rPr>
+          <w:rFonts w:ascii="Simplified Arabic" w:hAnsi="Simplified Arabic" w:cs="Simplified Arabic"/>
+          <w:sz w:val="28"/>
+          <w:szCs w:val="28"/>
+          <w:rtl/>
+        </w:rPr>
+        <w:t xml:space="preserve">.</w:t>
+      </w:r>
+    </w:p>
+    <w:p>
+      <w:pPr>
+        <w:bidi/>
+        <w:spacing w:after="100" w:line="360" w:lineRule="auto"/>
+        <w:jc w:val="both"/>
+      </w:pPr>
+      <w:r>
+        <w:rPr>
+          <w:rFonts w:ascii="Simplified Arabic" w:hAnsi="Simplified Arabic" w:cs="Simplified Arabic"/>
+          <w:b/>
+          <w:bCs/>
+          <w:sz w:val="28"/>
+          <w:szCs w:val="28"/>
+          <w:rtl/>
+        </w:rPr>
+        <w:t xml:space="preserve">تعقيب: </w:t>
+      </w:r>
+      <w:r>
+        <w:rPr>
+          <w:rFonts w:ascii="Simplified Arabic" w:hAnsi="Simplified Arabic" w:cs="Simplified Arabic"/>
+          <w:sz w:val="28"/>
+          <w:szCs w:val="28"/>
+          <w:rtl/>
+        </w:rPr>
+        <w:t xml:space="preserve">من خلال ما قمت بالاطلاع عليه من هذا الجانب، أعتقد أنّ أخطر الآثار النفسيّة ليس الغربة نفسها بل التطبيع التدريجيّ مع المخالفات بحكم الألفة؛ ولهذا كان من حكمة الفقهاء اشتراط القدرة على إظهار الدين شرطًا للإقامة، فهو صمّام الأمان النفسيّ قبل أن يكون حكمًا فقهيًّا.</w:t>
+      </w:r>
+    </w:p>
+    <w:p>
+      <w:pPr>
         <w:pStyle w:val="1"/>
         <w:pageBreakBefore/>
         <w:bidi/>
@@ -11748,7 +12111,7 @@
           <w:szCs w:val="28"/>
           <w:rtl/>
         </w:rPr>
-        <w:t xml:space="preserve">وهو قلب البحث، ويشتمل على ثلاثة عشر مبحثًا في صور العمل المختلفة: تحريرًا للمسألة، وعرضًا للأقوال والأدلّة ووجوه الاستدلال، ومناقشةً وترجيحًا.</w:t>
+        <w:t xml:space="preserve">وهو قلب البحث، ويشتمل على خمسة عشر مبحثًا في صور العمل المختلفة: تحريرًا للمسألة، وعرضًا للأقوال والأدلّة ووجوه الاستدلال، ومناقشةً وترجيحًا.</w:t>
       </w:r>
     </w:p>
     <w:p>
@@ -33607,6 +33970,573 @@
     </w:p>
     <w:p>
       <w:pPr>
+        <w:bidi/>
+        <w:spacing w:after="140" w:line="360" w:lineRule="auto"/>
+        <w:jc w:val="right"/>
+      </w:pPr>
+      <w:r>
+        <w:rPr>
+          <w:rFonts w:ascii="Simplified Arabic" w:hAnsi="Simplified Arabic" w:cs="Simplified Arabic"/>
+          <w:b/>
+          <w:bCs/>
+          <w:sz w:val="30"/>
+          <w:szCs w:val="30"/>
+          <w:rtl/>
+        </w:rPr>
+        <w:t xml:space="preserve">المبحث الرابع عشر: القواعد الفقهيّة ومقاصد الشريعة الحاكمة لمسائل البحث.</w:t>
+      </w:r>
+    </w:p>
+    <w:p>
+      <w:pPr>
+        <w:bidi/>
+        <w:spacing w:after="100" w:line="360" w:lineRule="auto"/>
+        <w:jc w:val="right"/>
+      </w:pPr>
+      <w:r>
+        <w:rPr>
+          <w:rFonts w:ascii="Simplified Arabic" w:hAnsi="Simplified Arabic" w:cs="Simplified Arabic"/>
+          <w:b/>
+          <w:bCs/>
+          <w:sz w:val="28"/>
+          <w:szCs w:val="28"/>
+          <w:rtl/>
+        </w:rPr>
+        <w:t xml:space="preserve">أوّلًا: القواعد الفقهيّة وتطبيقاتها على مسائل البحث:</w:t>
+      </w:r>
+    </w:p>
+    <w:p>
+      <w:pPr>
+        <w:bidi/>
+        <w:spacing w:after="100" w:line="360" w:lineRule="auto"/>
+        <w:jc w:val="both"/>
+      </w:pPr>
+      <w:r>
+        <w:rPr>
+          <w:rFonts w:ascii="Simplified Arabic" w:hAnsi="Simplified Arabic" w:cs="Simplified Arabic"/>
+          <w:b/>
+          <w:bCs/>
+          <w:sz w:val="28"/>
+          <w:szCs w:val="28"/>
+          <w:rtl/>
+        </w:rPr>
+        <w:t xml:space="preserve">1. قاعدة "الأصل في المعاملات الإباحة": </w:t>
+      </w:r>
+      <w:r>
+        <w:rPr>
+          <w:rFonts w:ascii="Simplified Arabic" w:hAnsi="Simplified Arabic" w:cs="Simplified Arabic"/>
+          <w:sz w:val="28"/>
+          <w:szCs w:val="28"/>
+          <w:rtl/>
+        </w:rPr>
+        <w:t xml:space="preserve">وهي عمدة القول بجواز أصل العمل عند غير المسلمين؛ فكلّ عقد عمل لم يرد دليل بتحريمه باقٍ على الإباحة، وقد صرّح بمضمونها شيخ الإسلام ابن تيمية فيما نقلته في مبحث الأسهم: أنه لا يحرم على الناس من المعاملات التي يحتاجون إليها إلا ما دلّ الكتاب والسنّة على تحريمه</w:t>
+      </w:r>
+      <w:r>
+        <w:rPr>
+          <w:rStyle w:val="a8"/>
+        </w:rPr>
+        <w:footnoteReference w:id="208"/>
+      </w:r>
+      <w:r>
+        <w:rPr>
+          <w:rFonts w:ascii="Simplified Arabic" w:hAnsi="Simplified Arabic" w:cs="Simplified Arabic"/>
+          <w:sz w:val="28"/>
+          <w:szCs w:val="28"/>
+          <w:rtl/>
+        </w:rPr>
+        <w:t xml:space="preserve">.</w:t>
+      </w:r>
+    </w:p>
+    <w:p>
+      <w:pPr>
+        <w:bidi/>
+        <w:spacing w:after="100" w:line="360" w:lineRule="auto"/>
+        <w:jc w:val="both"/>
+      </w:pPr>
+      <w:r>
+        <w:rPr>
+          <w:rFonts w:ascii="Simplified Arabic" w:hAnsi="Simplified Arabic" w:cs="Simplified Arabic"/>
+          <w:b/>
+          <w:bCs/>
+          <w:sz w:val="28"/>
+          <w:szCs w:val="28"/>
+          <w:rtl/>
+        </w:rPr>
+        <w:t xml:space="preserve">2. قاعدة "الأمور بمقاصدها": </w:t>
+      </w:r>
+      <w:r>
+        <w:rPr>
+          <w:rFonts w:ascii="Simplified Arabic" w:hAnsi="Simplified Arabic" w:cs="Simplified Arabic"/>
+          <w:sz w:val="28"/>
+          <w:szCs w:val="28"/>
+          <w:rtl/>
+        </w:rPr>
+        <w:t xml:space="preserve">وبها يفترق العمل الواحد باختلاف نيّته وغايته: فبيع العنب لمن يتخذه خمرًا غير بيعه لمن يأكله، والعمل في مصنع سلاح يقاتل به المسلمون غير العمل فيه لغير ذلك، كما تقدّم في مباحث البيع والمصانع.</w:t>
+      </w:r>
+    </w:p>
+    <w:p>
+      <w:pPr>
+        <w:bidi/>
+        <w:spacing w:after="100" w:line="360" w:lineRule="auto"/>
+        <w:jc w:val="both"/>
+      </w:pPr>
+      <w:r>
+        <w:rPr>
+          <w:rFonts w:ascii="Simplified Arabic" w:hAnsi="Simplified Arabic" w:cs="Simplified Arabic"/>
+          <w:b/>
+          <w:bCs/>
+          <w:sz w:val="28"/>
+          <w:szCs w:val="28"/>
+          <w:rtl/>
+        </w:rPr>
+        <w:t xml:space="preserve">3. قاعدة "لا ضرر ولا ضرار": </w:t>
+      </w:r>
+      <w:r>
+        <w:rPr>
+          <w:rFonts w:ascii="Simplified Arabic" w:hAnsi="Simplified Arabic" w:cs="Simplified Arabic"/>
+          <w:sz w:val="28"/>
+          <w:szCs w:val="28"/>
+          <w:rtl/>
+        </w:rPr>
+        <w:t xml:space="preserve">وهي الضابط الثاني من ضوابط العمل: ألا يعود عمل المسلم بالضرر على المسلمين، وأصلها الحديث المتقدّم تخريجه في مبحث التأمين.</w:t>
+      </w:r>
+    </w:p>
+    <w:p>
+      <w:pPr>
+        <w:bidi/>
+        <w:spacing w:after="100" w:line="360" w:lineRule="auto"/>
+        <w:jc w:val="both"/>
+      </w:pPr>
+      <w:r>
+        <w:rPr>
+          <w:rFonts w:ascii="Simplified Arabic" w:hAnsi="Simplified Arabic" w:cs="Simplified Arabic"/>
+          <w:b/>
+          <w:bCs/>
+          <w:sz w:val="28"/>
+          <w:szCs w:val="28"/>
+          <w:rtl/>
+        </w:rPr>
+        <w:t xml:space="preserve">4. قاعدة "الضرورات تبيح المحظورات" وقيدها "الضرورة تقدَّر بقدرها": </w:t>
+      </w:r>
+      <w:r>
+        <w:rPr>
+          <w:rFonts w:ascii="Simplified Arabic" w:hAnsi="Simplified Arabic" w:cs="Simplified Arabic"/>
+          <w:sz w:val="28"/>
+          <w:szCs w:val="28"/>
+          <w:rtl/>
+        </w:rPr>
+        <w:t xml:space="preserve">وعليهما مدار الرخص في مواضع البحث كلّها: العمل في المحظور عند الاضطرار، والتأمين الإلزاميّ، والبقاء في العمل المختلط حتى يجد بديلًا؛ فالرخصة مؤقّتة مقدّرة لا دائمة مطلقة.</w:t>
+      </w:r>
+    </w:p>
+    <w:p>
+      <w:pPr>
+        <w:bidi/>
+        <w:spacing w:after="100" w:line="360" w:lineRule="auto"/>
+        <w:jc w:val="both"/>
+      </w:pPr>
+      <w:r>
+        <w:rPr>
+          <w:rFonts w:ascii="Simplified Arabic" w:hAnsi="Simplified Arabic" w:cs="Simplified Arabic"/>
+          <w:b/>
+          <w:bCs/>
+          <w:sz w:val="28"/>
+          <w:szCs w:val="28"/>
+          <w:rtl/>
+        </w:rPr>
+        <w:t xml:space="preserve">5. قاعدة "العادة محكَّمة": </w:t>
+      </w:r>
+      <w:r>
+        <w:rPr>
+          <w:rFonts w:ascii="Simplified Arabic" w:hAnsi="Simplified Arabic" w:cs="Simplified Arabic"/>
+          <w:sz w:val="28"/>
+          <w:szCs w:val="28"/>
+          <w:rtl/>
+        </w:rPr>
+        <w:t xml:space="preserve">وبها يرجع في حدود العمل وأعرافه - ساعاته وأجرته وواجباته - إلى عرف بلد العمل ما لم يصادم نصًّا.</w:t>
+      </w:r>
+    </w:p>
+    <w:p>
+      <w:pPr>
+        <w:bidi/>
+        <w:spacing w:after="100" w:line="360" w:lineRule="auto"/>
+        <w:jc w:val="both"/>
+      </w:pPr>
+      <w:r>
+        <w:rPr>
+          <w:rFonts w:ascii="Simplified Arabic" w:hAnsi="Simplified Arabic" w:cs="Simplified Arabic"/>
+          <w:b/>
+          <w:bCs/>
+          <w:sz w:val="28"/>
+          <w:szCs w:val="28"/>
+          <w:rtl/>
+        </w:rPr>
+        <w:t xml:space="preserve">6. قاعدة "ما حرم أخذه حرم إعطاؤه": </w:t>
+      </w:r>
+      <w:r>
+        <w:rPr>
+          <w:rFonts w:ascii="Simplified Arabic" w:hAnsi="Simplified Arabic" w:cs="Simplified Arabic"/>
+          <w:sz w:val="28"/>
+          <w:szCs w:val="28"/>
+          <w:rtl/>
+        </w:rPr>
+        <w:t xml:space="preserve">وهي التي أعملها المانعون في ربا دار الحرب، وتقدّمت مناقشة تحقيق مناطها هناك.</w:t>
+      </w:r>
+    </w:p>
+    <w:p>
+      <w:pPr>
+        <w:bidi/>
+        <w:spacing w:after="100" w:line="360" w:lineRule="auto"/>
+        <w:jc w:val="right"/>
+      </w:pPr>
+      <w:r>
+        <w:rPr>
+          <w:rFonts w:ascii="Simplified Arabic" w:hAnsi="Simplified Arabic" w:cs="Simplified Arabic"/>
+          <w:b/>
+          <w:bCs/>
+          <w:sz w:val="28"/>
+          <w:szCs w:val="28"/>
+          <w:rtl/>
+        </w:rPr>
+        <w:t xml:space="preserve">ثانيًا: مقاصد الشريعة في مسائل البحث:</w:t>
+      </w:r>
+    </w:p>
+    <w:p>
+      <w:pPr>
+        <w:bidi/>
+        <w:spacing w:after="100" w:line="360" w:lineRule="auto"/>
+        <w:jc w:val="both"/>
+      </w:pPr>
+      <w:r>
+        <w:rPr>
+          <w:rFonts w:ascii="Simplified Arabic" w:hAnsi="Simplified Arabic" w:cs="Simplified Arabic"/>
+          <w:sz w:val="28"/>
+          <w:szCs w:val="28"/>
+          <w:rtl/>
+        </w:rPr>
+        <w:t xml:space="preserve">تتجاذب نازلةَ العمل لدى غير المسلمين المقاصدُ الخمسة كلّها: فحفظ الدين هو المقصد الحاكم، وبه قُيّدت الإقامة والعمل بالقدرة على إظهار الدين؛ وحفظ النفس يظهر في تحريم العمل في جيوش تقاتل المسلمين وفي رخص الاضطرار؛ وحفظ العرض والنسل في ضوابط الاختلاط وعمل المرأة الآتية؛ وحفظ العقل في تحريم كلّ عمل في الخمر والمخدّرات؛ وحفظ المال في مشروعيّة الكسب أصلًا وفي تحريم الربا والغرر</w:t>
+      </w:r>
+      <w:r>
+        <w:rPr>
+          <w:rStyle w:val="a8"/>
+        </w:rPr>
+        <w:footnoteReference w:id="209"/>
+      </w:r>
+      <w:r>
+        <w:rPr>
+          <w:rFonts w:ascii="Simplified Arabic" w:hAnsi="Simplified Arabic" w:cs="Simplified Arabic"/>
+          <w:sz w:val="28"/>
+          <w:szCs w:val="28"/>
+          <w:rtl/>
+        </w:rPr>
+        <w:t xml:space="preserve">. والموازنة عند تزاحم هذه المقاصد تكون بتقديم حفظ الدين، ثم بموازنة رتب الحاجة والضرورة كما فصّلته في مواضعه.</w:t>
+      </w:r>
+    </w:p>
+    <w:p>
+      <w:pPr>
+        <w:bidi/>
+        <w:spacing w:after="100" w:line="360" w:lineRule="auto"/>
+        <w:jc w:val="both"/>
+      </w:pPr>
+      <w:r>
+        <w:rPr>
+          <w:rFonts w:ascii="Simplified Arabic" w:hAnsi="Simplified Arabic" w:cs="Simplified Arabic"/>
+          <w:b/>
+          <w:bCs/>
+          <w:sz w:val="28"/>
+          <w:szCs w:val="28"/>
+          <w:rtl/>
+        </w:rPr>
+        <w:t xml:space="preserve">تعقيب: </w:t>
+      </w:r>
+      <w:r>
+        <w:rPr>
+          <w:rFonts w:ascii="Simplified Arabic" w:hAnsi="Simplified Arabic" w:cs="Simplified Arabic"/>
+          <w:sz w:val="28"/>
+          <w:szCs w:val="28"/>
+          <w:rtl/>
+        </w:rPr>
+        <w:t xml:space="preserve">من خلال ما قمت بالاطلاع عليه عند جمع هذه القواعد والمقاصد، أرى أنّ مسائل البحث المتناثرة في ثلاثة عشر مبحثًا تنتظم كلّها في سلكها: فما من ترجيح رجّحته إلا وهو تطبيق لقاعدة من هذه القواعد في ضوء مقصد من تلك المقاصد، وهذا الانتظام هو الفارق بين الفتوى المجزّأة والفقه المنهجيّ.</w:t>
+      </w:r>
+    </w:p>
+    <w:p>
+      <w:pPr>
+        <w:bidi/>
+        <w:spacing w:after="140" w:line="360" w:lineRule="auto"/>
+        <w:jc w:val="right"/>
+      </w:pPr>
+      <w:r>
+        <w:rPr>
+          <w:rFonts w:ascii="Simplified Arabic" w:hAnsi="Simplified Arabic" w:cs="Simplified Arabic"/>
+          <w:b/>
+          <w:bCs/>
+          <w:sz w:val="30"/>
+          <w:szCs w:val="30"/>
+          <w:rtl/>
+        </w:rPr>
+        <w:t xml:space="preserve">المبحث الخامس عشر: ضوابط عمل المرأة المسلمة لدى غير المسلمين، وصور العمل المعاصرة.</w:t>
+      </w:r>
+    </w:p>
+    <w:p>
+      <w:pPr>
+        <w:bidi/>
+        <w:spacing w:after="100" w:line="360" w:lineRule="auto"/>
+        <w:jc w:val="right"/>
+      </w:pPr>
+      <w:r>
+        <w:rPr>
+          <w:rFonts w:ascii="Simplified Arabic" w:hAnsi="Simplified Arabic" w:cs="Simplified Arabic"/>
+          <w:b/>
+          <w:bCs/>
+          <w:sz w:val="28"/>
+          <w:szCs w:val="28"/>
+          <w:rtl/>
+        </w:rPr>
+        <w:t xml:space="preserve">أوّلًا: ضوابط عمل المرأة المسلمة:</w:t>
+      </w:r>
+    </w:p>
+    <w:p>
+      <w:pPr>
+        <w:bidi/>
+        <w:spacing w:after="100" w:line="360" w:lineRule="auto"/>
+        <w:jc w:val="both"/>
+      </w:pPr>
+      <w:r>
+        <w:rPr>
+          <w:rFonts w:ascii="Simplified Arabic" w:hAnsi="Simplified Arabic" w:cs="Simplified Arabic"/>
+          <w:sz w:val="28"/>
+          <w:szCs w:val="28"/>
+          <w:rtl/>
+        </w:rPr>
+        <w:t xml:space="preserve">وعدتُ في مطلع البحث ببيان ما تختصّ به المرأة من ضوابط، وأصل مشروعيّة عملها ثابت؛ وقد قصّ الله علينا عمل ابنتي الرجل الصالح في السقي: </w:t>
+      </w:r>
+      <w:r>
+        <w:rPr>
+          <w:rFonts w:ascii="Simplified Arabic" w:hAnsi="Simplified Arabic" w:cs="Simplified Arabic"/>
+          <w:b/>
+          <w:bCs/>
+          <w:sz w:val="28"/>
+          <w:szCs w:val="28"/>
+          <w:rtl/>
+        </w:rPr>
+        <w:t xml:space="preserve">﴿قَالَتَا لَا نَسْقِي حَتَّى يُصْدِرَ الرِّعَاءُ وَأَبُونَا شَيْخٌ كَبِيرٌ﴾</w:t>
+      </w:r>
+      <w:r>
+        <w:rPr>
+          <w:rFonts w:ascii="Simplified Arabic" w:hAnsi="Simplified Arabic" w:cs="Simplified Arabic"/>
+          <w:sz w:val="28"/>
+          <w:szCs w:val="28"/>
+          <w:rtl/>
+        </w:rPr>
+        <w:t xml:space="preserve"> (القصص: 23)، فعملتا للحاجة مع التزام الحياء المذكور في السياق. وتزيد المرأة على الضوابط العامّة المتقدّمة ضوابط خاصّة:</w:t>
+      </w:r>
+    </w:p>
+    <w:p>
+      <w:pPr>
+        <w:bidi/>
+        <w:spacing w:after="100" w:line="360" w:lineRule="auto"/>
+        <w:jc w:val="both"/>
+      </w:pPr>
+      <w:r>
+        <w:rPr>
+          <w:rFonts w:ascii="Simplified Arabic" w:hAnsi="Simplified Arabic" w:cs="Simplified Arabic"/>
+          <w:sz w:val="28"/>
+          <w:szCs w:val="28"/>
+          <w:rtl/>
+        </w:rPr>
+        <w:t xml:space="preserve">1. لباسها الشرعيّ في بيئة العمل، وقد تقدّم أنّ قوانين كثير من دول العمل تحمي هذا الحقّ.</w:t>
+      </w:r>
+    </w:p>
+    <w:p>
+      <w:pPr>
+        <w:bidi/>
+        <w:spacing w:after="100" w:line="360" w:lineRule="auto"/>
+        <w:jc w:val="both"/>
+      </w:pPr>
+      <w:r>
+        <w:rPr>
+          <w:rFonts w:ascii="Simplified Arabic" w:hAnsi="Simplified Arabic" w:cs="Simplified Arabic"/>
+          <w:sz w:val="28"/>
+          <w:szCs w:val="28"/>
+          <w:rtl/>
+        </w:rPr>
+        <w:t xml:space="preserve">2. اجتناب الخلوة المحرّمة بأجنبيّ، وضبط الاختلاط بالحاجة المهنيّة دون استرسال.</w:t>
+      </w:r>
+    </w:p>
+    <w:p>
+      <w:pPr>
+        <w:bidi/>
+        <w:spacing w:after="100" w:line="360" w:lineRule="auto"/>
+        <w:jc w:val="both"/>
+      </w:pPr>
+      <w:r>
+        <w:rPr>
+          <w:rFonts w:ascii="Simplified Arabic" w:hAnsi="Simplified Arabic" w:cs="Simplified Arabic"/>
+          <w:sz w:val="28"/>
+          <w:szCs w:val="28"/>
+          <w:rtl/>
+        </w:rPr>
+        <w:t xml:space="preserve">3. ألا يكون في طبيعة العمل ابتذال لها أو امتهان لأنوثتها، كأعمال الإغراء والدعاية بالجسد، فهذا محرّم في كلّ دار.</w:t>
+      </w:r>
+    </w:p>
+    <w:p>
+      <w:pPr>
+        <w:bidi/>
+        <w:spacing w:after="100" w:line="360" w:lineRule="auto"/>
+        <w:jc w:val="both"/>
+      </w:pPr>
+      <w:r>
+        <w:rPr>
+          <w:rFonts w:ascii="Simplified Arabic" w:hAnsi="Simplified Arabic" w:cs="Simplified Arabic"/>
+          <w:sz w:val="28"/>
+          <w:szCs w:val="28"/>
+          <w:rtl/>
+        </w:rPr>
+        <w:t xml:space="preserve">4. مراعاة حقّ الزوج والأولاد، والموازنة بين مصلحة الكسب وواجبات البيت بميزان المصالح المتقدّم.</w:t>
+      </w:r>
+    </w:p>
+    <w:p>
+      <w:pPr>
+        <w:bidi/>
+        <w:spacing w:after="100" w:line="360" w:lineRule="auto"/>
+        <w:jc w:val="both"/>
+      </w:pPr>
+      <w:r>
+        <w:rPr>
+          <w:rFonts w:ascii="Simplified Arabic" w:hAnsi="Simplified Arabic" w:cs="Simplified Arabic"/>
+          <w:sz w:val="28"/>
+          <w:szCs w:val="28"/>
+          <w:rtl/>
+        </w:rPr>
+        <w:t xml:space="preserve">5. أمن الطريق والمبيت، ومسألة سفرها للعمل جارية على خلاف الفقهاء في سفر المرأة المعروف.</w:t>
+      </w:r>
+    </w:p>
+    <w:p>
+      <w:pPr>
+        <w:bidi/>
+        <w:spacing w:after="100" w:line="360" w:lineRule="auto"/>
+        <w:jc w:val="right"/>
+      </w:pPr>
+      <w:r>
+        <w:rPr>
+          <w:rFonts w:ascii="Simplified Arabic" w:hAnsi="Simplified Arabic" w:cs="Simplified Arabic"/>
+          <w:b/>
+          <w:bCs/>
+          <w:sz w:val="28"/>
+          <w:szCs w:val="28"/>
+          <w:rtl/>
+        </w:rPr>
+        <w:t xml:space="preserve">ثانيًا: صور معاصرة مستجدّة من العمل:</w:t>
+      </w:r>
+    </w:p>
+    <w:p>
+      <w:pPr>
+        <w:bidi/>
+        <w:spacing w:after="100" w:line="360" w:lineRule="auto"/>
+        <w:jc w:val="both"/>
+      </w:pPr>
+      <w:r>
+        <w:rPr>
+          <w:rFonts w:ascii="Simplified Arabic" w:hAnsi="Simplified Arabic" w:cs="Simplified Arabic"/>
+          <w:b/>
+          <w:bCs/>
+          <w:sz w:val="28"/>
+          <w:szCs w:val="28"/>
+          <w:rtl/>
+        </w:rPr>
+        <w:t xml:space="preserve">1. العمل عن بُعد لشركات أجنبيّة: </w:t>
+      </w:r>
+      <w:r>
+        <w:rPr>
+          <w:rFonts w:ascii="Simplified Arabic" w:hAnsi="Simplified Arabic" w:cs="Simplified Arabic"/>
+          <w:sz w:val="28"/>
+          <w:szCs w:val="28"/>
+          <w:rtl/>
+        </w:rPr>
+        <w:t xml:space="preserve">وهو أن يعمل المسلم من بلده عبر الشبكة لمصلحة شركة في دولة أجنبيّة. وحكمه أيسر من الهجرة للعمل: إذ تنتفي مفاسد الغربة والاختلاط غالبًا، ويبقى النظر في مشروعيّة نشاط الشركة نفسها وفق ضوابط مبحث الشركات والأسهم؛ فهو من أوسع أبواب الكسب المباح للمسلم المعاصر.</w:t>
+      </w:r>
+    </w:p>
+    <w:p>
+      <w:pPr>
+        <w:bidi/>
+        <w:spacing w:after="100" w:line="360" w:lineRule="auto"/>
+        <w:jc w:val="both"/>
+      </w:pPr>
+      <w:r>
+        <w:rPr>
+          <w:rFonts w:ascii="Simplified Arabic" w:hAnsi="Simplified Arabic" w:cs="Simplified Arabic"/>
+          <w:b/>
+          <w:bCs/>
+          <w:sz w:val="28"/>
+          <w:szCs w:val="28"/>
+          <w:rtl/>
+        </w:rPr>
+        <w:t xml:space="preserve">2. العمل في منصّات التوصيل والاقتصاد المؤقّت: </w:t>
+      </w:r>
+      <w:r>
+        <w:rPr>
+          <w:rFonts w:ascii="Simplified Arabic" w:hAnsi="Simplified Arabic" w:cs="Simplified Arabic"/>
+          <w:sz w:val="28"/>
+          <w:szCs w:val="28"/>
+          <w:rtl/>
+        </w:rPr>
+        <w:t xml:space="preserve">كسائقي التطبيقات وعمّال التوصيل، وحكمه حكم الأجير المشترك المتقدّم؛ ومورد الفحص فيه ما يُكلَّف بتوصيله: فتوصيل الخمر ولحم الخنزير داخل في حديث لعن حاملها المتقدّم تخريجه، وقد أفتت المراكز المعاصرة بوجوب الاعتذار عن هذه الطلبات ما أمكن، فإن كان أصل عمله غالبُه حرام لم يجز.</w:t>
+      </w:r>
+    </w:p>
+    <w:p>
+      <w:pPr>
+        <w:bidi/>
+        <w:spacing w:after="100" w:line="360" w:lineRule="auto"/>
+        <w:jc w:val="both"/>
+      </w:pPr>
+      <w:r>
+        <w:rPr>
+          <w:rFonts w:ascii="Simplified Arabic" w:hAnsi="Simplified Arabic" w:cs="Simplified Arabic"/>
+          <w:b/>
+          <w:bCs/>
+          <w:sz w:val="28"/>
+          <w:szCs w:val="28"/>
+          <w:rtl/>
+        </w:rPr>
+        <w:t xml:space="preserve">3. العمل في شركات التقنية والإعلان: </w:t>
+      </w:r>
+      <w:r>
+        <w:rPr>
+          <w:rFonts w:ascii="Simplified Arabic" w:hAnsi="Simplified Arabic" w:cs="Simplified Arabic"/>
+          <w:sz w:val="28"/>
+          <w:szCs w:val="28"/>
+          <w:rtl/>
+        </w:rPr>
+        <w:t xml:space="preserve">الأصل فيه الإباحة كسائر الصنائع، ويحرم منه ما كان صناعةً لمحتوى محرّم أو إعلانًا عنه أو معالجةً لبيانات تستخدم في الإضرار بالمسلمين، قياسًا على ما تقدّم في بيع ما يعدّ وسيلة للحرام.</w:t>
+      </w:r>
+    </w:p>
+    <w:p>
+      <w:pPr>
+        <w:bidi/>
+        <w:spacing w:after="100" w:line="360" w:lineRule="auto"/>
+        <w:jc w:val="both"/>
+      </w:pPr>
+      <w:r>
+        <w:rPr>
+          <w:rFonts w:ascii="Simplified Arabic" w:hAnsi="Simplified Arabic" w:cs="Simplified Arabic"/>
+          <w:b/>
+          <w:bCs/>
+          <w:sz w:val="28"/>
+          <w:szCs w:val="28"/>
+          <w:rtl/>
+        </w:rPr>
+        <w:t xml:space="preserve">تعقيب: </w:t>
+      </w:r>
+      <w:r>
+        <w:rPr>
+          <w:rFonts w:ascii="Simplified Arabic" w:hAnsi="Simplified Arabic" w:cs="Simplified Arabic"/>
+          <w:sz w:val="28"/>
+          <w:szCs w:val="28"/>
+          <w:rtl/>
+        </w:rPr>
+        <w:t xml:space="preserve">من خلال ما قمت بالاطلاع عليه من هذه الصور المستجدّة، أعتقد أنّ أدوات البحث الموروثة - تقسيم الأجير، وسدّ الذرائع، وقاعدة الأمور بمقاصدها - كافية لاستيعاب كلّ صورة جديدة؛ فالنوازل تتجدّد صورها ولا تتجدّد أصولها، وهذا من شواهد صلاحية الشريعة لكلّ زمان.</w:t>
+      </w:r>
+    </w:p>
+    <w:p>
+      <w:pPr>
         <w:pStyle w:val="1"/>
         <w:pageBreakBefore/>
         <w:bidi/>
@@ -33637,7 +34567,7 @@
           <w:szCs w:val="28"/>
           <w:rtl/>
         </w:rPr>
-        <w:t xml:space="preserve">أعرض في هذا الفصل خمس فتاوى معاصرة صادرة عن دور إفتاء ومراكز معتبرة، بين مجيزة بشروط ومشدّدة، وأفحص كلّ فتوى على المعايير المتقدّمة في تعليمات البحث: تعلّقها بعين المسألة، وصحّة الاستشهاد بالنصوص، ووجود وجه الاستدلال، والتعليل عند ذكر الحكم.</w:t>
+        <w:t xml:space="preserve">أعرض في هذا الفصل ستّ فتاوى وقرارات معاصرة صادرة عن دور إفتاء ومراكز معتبرة، بين مجيزة بشروط ومشدّدة، وأفحص كلّ فتوى على المعايير المتقدّمة في تعليمات البحث: تعلّقها بعين المسألة، وصحّة الاستشهاد بالنصوص، ووجود وجه الاستدلال، والتعليل عند ذكر الحكم.</w:t>
       </w:r>
     </w:p>
     <w:p>
@@ -34072,6 +35002,120 @@
     </w:p>
     <w:p>
       <w:pPr>
+        <w:bidi/>
+        <w:spacing w:after="100" w:line="360" w:lineRule="auto"/>
+        <w:jc w:val="right"/>
+      </w:pPr>
+      <w:r>
+        <w:rPr>
+          <w:rFonts w:ascii="Simplified Arabic" w:hAnsi="Simplified Arabic" w:cs="Simplified Arabic"/>
+          <w:b/>
+          <w:bCs/>
+          <w:sz w:val="28"/>
+          <w:szCs w:val="28"/>
+          <w:rtl/>
+        </w:rPr>
+        <w:t xml:space="preserve">المطلب السادس: قرار المجلس الأوروبيّ للإفتاء والبحوث بشأن شراء المساكن بالقرض الربويّ.</w:t>
+      </w:r>
+    </w:p>
+    <w:p>
+      <w:pPr>
+        <w:bidi/>
+        <w:spacing w:after="100" w:line="360" w:lineRule="auto"/>
+        <w:jc w:val="both"/>
+      </w:pPr>
+      <w:r>
+        <w:rPr>
+          <w:rFonts w:ascii="Simplified Arabic" w:hAnsi="Simplified Arabic" w:cs="Simplified Arabic"/>
+          <w:b/>
+          <w:bCs/>
+          <w:sz w:val="28"/>
+          <w:szCs w:val="28"/>
+          <w:rtl/>
+        </w:rPr>
+        <w:t xml:space="preserve">الفرع الأوّل: مضمون القرار. </w:t>
+      </w:r>
+      <w:r>
+        <w:rPr>
+          <w:rFonts w:ascii="Simplified Arabic" w:hAnsi="Simplified Arabic" w:cs="Simplified Arabic"/>
+          <w:sz w:val="28"/>
+          <w:szCs w:val="28"/>
+          <w:rtl/>
+        </w:rPr>
+        <w:t xml:space="preserve">أصدر المجلس الأوروبيّ للإفتاء والبحوث في دورته الرابعة (1999م) قراره المشهور بجواز شراء المسلم في البلاد الغربيّة بيتَ سكناه بقرض ربويّ عند الحاجة، إذا لم يجد بديلًا مباحًا، مستندًا إلى حاجة الأسرة المسلمة إلى الاستقرار، وإلى مذهب أبي حنيفة ومحمد بن الحسن في معاملات المسلم في غير دار الإسلام المتقدّم عرضه في مبحث الربا</w:t>
+      </w:r>
+      <w:r>
+        <w:rPr>
+          <w:rStyle w:val="a8"/>
+        </w:rPr>
+        <w:footnoteReference w:id="210"/>
+      </w:r>
+      <w:r>
+        <w:rPr>
+          <w:rFonts w:ascii="Simplified Arabic" w:hAnsi="Simplified Arabic" w:cs="Simplified Arabic"/>
+          <w:sz w:val="28"/>
+          <w:szCs w:val="28"/>
+          <w:rtl/>
+        </w:rPr>
+        <w:t xml:space="preserve">؛ وقد عارضه جمهور الهيئات الإفتائيّة الأخرى وعدّته توسّعًا في الرخصة.</w:t>
+      </w:r>
+    </w:p>
+    <w:p>
+      <w:pPr>
+        <w:bidi/>
+        <w:spacing w:after="100" w:line="360" w:lineRule="auto"/>
+        <w:jc w:val="both"/>
+      </w:pPr>
+      <w:r>
+        <w:rPr>
+          <w:rFonts w:ascii="Simplified Arabic" w:hAnsi="Simplified Arabic" w:cs="Simplified Arabic"/>
+          <w:b/>
+          <w:bCs/>
+          <w:sz w:val="28"/>
+          <w:szCs w:val="28"/>
+          <w:rtl/>
+        </w:rPr>
+        <w:t xml:space="preserve">الفرع الثاني: الردّ والتعقيب. </w:t>
+      </w:r>
+      <w:r>
+        <w:rPr>
+          <w:rFonts w:ascii="Simplified Arabic" w:hAnsi="Simplified Arabic" w:cs="Simplified Arabic"/>
+          <w:sz w:val="28"/>
+          <w:szCs w:val="28"/>
+          <w:rtl/>
+        </w:rPr>
+        <w:t xml:space="preserve">وبعد فحص القرار وجدتُ أنّه واضح الصنعة قويّ العرض من جهة بنائه على أصل مذهبيّ معروف وتحقيقه لواقع حاجة الأسر المسلمة في الغرب؛ ومورد النقد فيه توسيع معنى الحاجة إلى ما يقارب التحسين، وتنزيل أحكام دار الحرب على دور عهدٍ وأمان، وقد رجّحتُ في مبحث الربا خلاف هذا التنزيل؛ فالقرار جيّد التحرير محلّ نظرٍ في تحقيق مناطه، والاحتياط للدين الخروج من الخلاف ما وُجد سبيل.</w:t>
+      </w:r>
+    </w:p>
+    <w:p>
+      <w:pPr>
+        <w:bidi/>
+        <w:spacing w:after="100" w:line="360" w:lineRule="auto"/>
+        <w:jc w:val="both"/>
+      </w:pPr>
+      <w:r>
+        <w:rPr>
+          <w:rFonts w:ascii="Simplified Arabic" w:hAnsi="Simplified Arabic" w:cs="Simplified Arabic"/>
+          <w:b/>
+          <w:bCs/>
+          <w:sz w:val="28"/>
+          <w:szCs w:val="28"/>
+          <w:rtl/>
+        </w:rPr>
+        <w:t xml:space="preserve">تعقيب: </w:t>
+      </w:r>
+      <w:r>
+        <w:rPr>
+          <w:rFonts w:ascii="Simplified Arabic" w:hAnsi="Simplified Arabic" w:cs="Simplified Arabic"/>
+          <w:sz w:val="28"/>
+          <w:szCs w:val="28"/>
+          <w:rtl/>
+        </w:rPr>
+        <w:t xml:space="preserve">من خلال ما قمت بالاطلاع عليه من هذا القرار وما أثاره من جدل، أرى أنّه أوضح شاهد في بحثي على أثر تكييف الدار في الفروع: فمن كيّف دول الغرب دار عهدٍ شدّد، ومن ألحقها بدار الحرب على مذهب أبي حنيفة رخّص، فرجع الخلاف المعاصر كلّه إلى ذلك الأصل القديم.</w:t>
+      </w:r>
+    </w:p>
+    <w:p>
+      <w:pPr>
         <w:pStyle w:val="1"/>
         <w:bidi/>
         <w:rPr>
@@ -34986,6 +36030,38 @@
           <w:rtl/>
         </w:rPr>
       </w:pPr>
+    </w:p>
+    <w:p>
+      <w:pPr>
+        <w:bidi/>
+        <w:spacing w:after="100" w:line="360" w:lineRule="auto"/>
+        <w:jc w:val="both"/>
+      </w:pPr>
+      <w:r>
+        <w:rPr>
+          <w:rFonts w:ascii="Simplified Arabic" w:hAnsi="Simplified Arabic" w:cs="Simplified Arabic"/>
+          <w:sz w:val="28"/>
+          <w:szCs w:val="28"/>
+          <w:rtl/>
+        </w:rPr>
+        <w:t xml:space="preserve">5. المؤسّسات والمراكز الإسلاميّة في الغرب، بإنشاء أدلّة عمليّة مبسّطة للعامل المسلم تبيّن له المباح والمحظور في كلّ مهنة، وخطّ إفتاء سريع لنوازل العمل اليوميّة.</w:t>
+      </w:r>
+    </w:p>
+    <w:p>
+      <w:pPr>
+        <w:bidi/>
+        <w:spacing w:after="200" w:line="360" w:lineRule="auto"/>
+        <w:jc w:val="both"/>
+      </w:pPr>
+      <w:r>
+        <w:rPr>
+          <w:rFonts w:ascii="Simplified Arabic" w:hAnsi="Simplified Arabic" w:cs="Simplified Arabic"/>
+          <w:sz w:val="28"/>
+          <w:szCs w:val="28"/>
+          <w:rtl/>
+        </w:rPr>
+        <w:t xml:space="preserve">6. الباحثين، بدراسة الصور المستجدّة دراسة مستقلّة موسّعة: العمل عن بُعد، ومنصّات التوصيل، والعمل في شركات التقنية، فإنّ فيها من الفروع ما يتّسع لرسائل علميّة.</w:t>
+      </w:r>
     </w:p>
     <w:p>
       <w:pPr>
@@ -39972,7 +41048,7 @@
           <w:szCs w:val="28"/>
           <w:rtl/>
         </w:rPr>
-        <w:t xml:space="preserve">(الصفحة: 25).</w:t>
+        <w:t xml:space="preserve">(الصفحة: 26).</w:t>
       </w:r>
     </w:p>
     <w:p>
@@ -39999,7 +41075,7 @@
           <w:szCs w:val="28"/>
           <w:rtl/>
         </w:rPr>
-        <w:t xml:space="preserve">(الصفحة: 25).</w:t>
+        <w:t xml:space="preserve">(الصفحة: 26).</w:t>
       </w:r>
     </w:p>
     <w:p>
@@ -40026,7 +41102,7 @@
           <w:szCs w:val="28"/>
           <w:rtl/>
         </w:rPr>
-        <w:t xml:space="preserve">(الصفحة: 32).</w:t>
+        <w:t xml:space="preserve">(الصفحة: 33).</w:t>
       </w:r>
     </w:p>
     <w:p>
@@ -40053,7 +41129,7 @@
           <w:szCs w:val="28"/>
           <w:rtl/>
         </w:rPr>
-        <w:t xml:space="preserve">(الصفحة: 33).</w:t>
+        <w:t xml:space="preserve">(الصفحة: 34).</w:t>
       </w:r>
     </w:p>
     <w:p>
@@ -40080,7 +41156,7 @@
           <w:szCs w:val="28"/>
           <w:rtl/>
         </w:rPr>
-        <w:t xml:space="preserve">(الصفحة: 37).</w:t>
+        <w:t xml:space="preserve">(الصفحة: 38).</w:t>
       </w:r>
     </w:p>
     <w:p>
@@ -40107,7 +41183,7 @@
           <w:szCs w:val="28"/>
           <w:rtl/>
         </w:rPr>
-        <w:t xml:space="preserve">(الصفحة: 37).</w:t>
+        <w:t xml:space="preserve">(الصفحة: 38).</w:t>
       </w:r>
     </w:p>
     <w:p>
@@ -40134,7 +41210,7 @@
           <w:szCs w:val="28"/>
           <w:rtl/>
         </w:rPr>
-        <w:t xml:space="preserve">(الصفحة: 37).</w:t>
+        <w:t xml:space="preserve">(الصفحة: 38).</w:t>
       </w:r>
     </w:p>
     <w:p>
@@ -40161,7 +41237,7 @@
           <w:szCs w:val="28"/>
           <w:rtl/>
         </w:rPr>
-        <w:t xml:space="preserve">(الصفحة: 46).</w:t>
+        <w:t xml:space="preserve">(الصفحة: 47).</w:t>
       </w:r>
     </w:p>
     <w:p>
@@ -40188,7 +41264,7 @@
           <w:szCs w:val="28"/>
           <w:rtl/>
         </w:rPr>
-        <w:t xml:space="preserve">(الصفحة: 47).</w:t>
+        <w:t xml:space="preserve">(الصفحة: 48).</w:t>
       </w:r>
     </w:p>
     <w:p>
@@ -40215,7 +41291,7 @@
           <w:szCs w:val="28"/>
           <w:rtl/>
         </w:rPr>
-        <w:t xml:space="preserve">(الصفحة: 50).</w:t>
+        <w:t xml:space="preserve">(الصفحة: 51).</w:t>
       </w:r>
     </w:p>
     <w:p>
@@ -40242,7 +41318,7 @@
           <w:szCs w:val="28"/>
           <w:rtl/>
         </w:rPr>
-        <w:t xml:space="preserve">(الصفحة: 53).</w:t>
+        <w:t xml:space="preserve">(الصفحة: 54).</w:t>
       </w:r>
     </w:p>
     <w:p>
@@ -40269,7 +41345,7 @@
           <w:szCs w:val="28"/>
           <w:rtl/>
         </w:rPr>
-        <w:t xml:space="preserve">(الصفحة: 58).</w:t>
+        <w:t xml:space="preserve">(الصفحة: 59).</w:t>
       </w:r>
     </w:p>
     <w:p>
@@ -40296,7 +41372,7 @@
           <w:szCs w:val="28"/>
           <w:rtl/>
         </w:rPr>
-        <w:t xml:space="preserve">(الصفحة: 61).</w:t>
+        <w:t xml:space="preserve">(الصفحة: 62).</w:t>
       </w:r>
     </w:p>
     <w:p>
@@ -40323,7 +41399,7 @@
           <w:szCs w:val="28"/>
           <w:rtl/>
         </w:rPr>
-        <w:t xml:space="preserve">(الصفحة: 61).</w:t>
+        <w:t xml:space="preserve">(الصفحة: 62).</w:t>
       </w:r>
     </w:p>
     <w:p>
@@ -40350,7 +41426,7 @@
           <w:szCs w:val="28"/>
           <w:rtl/>
         </w:rPr>
-        <w:t xml:space="preserve">(الصفحة: 65).</w:t>
+        <w:t xml:space="preserve">(الصفحة: 66).</w:t>
       </w:r>
     </w:p>
     <w:p>
@@ -40377,7 +41453,7 @@
           <w:szCs w:val="28"/>
           <w:rtl/>
         </w:rPr>
-        <w:t xml:space="preserve">(الصفحة: 67).</w:t>
+        <w:t xml:space="preserve">(الصفحة: 68).</w:t>
       </w:r>
     </w:p>
     <w:p>
@@ -40404,7 +41480,7 @@
           <w:szCs w:val="28"/>
           <w:rtl/>
         </w:rPr>
-        <w:t xml:space="preserve">(الصفحة: 68).</w:t>
+        <w:t xml:space="preserve">(الصفحة: 69).</w:t>
       </w:r>
     </w:p>
     <w:p>
@@ -40431,7 +41507,7 @@
           <w:szCs w:val="28"/>
           <w:rtl/>
         </w:rPr>
-        <w:t xml:space="preserve">(الصفحة: 69).</w:t>
+        <w:t xml:space="preserve">(الصفحة: 70).</w:t>
       </w:r>
     </w:p>
     <w:p>
@@ -40458,7 +41534,7 @@
           <w:szCs w:val="28"/>
           <w:rtl/>
         </w:rPr>
-        <w:t xml:space="preserve">(الصفحة: 70).</w:t>
+        <w:t xml:space="preserve">(الصفحة: 71).</w:t>
       </w:r>
     </w:p>
     <w:p>
@@ -40485,7 +41561,7 @@
           <w:szCs w:val="28"/>
           <w:rtl/>
         </w:rPr>
-        <w:t xml:space="preserve">(الصفحة: 72).</w:t>
+        <w:t xml:space="preserve">(الصفحة: 73).</w:t>
       </w:r>
     </w:p>
     <w:p>
@@ -40512,7 +41588,7 @@
           <w:szCs w:val="28"/>
           <w:rtl/>
         </w:rPr>
-        <w:t xml:space="preserve">(الصفحة: 74).</w:t>
+        <w:t xml:space="preserve">(الصفحة: 75).</w:t>
       </w:r>
     </w:p>
     <w:p>
@@ -40539,7 +41615,7 @@
           <w:szCs w:val="28"/>
           <w:rtl/>
         </w:rPr>
-        <w:t xml:space="preserve">(الصفحة: 75).</w:t>
+        <w:t xml:space="preserve">(الصفحة: 76).</w:t>
       </w:r>
     </w:p>
     <w:p>
@@ -40566,7 +41642,7 @@
           <w:szCs w:val="28"/>
           <w:rtl/>
         </w:rPr>
-        <w:t xml:space="preserve">(الصفحة: 77).</w:t>
+        <w:t xml:space="preserve">(الصفحة: 78).</w:t>
       </w:r>
     </w:p>
     <w:p>
@@ -40593,7 +41669,7 @@
           <w:szCs w:val="28"/>
           <w:rtl/>
         </w:rPr>
-        <w:t xml:space="preserve">(الصفحة: 78).</w:t>
+        <w:t xml:space="preserve">(الصفحة: 79).</w:t>
       </w:r>
     </w:p>
     <w:p>
@@ -40620,7 +41696,7 @@
           <w:szCs w:val="28"/>
           <w:rtl/>
         </w:rPr>
-        <w:t xml:space="preserve">(الصفحة: 81).</w:t>
+        <w:t xml:space="preserve">(الصفحة: 82).</w:t>
       </w:r>
     </w:p>
     <w:p>
@@ -40647,7 +41723,7 @@
           <w:szCs w:val="28"/>
           <w:rtl/>
         </w:rPr>
-        <w:t xml:space="preserve">(الصفحة: 84).</w:t>
+        <w:t xml:space="preserve">(الصفحة: 85).</w:t>
       </w:r>
     </w:p>
     <w:p>
@@ -40674,7 +41750,7 @@
           <w:szCs w:val="28"/>
           <w:rtl/>
         </w:rPr>
-        <w:t xml:space="preserve">(الصفحة: 88).</w:t>
+        <w:t xml:space="preserve">(الصفحة: 92).</w:t>
       </w:r>
     </w:p>
     <w:p>
@@ -40701,7 +41777,7 @@
           <w:szCs w:val="28"/>
           <w:rtl/>
         </w:rPr>
-        <w:t xml:space="preserve">(الصفحة: 27).</w:t>
+        <w:t xml:space="preserve">(الصفحة: 28).</w:t>
       </w:r>
     </w:p>
     <w:p>
@@ -40747,7 +41823,7 @@
           <w:szCs w:val="28"/>
           <w:rtl/>
         </w:rPr>
-        <w:t xml:space="preserve">(الصفحة: 79).</w:t>
+        <w:t xml:space="preserve">(الصفحة: 80).</w:t>
       </w:r>
     </w:p>
     <w:p>
@@ -40774,7 +41850,7 @@
           <w:szCs w:val="28"/>
           <w:rtl/>
         </w:rPr>
-        <w:t xml:space="preserve">(الصفحة: 35).</w:t>
+        <w:t xml:space="preserve">(الصفحة: 36).</w:t>
       </w:r>
     </w:p>
     <w:p>
@@ -40801,7 +41877,7 @@
           <w:szCs w:val="28"/>
           <w:rtl/>
         </w:rPr>
-        <w:t xml:space="preserve">(الصفحة: 84).</w:t>
+        <w:t xml:space="preserve">(الصفحة: 85).</w:t>
       </w:r>
     </w:p>
     <w:p>
@@ -40828,7 +41904,7 @@
           <w:szCs w:val="28"/>
           <w:rtl/>
         </w:rPr>
-        <w:t xml:space="preserve">(الصفحة: 10).</w:t>
+        <w:t xml:space="preserve">(الصفحة: 11).</w:t>
       </w:r>
     </w:p>
     <w:p>
@@ -40855,7 +41931,7 @@
           <w:szCs w:val="28"/>
           <w:rtl/>
         </w:rPr>
-        <w:t xml:space="preserve">(الصفحة: 10).</w:t>
+        <w:t xml:space="preserve">(الصفحة: 11).</w:t>
       </w:r>
     </w:p>
     <w:p>
@@ -40882,7 +41958,7 @@
           <w:szCs w:val="28"/>
           <w:rtl/>
         </w:rPr>
-        <w:t xml:space="preserve">(الصفحة: 78).</w:t>
+        <w:t xml:space="preserve">(الصفحة: 79).</w:t>
       </w:r>
     </w:p>
     <w:p>
@@ -40909,7 +41985,7 @@
           <w:szCs w:val="28"/>
           <w:rtl/>
         </w:rPr>
-        <w:t xml:space="preserve">(الصفحة: 31).</w:t>
+        <w:t xml:space="preserve">(الصفحة: 32).</w:t>
       </w:r>
     </w:p>
     <w:p>
@@ -40936,7 +42012,7 @@
           <w:szCs w:val="28"/>
           <w:rtl/>
         </w:rPr>
-        <w:t xml:space="preserve">(الصفحة: 81).</w:t>
+        <w:t xml:space="preserve">(الصفحة: 82).</w:t>
       </w:r>
     </w:p>
     <w:p>
@@ -40963,7 +42039,7 @@
           <w:szCs w:val="28"/>
           <w:rtl/>
         </w:rPr>
-        <w:t xml:space="preserve">(الصفحة: 82).</w:t>
+        <w:t xml:space="preserve">(الصفحة: 83).</w:t>
       </w:r>
     </w:p>
     <w:p>
@@ -40990,7 +42066,7 @@
           <w:szCs w:val="28"/>
           <w:rtl/>
         </w:rPr>
-        <w:t xml:space="preserve">(الصفحة: 11).</w:t>
+        <w:t xml:space="preserve">(الصفحة: 12).</w:t>
       </w:r>
     </w:p>
     <w:p>
@@ -41017,7 +42093,7 @@
           <w:szCs w:val="28"/>
           <w:rtl/>
         </w:rPr>
-        <w:t xml:space="preserve">(الصفحة: 40).</w:t>
+        <w:t xml:space="preserve">(الصفحة: 41).</w:t>
       </w:r>
     </w:p>
     <w:p>
@@ -41044,7 +42120,7 @@
           <w:szCs w:val="28"/>
           <w:rtl/>
         </w:rPr>
-        <w:t xml:space="preserve">(الصفحة: 58).</w:t>
+        <w:t xml:space="preserve">(الصفحة: 59).</w:t>
       </w:r>
     </w:p>
     <w:p>
@@ -41071,7 +42147,7 @@
           <w:szCs w:val="28"/>
           <w:rtl/>
         </w:rPr>
-        <w:t xml:space="preserve">(الصفحة: 31).</w:t>
+        <w:t xml:space="preserve">(الصفحة: 32).</w:t>
       </w:r>
     </w:p>
     <w:p>
@@ -41098,7 +42174,7 @@
           <w:szCs w:val="28"/>
           <w:rtl/>
         </w:rPr>
-        <w:t xml:space="preserve">(الصفحة: 61).</w:t>
+        <w:t xml:space="preserve">(الصفحة: 62).</w:t>
       </w:r>
     </w:p>
     <w:p>
@@ -41125,7 +42201,7 @@
           <w:szCs w:val="28"/>
           <w:rtl/>
         </w:rPr>
-        <w:t xml:space="preserve">(الصفحة: 31).</w:t>
+        <w:t xml:space="preserve">(الصفحة: 32).</w:t>
       </w:r>
     </w:p>
     <w:p>
@@ -41152,7 +42228,7 @@
           <w:szCs w:val="28"/>
           <w:rtl/>
         </w:rPr>
-        <w:t xml:space="preserve">(الصفحة: 83).</w:t>
+        <w:t xml:space="preserve">(الصفحة: 84).</w:t>
       </w:r>
     </w:p>
     <w:p>
@@ -41179,7 +42255,7 @@
           <w:szCs w:val="28"/>
           <w:rtl/>
         </w:rPr>
-        <w:t xml:space="preserve">(الصفحة: 84).</w:t>
+        <w:t xml:space="preserve">(الصفحة: 85).</w:t>
       </w:r>
     </w:p>
     <w:p>
@@ -41206,7 +42282,7 @@
           <w:szCs w:val="28"/>
           <w:rtl/>
         </w:rPr>
-        <w:t xml:space="preserve">(الصفحة: 35).</w:t>
+        <w:t xml:space="preserve">(الصفحة: 36).</w:t>
       </w:r>
     </w:p>
     <w:p>
@@ -41233,7 +42309,7 @@
           <w:szCs w:val="28"/>
           <w:rtl/>
         </w:rPr>
-        <w:t xml:space="preserve">(الصفحة: 15).</w:t>
+        <w:t xml:space="preserve">(الصفحة: 16).</w:t>
       </w:r>
     </w:p>
     <w:p>
@@ -41260,7 +42336,7 @@
           <w:szCs w:val="28"/>
           <w:rtl/>
         </w:rPr>
-        <w:t xml:space="preserve">(الصفحة: 54).</w:t>
+        <w:t xml:space="preserve">(الصفحة: 55).</w:t>
       </w:r>
     </w:p>
     <w:p>
@@ -41287,7 +42363,7 @@
           <w:szCs w:val="28"/>
           <w:rtl/>
         </w:rPr>
-        <w:t xml:space="preserve">(الصفحة: 58).</w:t>
+        <w:t xml:space="preserve">(الصفحة: 59).</w:t>
       </w:r>
     </w:p>
     <w:p>
@@ -41314,7 +42390,7 @@
           <w:szCs w:val="28"/>
           <w:rtl/>
         </w:rPr>
-        <w:t xml:space="preserve">(الصفحة: 49).</w:t>
+        <w:t xml:space="preserve">(الصفحة: 50).</w:t>
       </w:r>
     </w:p>
     <w:p>
@@ -41341,7 +42417,7 @@
           <w:szCs w:val="28"/>
           <w:rtl/>
         </w:rPr>
-        <w:t xml:space="preserve">(الصفحة: 48).</w:t>
+        <w:t xml:space="preserve">(الصفحة: 49).</w:t>
       </w:r>
     </w:p>
     <w:p>
@@ -41368,7 +42444,7 @@
           <w:szCs w:val="28"/>
           <w:rtl/>
         </w:rPr>
-        <w:t xml:space="preserve">(الصفحة: 58).</w:t>
+        <w:t xml:space="preserve">(الصفحة: 59).</w:t>
       </w:r>
     </w:p>
     <w:p>
@@ -41395,7 +42471,7 @@
           <w:szCs w:val="28"/>
           <w:rtl/>
         </w:rPr>
-        <w:t xml:space="preserve">(الصفحة: 65).</w:t>
+        <w:t xml:space="preserve">(الصفحة: 66).</w:t>
       </w:r>
     </w:p>
     <w:p>
@@ -41422,7 +42498,7 @@
           <w:szCs w:val="28"/>
           <w:rtl/>
         </w:rPr>
-        <w:t xml:space="preserve">(الصفحة: 16).</w:t>
+        <w:t xml:space="preserve">(الصفحة: 17).</w:t>
       </w:r>
     </w:p>
     <w:p>
@@ -41554,7 +42630,7 @@
                 <w:szCs w:val="26"/>
                 <w:rtl/>
               </w:rPr>
-              <w:t xml:space="preserve">7</w:t>
+              <w:t xml:space="preserve">8</w:t>
             </w:r>
           </w:p>
         </w:tc>
@@ -41649,7 +42725,7 @@
                 <w:szCs w:val="26"/>
                 <w:rtl/>
               </w:rPr>
-              <w:t xml:space="preserve">8</w:t>
+              <w:t xml:space="preserve">9</w:t>
             </w:r>
           </w:p>
         </w:tc>
@@ -41696,7 +42772,7 @@
                 <w:szCs w:val="26"/>
                 <w:rtl/>
               </w:rPr>
-              <w:t xml:space="preserve">9</w:t>
+              <w:t xml:space="preserve">10</w:t>
             </w:r>
           </w:p>
         </w:tc>
@@ -41743,7 +42819,7 @@
                 <w:szCs w:val="26"/>
                 <w:rtl/>
               </w:rPr>
-              <w:t xml:space="preserve">9</w:t>
+              <w:t xml:space="preserve">10</w:t>
             </w:r>
           </w:p>
         </w:tc>
@@ -41790,7 +42866,7 @@
                 <w:szCs w:val="26"/>
                 <w:rtl/>
               </w:rPr>
-              <w:t xml:space="preserve">10</w:t>
+              <w:t xml:space="preserve">11</w:t>
             </w:r>
           </w:p>
         </w:tc>
@@ -41837,7 +42913,7 @@
                 <w:szCs w:val="26"/>
                 <w:rtl/>
               </w:rPr>
-              <w:t xml:space="preserve">10</w:t>
+              <w:t xml:space="preserve">11</w:t>
             </w:r>
           </w:p>
         </w:tc>
@@ -41884,7 +42960,7 @@
                 <w:szCs w:val="26"/>
                 <w:rtl/>
               </w:rPr>
-              <w:t xml:space="preserve">11</w:t>
+              <w:t xml:space="preserve">12</w:t>
             </w:r>
           </w:p>
         </w:tc>
@@ -41932,7 +43008,7 @@
                 <w:szCs w:val="26"/>
                 <w:rtl/>
               </w:rPr>
-              <w:t xml:space="preserve">7</w:t>
+              <w:t xml:space="preserve">8</w:t>
             </w:r>
           </w:p>
         </w:tc>
@@ -42124,7 +43200,7 @@
                 <w:szCs w:val="26"/>
                 <w:rtl/>
               </w:rPr>
-              <w:t xml:space="preserve">7</w:t>
+              <w:t xml:space="preserve">8</w:t>
             </w:r>
           </w:p>
         </w:tc>
@@ -42172,7 +43248,7 @@
                 <w:szCs w:val="26"/>
                 <w:rtl/>
               </w:rPr>
-              <w:t xml:space="preserve">9</w:t>
+              <w:t xml:space="preserve">10</w:t>
             </w:r>
           </w:p>
         </w:tc>
@@ -42220,7 +43296,7 @@
                 <w:szCs w:val="26"/>
                 <w:rtl/>
               </w:rPr>
-              <w:t xml:space="preserve">9</w:t>
+              <w:t xml:space="preserve">10</w:t>
             </w:r>
           </w:p>
         </w:tc>
@@ -42268,7 +43344,7 @@
                 <w:szCs w:val="26"/>
                 <w:rtl/>
               </w:rPr>
-              <w:t xml:space="preserve">9</w:t>
+              <w:t xml:space="preserve">10</w:t>
             </w:r>
           </w:p>
         </w:tc>
@@ -42316,7 +43392,7 @@
                 <w:szCs w:val="26"/>
                 <w:rtl/>
               </w:rPr>
-              <w:t xml:space="preserve">10</w:t>
+              <w:t xml:space="preserve">11</w:t>
             </w:r>
           </w:p>
         </w:tc>
@@ -42364,7 +43440,7 @@
                 <w:szCs w:val="26"/>
                 <w:rtl/>
               </w:rPr>
-              <w:t xml:space="preserve">10</w:t>
+              <w:t xml:space="preserve">11</w:t>
             </w:r>
           </w:p>
         </w:tc>
@@ -42412,7 +43488,7 @@
                 <w:szCs w:val="26"/>
                 <w:rtl/>
               </w:rPr>
-              <w:t xml:space="preserve">11</w:t>
+              <w:t xml:space="preserve">12</w:t>
             </w:r>
           </w:p>
         </w:tc>
@@ -42503,7 +43579,7 @@
                 <w:szCs w:val="26"/>
                 <w:rtl/>
               </w:rPr>
-              <w:t xml:space="preserve">19</w:t>
+              <w:t xml:space="preserve">20</w:t>
             </w:r>
           </w:p>
         </w:tc>
@@ -42550,7 +43626,7 @@
                 <w:szCs w:val="26"/>
                 <w:rtl/>
               </w:rPr>
-              <w:t xml:space="preserve">19</w:t>
+              <w:t xml:space="preserve">20</w:t>
             </w:r>
           </w:p>
         </w:tc>
@@ -42597,7 +43673,7 @@
                 <w:szCs w:val="26"/>
                 <w:rtl/>
               </w:rPr>
-              <w:t xml:space="preserve">20</w:t>
+              <w:t xml:space="preserve">21</w:t>
             </w:r>
           </w:p>
         </w:tc>
@@ -42688,7 +43764,7 @@
                 <w:szCs w:val="26"/>
                 <w:rtl/>
               </w:rPr>
-              <w:t xml:space="preserve">23</w:t>
+              <w:t xml:space="preserve">24</w:t>
             </w:r>
           </w:p>
         </w:tc>
@@ -42735,7 +43811,7 @@
                 <w:szCs w:val="26"/>
                 <w:rtl/>
               </w:rPr>
-              <w:t xml:space="preserve">23</w:t>
+              <w:t xml:space="preserve">24</w:t>
             </w:r>
           </w:p>
         </w:tc>
@@ -42782,7 +43858,7 @@
                 <w:szCs w:val="26"/>
                 <w:rtl/>
               </w:rPr>
-              <w:t xml:space="preserve">23</w:t>
+              <w:t xml:space="preserve">24</w:t>
             </w:r>
           </w:p>
         </w:tc>
@@ -42829,7 +43905,7 @@
                 <w:szCs w:val="26"/>
                 <w:rtl/>
               </w:rPr>
-              <w:t xml:space="preserve">24</w:t>
+              <w:t xml:space="preserve">25</w:t>
             </w:r>
           </w:p>
         </w:tc>
@@ -42972,7 +44048,7 @@
                 <w:szCs w:val="26"/>
                 <w:rtl/>
               </w:rPr>
-              <w:t xml:space="preserve">26</w:t>
+              <w:t xml:space="preserve">27</w:t>
             </w:r>
           </w:p>
         </w:tc>
@@ -43019,7 +44095,7 @@
                 <w:szCs w:val="26"/>
                 <w:rtl/>
               </w:rPr>
-              <w:t xml:space="preserve">26</w:t>
+              <w:t xml:space="preserve">27</w:t>
             </w:r>
           </w:p>
         </w:tc>
@@ -43110,7 +44186,7 @@
                 <w:szCs w:val="26"/>
                 <w:rtl/>
               </w:rPr>
-              <w:t xml:space="preserve">28</w:t>
+              <w:t xml:space="preserve">29</w:t>
             </w:r>
           </w:p>
         </w:tc>
@@ -43157,7 +44233,7 @@
                 <w:szCs w:val="26"/>
                 <w:rtl/>
               </w:rPr>
-              <w:t xml:space="preserve">28</w:t>
+              <w:t xml:space="preserve">29</w:t>
             </w:r>
           </w:p>
         </w:tc>
@@ -43204,7 +44280,7 @@
                 <w:szCs w:val="26"/>
                 <w:rtl/>
               </w:rPr>
-              <w:t xml:space="preserve">28</w:t>
+              <w:t xml:space="preserve">29</w:t>
             </w:r>
           </w:p>
         </w:tc>
@@ -43251,7 +44327,54 @@
                 <w:szCs w:val="26"/>
                 <w:rtl/>
               </w:rPr>
-              <w:t xml:space="preserve">29</w:t>
+              <w:t xml:space="preserve">30</w:t>
+            </w:r>
+          </w:p>
+        </w:tc>
+      </w:tr>
+      <w:tr>
+        <w:tc>
+          <w:tcPr>
+            <w:tcW w:w="7700" w:type="dxa"/>
+            <w:vAlign w:val="center"/>
+          </w:tcPr>
+          <w:p>
+            <w:pPr>
+              <w:bidi/>
+              <w:ind w:right="340"/>
+              <w:spacing w:before="30" w:after="30" w:line="276" w:lineRule="auto"/>
+              <w:jc w:val="right"/>
+            </w:pPr>
+            <w:r>
+              <w:rPr>
+                <w:rFonts w:ascii="Simplified Arabic" w:hAnsi="Simplified Arabic" w:cs="Simplified Arabic"/>
+                <w:sz w:val="26"/>
+                <w:szCs w:val="26"/>
+                <w:rtl/>
+              </w:rPr>
+              <w:t xml:space="preserve">المبحث الرابع: الآثار النفسيّة والأسريّة.</w:t>
+            </w:r>
+          </w:p>
+        </w:tc>
+        <w:tc>
+          <w:tcPr>
+            <w:tcW w:w="1300" w:type="dxa"/>
+            <w:vAlign w:val="center"/>
+          </w:tcPr>
+          <w:p>
+            <w:pPr>
+              <w:bidi/>
+              <w:spacing w:before="30" w:after="30" w:line="276" w:lineRule="auto"/>
+              <w:jc w:val="center"/>
+            </w:pPr>
+            <w:r>
+              <w:rPr>
+                <w:rFonts w:ascii="Simplified Arabic" w:hAnsi="Simplified Arabic" w:cs="Simplified Arabic"/>
+                <w:sz w:val="26"/>
+                <w:szCs w:val="26"/>
+                <w:rtl/>
+              </w:rPr>
+              <w:t xml:space="preserve">31</w:t>
             </w:r>
           </w:p>
         </w:tc>
@@ -43342,7 +44465,7 @@
                 <w:szCs w:val="26"/>
                 <w:rtl/>
               </w:rPr>
-              <w:t xml:space="preserve">31</w:t>
+              <w:t xml:space="preserve">32</w:t>
             </w:r>
           </w:p>
         </w:tc>
@@ -43389,7 +44512,7 @@
                 <w:szCs w:val="26"/>
                 <w:rtl/>
               </w:rPr>
-              <w:t xml:space="preserve">31</w:t>
+              <w:t xml:space="preserve">32</w:t>
             </w:r>
           </w:p>
         </w:tc>
@@ -43436,7 +44559,7 @@
                 <w:szCs w:val="26"/>
                 <w:rtl/>
               </w:rPr>
-              <w:t xml:space="preserve">34</w:t>
+              <w:t xml:space="preserve">35</w:t>
             </w:r>
           </w:p>
         </w:tc>
@@ -43483,7 +44606,7 @@
                 <w:szCs w:val="26"/>
                 <w:rtl/>
               </w:rPr>
-              <w:t xml:space="preserve">35</w:t>
+              <w:t xml:space="preserve">36</w:t>
             </w:r>
           </w:p>
         </w:tc>
@@ -43530,7 +44653,7 @@
                 <w:szCs w:val="26"/>
                 <w:rtl/>
               </w:rPr>
-              <w:t xml:space="preserve">39</w:t>
+              <w:t xml:space="preserve">40</w:t>
             </w:r>
           </w:p>
         </w:tc>
@@ -43577,7 +44700,7 @@
                 <w:szCs w:val="26"/>
                 <w:rtl/>
               </w:rPr>
-              <w:t xml:space="preserve">45</w:t>
+              <w:t xml:space="preserve">46</w:t>
             </w:r>
           </w:p>
         </w:tc>
@@ -43624,7 +44747,7 @@
                 <w:szCs w:val="26"/>
                 <w:rtl/>
               </w:rPr>
-              <w:t xml:space="preserve">48</w:t>
+              <w:t xml:space="preserve">49</w:t>
             </w:r>
           </w:p>
         </w:tc>
@@ -43671,7 +44794,7 @@
                 <w:szCs w:val="26"/>
                 <w:rtl/>
               </w:rPr>
-              <w:t xml:space="preserve">55</w:t>
+              <w:t xml:space="preserve">56</w:t>
             </w:r>
           </w:p>
         </w:tc>
@@ -43718,7 +44841,7 @@
                 <w:szCs w:val="26"/>
                 <w:rtl/>
               </w:rPr>
-              <w:t xml:space="preserve">60</w:t>
+              <w:t xml:space="preserve">61</w:t>
             </w:r>
           </w:p>
         </w:tc>
@@ -43765,7 +44888,7 @@
                 <w:szCs w:val="26"/>
                 <w:rtl/>
               </w:rPr>
-              <w:t xml:space="preserve">66</w:t>
+              <w:t xml:space="preserve">67</w:t>
             </w:r>
           </w:p>
         </w:tc>
@@ -43812,7 +44935,7 @@
                 <w:szCs w:val="26"/>
                 <w:rtl/>
               </w:rPr>
-              <w:t xml:space="preserve">70</w:t>
+              <w:t xml:space="preserve">71</w:t>
             </w:r>
           </w:p>
         </w:tc>
@@ -43860,7 +44983,7 @@
                 <w:szCs w:val="26"/>
                 <w:rtl/>
               </w:rPr>
-              <w:t xml:space="preserve">70</w:t>
+              <w:t xml:space="preserve">71</w:t>
             </w:r>
           </w:p>
         </w:tc>
@@ -43908,7 +45031,7 @@
                 <w:szCs w:val="26"/>
                 <w:rtl/>
               </w:rPr>
-              <w:t xml:space="preserve">71</w:t>
+              <w:t xml:space="preserve">72</w:t>
             </w:r>
           </w:p>
         </w:tc>
@@ -43956,7 +45079,7 @@
                 <w:szCs w:val="26"/>
                 <w:rtl/>
               </w:rPr>
-              <w:t xml:space="preserve">73</w:t>
+              <w:t xml:space="preserve">74</w:t>
             </w:r>
           </w:p>
         </w:tc>
@@ -44003,7 +45126,7 @@
                 <w:szCs w:val="26"/>
                 <w:rtl/>
               </w:rPr>
-              <w:t xml:space="preserve">74</w:t>
+              <w:t xml:space="preserve">75</w:t>
             </w:r>
           </w:p>
         </w:tc>
@@ -44051,7 +45174,7 @@
                 <w:szCs w:val="26"/>
                 <w:rtl/>
               </w:rPr>
-              <w:t xml:space="preserve">74</w:t>
+              <w:t xml:space="preserve">75</w:t>
             </w:r>
           </w:p>
         </w:tc>
@@ -44099,7 +45222,7 @@
                 <w:szCs w:val="26"/>
                 <w:rtl/>
               </w:rPr>
-              <w:t xml:space="preserve">76</w:t>
+              <w:t xml:space="preserve">77</w:t>
             </w:r>
           </w:p>
         </w:tc>
@@ -44146,7 +45269,7 @@
                 <w:szCs w:val="26"/>
                 <w:rtl/>
               </w:rPr>
-              <w:t xml:space="preserve">78</w:t>
+              <w:t xml:space="preserve">79</w:t>
             </w:r>
           </w:p>
         </w:tc>
@@ -44194,7 +45317,7 @@
                 <w:szCs w:val="26"/>
                 <w:rtl/>
               </w:rPr>
-              <w:t xml:space="preserve">78</w:t>
+              <w:t xml:space="preserve">79</w:t>
             </w:r>
           </w:p>
         </w:tc>
@@ -44242,7 +45365,7 @@
                 <w:szCs w:val="26"/>
                 <w:rtl/>
               </w:rPr>
-              <w:t xml:space="preserve">80</w:t>
+              <w:t xml:space="preserve">81</w:t>
             </w:r>
           </w:p>
         </w:tc>
@@ -44289,7 +45412,101 @@
                 <w:szCs w:val="26"/>
                 <w:rtl/>
               </w:rPr>
-              <w:t xml:space="preserve">82</w:t>
+              <w:t xml:space="preserve">83</w:t>
+            </w:r>
+          </w:p>
+        </w:tc>
+      </w:tr>
+      <w:tr>
+        <w:tc>
+          <w:tcPr>
+            <w:tcW w:w="7700" w:type="dxa"/>
+            <w:vAlign w:val="center"/>
+          </w:tcPr>
+          <w:p>
+            <w:pPr>
+              <w:bidi/>
+              <w:ind w:right="340"/>
+              <w:spacing w:before="30" w:after="30" w:line="276" w:lineRule="auto"/>
+              <w:jc w:val="right"/>
+            </w:pPr>
+            <w:r>
+              <w:rPr>
+                <w:rFonts w:ascii="Simplified Arabic" w:hAnsi="Simplified Arabic" w:cs="Simplified Arabic"/>
+                <w:sz w:val="26"/>
+                <w:szCs w:val="26"/>
+                <w:rtl/>
+              </w:rPr>
+              <w:t xml:space="preserve">المبحث الرابع عشر: القواعد الفقهيّة ومقاصد الشريعة الحاكمة لمسائل البحث.</w:t>
+            </w:r>
+          </w:p>
+        </w:tc>
+        <w:tc>
+          <w:tcPr>
+            <w:tcW w:w="1300" w:type="dxa"/>
+            <w:vAlign w:val="center"/>
+          </w:tcPr>
+          <w:p>
+            <w:pPr>
+              <w:bidi/>
+              <w:spacing w:before="30" w:after="30" w:line="276" w:lineRule="auto"/>
+              <w:jc w:val="center"/>
+            </w:pPr>
+            <w:r>
+              <w:rPr>
+                <w:rFonts w:ascii="Simplified Arabic" w:hAnsi="Simplified Arabic" w:cs="Simplified Arabic"/>
+                <w:sz w:val="26"/>
+                <w:szCs w:val="26"/>
+                <w:rtl/>
+              </w:rPr>
+              <w:t xml:space="preserve">87</w:t>
+            </w:r>
+          </w:p>
+        </w:tc>
+      </w:tr>
+      <w:tr>
+        <w:tc>
+          <w:tcPr>
+            <w:tcW w:w="7700" w:type="dxa"/>
+            <w:vAlign w:val="center"/>
+          </w:tcPr>
+          <w:p>
+            <w:pPr>
+              <w:bidi/>
+              <w:ind w:right="340"/>
+              <w:spacing w:before="30" w:after="30" w:line="276" w:lineRule="auto"/>
+              <w:jc w:val="right"/>
+            </w:pPr>
+            <w:r>
+              <w:rPr>
+                <w:rFonts w:ascii="Simplified Arabic" w:hAnsi="Simplified Arabic" w:cs="Simplified Arabic"/>
+                <w:sz w:val="26"/>
+                <w:szCs w:val="26"/>
+                <w:rtl/>
+              </w:rPr>
+              <w:t xml:space="preserve">المبحث الخامس عشر: ضوابط عمل المرأة المسلمة لدى غير المسلمين، وصور العمل المعاصرة.</w:t>
+            </w:r>
+          </w:p>
+        </w:tc>
+        <w:tc>
+          <w:tcPr>
+            <w:tcW w:w="1300" w:type="dxa"/>
+            <w:vAlign w:val="center"/>
+          </w:tcPr>
+          <w:p>
+            <w:pPr>
+              <w:bidi/>
+              <w:spacing w:before="30" w:after="30" w:line="276" w:lineRule="auto"/>
+              <w:jc w:val="center"/>
+            </w:pPr>
+            <w:r>
+              <w:rPr>
+                <w:rFonts w:ascii="Simplified Arabic" w:hAnsi="Simplified Arabic" w:cs="Simplified Arabic"/>
+                <w:sz w:val="26"/>
+                <w:szCs w:val="26"/>
+                <w:rtl/>
+              </w:rPr>
+              <w:t xml:space="preserve">89</w:t>
             </w:r>
           </w:p>
         </w:tc>
@@ -44380,7 +45597,7 @@
                 <w:szCs w:val="26"/>
                 <w:rtl/>
               </w:rPr>
-              <w:t xml:space="preserve">87</w:t>
+              <w:t xml:space="preserve">91</w:t>
             </w:r>
           </w:p>
         </w:tc>
@@ -44428,7 +45645,7 @@
                 <w:szCs w:val="26"/>
                 <w:rtl/>
               </w:rPr>
-              <w:t xml:space="preserve">89</w:t>
+              <w:t xml:space="preserve">93</w:t>
             </w:r>
           </w:p>
         </w:tc>
@@ -44476,7 +45693,7 @@
                 <w:szCs w:val="26"/>
                 <w:rtl/>
               </w:rPr>
-              <w:t xml:space="preserve">89</w:t>
+              <w:t xml:space="preserve">94</w:t>
             </w:r>
           </w:p>
         </w:tc>
@@ -44524,7 +45741,7 @@
                 <w:szCs w:val="26"/>
                 <w:rtl/>
               </w:rPr>
-              <w:t xml:space="preserve">89</w:t>
+              <w:t xml:space="preserve">94</w:t>
             </w:r>
           </w:p>
         </w:tc>
@@ -44620,7 +45837,7 @@
                 <w:szCs w:val="26"/>
                 <w:rtl/>
               </w:rPr>
-              <w:t xml:space="preserve">91</w:t>
+              <w:t xml:space="preserve">96</w:t>
             </w:r>
           </w:p>
         </w:tc>
@@ -44668,7 +45885,7 @@
                 <w:szCs w:val="26"/>
                 <w:rtl/>
               </w:rPr>
-              <w:t xml:space="preserve">91</w:t>
+              <w:t xml:space="preserve">96</w:t>
             </w:r>
           </w:p>
         </w:tc>
@@ -54877,6 +56094,102 @@
           <w:rtl/>
         </w:rPr>
         <w:t xml:space="preserve"> Valfort, Marie-Anne (2020). Anti-Muslim discrimination in France: Evidence from a field experiment. World Development, Vol. 135.</w:t>
+      </w:r>
+    </w:p>
+  </w:footnote>
+  <w:footnote w:id="207">
+    <w:p>
+      <w:pPr>
+        <w:pStyle w:val="a7"/>
+        <w:bidi/>
+        <w:jc w:val="both"/>
+      </w:pPr>
+      <w:r>
+        <w:rPr>
+          <w:rStyle w:val="a8"/>
+        </w:rPr>
+        <w:footnoteRef/>
+      </w:r>
+      <w:r>
+        <w:rPr>
+          <w:rFonts w:ascii="Simplified Arabic" w:hAnsi="Simplified Arabic" w:cs="Simplified Arabic"/>
+          <w:sz w:val="24"/>
+          <w:szCs w:val="24"/>
+          <w:rtl/>
+        </w:rPr>
+        <w:t xml:space="preserve"> القرضاوي، يوسف (2001). في فقه الأقليات المسلمة. ط1، القاهرة: دار الشروق.</w:t>
+      </w:r>
+    </w:p>
+  </w:footnote>
+  <w:footnote w:id="208">
+    <w:p>
+      <w:pPr>
+        <w:pStyle w:val="a7"/>
+        <w:bidi/>
+        <w:jc w:val="both"/>
+      </w:pPr>
+      <w:r>
+        <w:rPr>
+          <w:rStyle w:val="a8"/>
+        </w:rPr>
+        <w:footnoteRef/>
+      </w:r>
+      <w:r>
+        <w:rPr>
+          <w:rFonts w:ascii="Simplified Arabic" w:hAnsi="Simplified Arabic" w:cs="Simplified Arabic"/>
+          <w:sz w:val="24"/>
+          <w:szCs w:val="24"/>
+          <w:rtl/>
+        </w:rPr>
+        <w:t xml:space="preserve"> وزارة الأوقاف والشؤون الإسلامية. الموسوعة الفقهية الكويتية. ط2، الكويت: ذات السلاسل، مادة (إباحة).</w:t>
+      </w:r>
+    </w:p>
+  </w:footnote>
+  <w:footnote w:id="209">
+    <w:p>
+      <w:pPr>
+        <w:pStyle w:val="a7"/>
+        <w:bidi/>
+        <w:jc w:val="both"/>
+      </w:pPr>
+      <w:r>
+        <w:rPr>
+          <w:rStyle w:val="a8"/>
+        </w:rPr>
+        <w:footnoteRef/>
+      </w:r>
+      <w:r>
+        <w:rPr>
+          <w:rFonts w:ascii="Simplified Arabic" w:hAnsi="Simplified Arabic" w:cs="Simplified Arabic"/>
+          <w:sz w:val="24"/>
+          <w:szCs w:val="24"/>
+          <w:rtl/>
+        </w:rPr>
+        <w:t xml:space="preserve"> الشاطبي، إبراهيم بن موسى. الموافقات في أصول الشريعة. بيروت: دار المعرفة، كتاب المقاصد.</w:t>
+      </w:r>
+    </w:p>
+  </w:footnote>
+  <w:footnote w:id="210">
+    <w:p>
+      <w:pPr>
+        <w:pStyle w:val="a7"/>
+        <w:bidi/>
+        <w:jc w:val="both"/>
+      </w:pPr>
+      <w:r>
+        <w:rPr>
+          <w:rStyle w:val="a8"/>
+        </w:rPr>
+        <w:footnoteRef/>
+      </w:r>
+      <w:r>
+        <w:rPr>
+          <w:rFonts w:ascii="Simplified Arabic" w:hAnsi="Simplified Arabic" w:cs="Simplified Arabic"/>
+          <w:sz w:val="24"/>
+          <w:szCs w:val="24"/>
+          <w:rtl/>
+        </w:rPr>
+        <w:t xml:space="preserve"> المجلس الأوروبي للإفتاء والبحوث. قرار الدورة الرابعة (1999م) بشأن شراء المساكن عن طريق القرض الربوي للأقليات المسلمة، والقرار مثبت في مجموعة قرارات المجلس وفتاواه.</w:t>
       </w:r>
     </w:p>
   </w:footnote>

</xml_diff>

<commit_message>
Embed institution logo on Baransi seminar cover page
Co-Authored-By: Claude Fable 5 <noreply@anthropic.com>
Claude-Session: https://claude.ai/code/session_01ESPDZE2KAqBUfzv5HLVvG7
</commit_message>
<xml_diff>
--- a/seminar/Khaled Othman Baransi 212165096.docx
+++ b/seminar/Khaled Othman Baransi 212165096.docx
@@ -2,6 +2,51 @@
 <file path=word/document.xml><?xml version="1.0" encoding="utf-8"?>
 <w:document xmlns:wpc="http://schemas.microsoft.com/office/word/2010/wordprocessingCanvas" xmlns:cx="http://schemas.microsoft.com/office/drawing/2014/chartex" xmlns:cx1="http://schemas.microsoft.com/office/drawing/2015/9/8/chartex" xmlns:cx2="http://schemas.microsoft.com/office/drawing/2015/10/21/chartex" xmlns:cx3="http://schemas.microsoft.com/office/drawing/2016/5/9/chartex" xmlns:cx4="http://schemas.microsoft.com/office/drawing/2016/5/10/chartex" xmlns:cx5="http://schemas.microsoft.com/office/drawing/2016/5/11/chartex" xmlns:cx6="http://schemas.microsoft.com/office/drawing/2016/5/12/chartex" xmlns:cx7="http://schemas.microsoft.com/office/drawing/2016/5/13/chartex" xmlns:cx8="http://schemas.microsoft.com/office/drawing/2016/5/14/chartex" xmlns:mc="http://schemas.openxmlformats.org/markup-compatibility/2006" xmlns:aink="http://schemas.microsoft.com/office/drawing/2016/ink" xmlns:am3d="http://schemas.microsoft.com/office/drawing/2017/model3d" xmlns:o="urn:schemas-microsoft-com:office:office" xmlns:oel="http://schemas.microsoft.com/office/2019/extlst" xmlns:r="http://schemas.openxmlformats.org/officeDocument/2006/relationships" xmlns:m="http://schemas.openxmlformats.org/officeDocument/2006/math" xmlns:v="urn:schemas-microsoft-com:vml" xmlns:wp14="http://schemas.microsoft.com/office/word/2010/wordprocessingDrawing" xmlns:wp="http://schemas.openxmlformats.org/drawingml/2006/wordprocessingDrawing" xmlns:w10="urn:schemas-microsoft-com:office:word" xmlns:w="http://schemas.openxmlformats.org/wordprocessingml/2006/main" xmlns:w14="http://schemas.microsoft.com/office/word/2010/wordml" xmlns:w15="http://schemas.microsoft.com/office/word/2012/wordml" xmlns:w16cex="http://schemas.microsoft.com/office/word/2018/wordml/cex" xmlns:w16cid="http://schemas.microsoft.com/office/word/2016/wordml/cid" xmlns:w16="http://schemas.microsoft.com/office/word/2018/wordml" xmlns:w16du="http://schemas.microsoft.com/office/word/2023/wordml/word16du" xmlns:w16sdtdh="http://schemas.microsoft.com/office/word/2020/wordml/sdtdatahash" xmlns:w16sdtfl="http://schemas.microsoft.com/office/word/2024/wordml/sdtformatlock" xmlns:w16se="http://schemas.microsoft.com/office/word/2015/wordml/symex" xmlns:wpg="http://schemas.microsoft.com/office/word/2010/wordprocessingGroup" xmlns:wpi="http://schemas.microsoft.com/office/word/2010/wordprocessingInk" xmlns:wne="http://schemas.microsoft.com/office/word/2006/wordml" xmlns:wps="http://schemas.microsoft.com/office/word/2010/wordprocessingShape" mc:Ignorable="w14 w15 w16se w16cid w16 w16cex w16sdtdh w16sdtfl w16du wp14">
   <w:body>
+    <w:p>
+      <w:pPr>
+        <w:bidi/>
+        <w:spacing w:after="160"/>
+        <w:jc w:val="center"/>
+      </w:pPr>
+      <w:r>
+        <w:rPr>
+          <w:noProof/>
+        </w:rPr>
+        <w:drawing>
+          <wp:inline xmlns:wp="http://schemas.openxmlformats.org/drawingml/2006/wordprocessingDrawing" distT="0" distB="0" distL="0" distR="0">
+            <wp:extent cx="1238250" cy="1238250"/>
+            <wp:effectExtent l="0" t="0" r="0" b="0"/>
+            <wp:docPr id="9901" name="logo2"/>
+            <wp:cNvGraphicFramePr/>
+            <a:graphic xmlns:a="http://schemas.openxmlformats.org/drawingml/2006/main">
+              <a:graphicData uri="http://schemas.openxmlformats.org/drawingml/2006/picture">
+                <pic:pic xmlns:pic="http://schemas.openxmlformats.org/drawingml/2006/picture">
+                  <pic:nvPicPr>
+                    <pic:cNvPr id="9901" name="logo2.png"/>
+                    <pic:cNvPicPr/>
+                  </pic:nvPicPr>
+                  <pic:blipFill>
+                    <a:blip r:embed="rId29"/>
+                    <a:stretch>
+                      <a:fillRect/>
+                    </a:stretch>
+                  </pic:blipFill>
+                  <pic:spPr>
+                    <a:xfrm>
+                      <a:off x="0" y="0"/>
+                      <a:ext cx="1238250" cy="1238250"/>
+                    </a:xfrm>
+                    <a:prstGeom prst="rect">
+                      <a:avLst/>
+                    </a:prstGeom>
+                  </pic:spPr>
+                </pic:pic>
+              </a:graphicData>
+            </a:graphic>
+          </wp:inline>
+        </w:drawing>
+      </w:r>
+    </w:p>
     <w:p>
       <w:pPr>
         <w:bidi/>

</xml_diff>

<commit_message>
Re-embed cover logo using standard picture markup for Word compatibility
Co-Authored-By: Claude Fable 5 <noreply@anthropic.com>
Claude-Session: https://claude.ai/code/session_01ESPDZE2KAqBUfzv5HLVvG7
</commit_message>
<xml_diff>
--- a/seminar/Khaled Othman Baransi 212165096.docx
+++ b/seminar/Khaled Othman Baransi 212165096.docx
@@ -4,25 +4,21 @@
   <w:body>
     <w:p>
       <w:pPr>
-        <w:bidi/>
-        <w:spacing w:after="160"/>
         <w:jc w:val="center"/>
       </w:pPr>
       <w:r>
-        <w:rPr>
-          <w:noProof/>
-        </w:rPr>
         <w:drawing>
-          <wp:inline xmlns:wp="http://schemas.openxmlformats.org/drawingml/2006/wordprocessingDrawing" distT="0" distB="0" distL="0" distR="0">
-            <wp:extent cx="1238250" cy="1238250"/>
-            <wp:effectExtent l="0" t="0" r="0" b="0"/>
-            <wp:docPr id="9901" name="logo2"/>
-            <wp:cNvGraphicFramePr/>
-            <a:graphic xmlns:a="http://schemas.openxmlformats.org/drawingml/2006/main">
+          <wp:inline xmlns:a="http://schemas.openxmlformats.org/drawingml/2006/main" xmlns:pic="http://schemas.openxmlformats.org/drawingml/2006/picture">
+            <wp:extent cx="1234440" cy="1229026"/>
+            <wp:docPr id="1" name="Picture 1"/>
+            <wp:cNvGraphicFramePr>
+              <a:graphicFrameLocks noChangeAspect="1"/>
+            </wp:cNvGraphicFramePr>
+            <a:graphic>
               <a:graphicData uri="http://schemas.openxmlformats.org/drawingml/2006/picture">
-                <pic:pic xmlns:pic="http://schemas.openxmlformats.org/drawingml/2006/picture">
+                <pic:pic>
                   <pic:nvPicPr>
-                    <pic:cNvPr id="9901" name="logo2.png"/>
+                    <pic:cNvPr id="0" name="logo2.png"/>
                     <pic:cNvPicPr/>
                   </pic:nvPicPr>
                   <pic:blipFill>
@@ -34,11 +30,9 @@
                   <pic:spPr>
                     <a:xfrm>
                       <a:off x="0" y="0"/>
-                      <a:ext cx="1238250" cy="1238250"/>
+                      <a:ext cx="1234440" cy="1229026"/>
                     </a:xfrm>
-                    <a:prstGeom prst="rect">
-                      <a:avLst/>
-                    </a:prstGeom>
+                    <a:prstGeom prst="rect"/>
                   </pic:spPr>
                 </pic:pic>
               </a:graphicData>

</xml_diff>

<commit_message>
Fix OOXML child-element ordering so strict Word parsers open the file
Canonically reorder pPr/rPr/tblPr/tcPr children (100 elements) per the schema
sequences; fixes Word desktop failing to open the document.

Co-Authored-By: Claude Fable 5 <noreply@anthropic.com>
Claude-Session: https://claude.ai/code/session_01ESPDZE2KAqBUfzv5HLVvG7
</commit_message>
<xml_diff>
--- a/seminar/Khaled Othman Baransi 212165096.docx
+++ b/seminar/Khaled Othman Baransi 212165096.docx
@@ -689,9 +689,9 @@
     </w:p>
     <w:tbl>
       <w:tblPr>
+        <w:bidiVisual/>
         <w:tblW w:w="9000" w:type="dxa"/>
         <w:jc w:val="center"/>
-        <w:bidiVisual/>
         <w:tblBorders>
           <w:top w:val="single" w:sz="6" w:space="0" w:color="000000"/>
           <w:left w:val="single" w:sz="6" w:space="0" w:color="000000"/>
@@ -859,8 +859,8 @@
           <w:p>
             <w:pPr>
               <w:bidi/>
+              <w:spacing w:before="30" w:after="30" w:line="276" w:lineRule="auto"/>
               <w:ind w:right="340"/>
-              <w:spacing w:before="30" w:after="30" w:line="276" w:lineRule="auto"/>
               <w:jc w:val="right"/>
             </w:pPr>
             <w:r>
@@ -906,8 +906,8 @@
           <w:p>
             <w:pPr>
               <w:bidi/>
+              <w:spacing w:before="30" w:after="30" w:line="276" w:lineRule="auto"/>
               <w:ind w:right="340"/>
-              <w:spacing w:before="30" w:after="30" w:line="276" w:lineRule="auto"/>
               <w:jc w:val="right"/>
             </w:pPr>
             <w:r>
@@ -953,8 +953,8 @@
           <w:p>
             <w:pPr>
               <w:bidi/>
+              <w:spacing w:before="30" w:after="30" w:line="276" w:lineRule="auto"/>
               <w:ind w:right="340"/>
-              <w:spacing w:before="30" w:after="30" w:line="276" w:lineRule="auto"/>
               <w:jc w:val="right"/>
             </w:pPr>
             <w:r>
@@ -1000,8 +1000,8 @@
           <w:p>
             <w:pPr>
               <w:bidi/>
+              <w:spacing w:before="30" w:after="30" w:line="276" w:lineRule="auto"/>
               <w:ind w:right="340"/>
-              <w:spacing w:before="30" w:after="30" w:line="276" w:lineRule="auto"/>
               <w:jc w:val="right"/>
             </w:pPr>
             <w:r>
@@ -1047,8 +1047,8 @@
           <w:p>
             <w:pPr>
               <w:bidi/>
+              <w:spacing w:before="30" w:after="30" w:line="276" w:lineRule="auto"/>
               <w:ind w:right="340"/>
-              <w:spacing w:before="30" w:after="30" w:line="276" w:lineRule="auto"/>
               <w:jc w:val="right"/>
             </w:pPr>
             <w:r>
@@ -1094,8 +1094,8 @@
           <w:p>
             <w:pPr>
               <w:bidi/>
+              <w:spacing w:before="30" w:after="30" w:line="276" w:lineRule="auto"/>
               <w:ind w:right="340"/>
-              <w:spacing w:before="30" w:after="30" w:line="276" w:lineRule="auto"/>
               <w:jc w:val="right"/>
             </w:pPr>
             <w:r>
@@ -1686,9 +1686,9 @@
     </w:p>
     <w:tbl>
       <w:tblPr>
+        <w:bidiVisual/>
         <w:tblW w:w="9000" w:type="dxa"/>
         <w:jc w:val="center"/>
-        <w:bidiVisual/>
         <w:tblBorders>
           <w:top w:val="single" w:sz="6" w:space="0" w:color="000000"/>
           <w:left w:val="single" w:sz="6" w:space="0" w:color="000000"/>
@@ -1760,8 +1760,8 @@
           <w:p>
             <w:pPr>
               <w:bidi/>
+              <w:spacing w:before="30" w:after="30" w:line="276" w:lineRule="auto"/>
               <w:ind w:right="340"/>
-              <w:spacing w:before="30" w:after="30" w:line="276" w:lineRule="auto"/>
               <w:jc w:val="right"/>
             </w:pPr>
             <w:r>
@@ -1807,8 +1807,8 @@
           <w:p>
             <w:pPr>
               <w:bidi/>
+              <w:spacing w:before="30" w:after="30" w:line="276" w:lineRule="auto"/>
               <w:ind w:right="340"/>
-              <w:spacing w:before="30" w:after="30" w:line="276" w:lineRule="auto"/>
               <w:jc w:val="right"/>
             </w:pPr>
             <w:r>
@@ -1871,9 +1871,9 @@
     </w:p>
     <w:tbl>
       <w:tblPr>
+        <w:bidiVisual/>
         <w:tblW w:w="9000" w:type="dxa"/>
         <w:jc w:val="center"/>
-        <w:bidiVisual/>
         <w:tblBorders>
           <w:top w:val="single" w:sz="6" w:space="0" w:color="000000"/>
           <w:left w:val="single" w:sz="6" w:space="0" w:color="000000"/>
@@ -1945,8 +1945,8 @@
           <w:p>
             <w:pPr>
               <w:bidi/>
+              <w:spacing w:before="30" w:after="30" w:line="276" w:lineRule="auto"/>
               <w:ind w:right="340"/>
-              <w:spacing w:before="30" w:after="30" w:line="276" w:lineRule="auto"/>
               <w:jc w:val="right"/>
             </w:pPr>
             <w:r>
@@ -1992,8 +1992,8 @@
           <w:p>
             <w:pPr>
               <w:bidi/>
+              <w:spacing w:before="30" w:after="30" w:line="276" w:lineRule="auto"/>
               <w:ind w:right="340"/>
-              <w:spacing w:before="30" w:after="30" w:line="276" w:lineRule="auto"/>
               <w:jc w:val="right"/>
             </w:pPr>
             <w:r>
@@ -2039,8 +2039,8 @@
           <w:p>
             <w:pPr>
               <w:bidi/>
+              <w:spacing w:before="30" w:after="30" w:line="276" w:lineRule="auto"/>
               <w:ind w:right="340"/>
-              <w:spacing w:before="30" w:after="30" w:line="276" w:lineRule="auto"/>
               <w:jc w:val="right"/>
             </w:pPr>
             <w:r>
@@ -2182,8 +2182,8 @@
           <w:p>
             <w:pPr>
               <w:bidi/>
+              <w:spacing w:before="30" w:after="30" w:line="276" w:lineRule="auto"/>
               <w:ind w:right="340"/>
-              <w:spacing w:before="30" w:after="30" w:line="276" w:lineRule="auto"/>
               <w:jc w:val="right"/>
             </w:pPr>
             <w:r>
@@ -2229,8 +2229,8 @@
           <w:p>
             <w:pPr>
               <w:bidi/>
+              <w:spacing w:before="30" w:after="30" w:line="276" w:lineRule="auto"/>
               <w:ind w:right="340"/>
-              <w:spacing w:before="30" w:after="30" w:line="276" w:lineRule="auto"/>
               <w:jc w:val="right"/>
             </w:pPr>
             <w:r>
@@ -2276,8 +2276,8 @@
           <w:p>
             <w:pPr>
               <w:bidi/>
+              <w:spacing w:before="30" w:after="30" w:line="276" w:lineRule="auto"/>
               <w:ind w:right="340"/>
-              <w:spacing w:before="30" w:after="30" w:line="276" w:lineRule="auto"/>
               <w:jc w:val="right"/>
             </w:pPr>
             <w:r>
@@ -2340,9 +2340,9 @@
     </w:p>
     <w:tbl>
       <w:tblPr>
+        <w:bidiVisual/>
         <w:tblW w:w="9000" w:type="dxa"/>
         <w:jc w:val="center"/>
-        <w:bidiVisual/>
         <w:tblBorders>
           <w:top w:val="single" w:sz="6" w:space="0" w:color="000000"/>
           <w:left w:val="single" w:sz="6" w:space="0" w:color="000000"/>
@@ -2414,8 +2414,8 @@
           <w:p>
             <w:pPr>
               <w:bidi/>
+              <w:spacing w:before="30" w:after="30" w:line="276" w:lineRule="auto"/>
               <w:ind w:right="340"/>
-              <w:spacing w:before="30" w:after="30" w:line="276" w:lineRule="auto"/>
               <w:jc w:val="right"/>
             </w:pPr>
             <w:r>
@@ -2461,8 +2461,8 @@
           <w:p>
             <w:pPr>
               <w:bidi/>
+              <w:spacing w:before="30" w:after="30" w:line="276" w:lineRule="auto"/>
               <w:ind w:right="340"/>
-              <w:spacing w:before="30" w:after="30" w:line="276" w:lineRule="auto"/>
               <w:jc w:val="right"/>
             </w:pPr>
             <w:r>
@@ -2508,8 +2508,8 @@
           <w:p>
             <w:pPr>
               <w:bidi/>
+              <w:spacing w:before="30" w:after="30" w:line="276" w:lineRule="auto"/>
               <w:ind w:right="340"/>
-              <w:spacing w:before="30" w:after="30" w:line="276" w:lineRule="auto"/>
               <w:jc w:val="right"/>
             </w:pPr>
             <w:r>
@@ -2555,8 +2555,8 @@
           <w:p>
             <w:pPr>
               <w:bidi/>
+              <w:spacing w:before="30" w:after="30" w:line="276" w:lineRule="auto"/>
               <w:ind w:right="340"/>
-              <w:spacing w:before="30" w:after="30" w:line="276" w:lineRule="auto"/>
               <w:jc w:val="right"/>
             </w:pPr>
             <w:r>
@@ -2619,9 +2619,9 @@
     </w:p>
     <w:tbl>
       <w:tblPr>
+        <w:bidiVisual/>
         <w:tblW w:w="9000" w:type="dxa"/>
         <w:jc w:val="center"/>
-        <w:bidiVisual/>
         <w:tblBorders>
           <w:top w:val="single" w:sz="6" w:space="0" w:color="000000"/>
           <w:left w:val="single" w:sz="6" w:space="0" w:color="000000"/>
@@ -2693,8 +2693,8 @@
           <w:p>
             <w:pPr>
               <w:bidi/>
+              <w:spacing w:before="30" w:after="30" w:line="276" w:lineRule="auto"/>
               <w:ind w:right="340"/>
-              <w:spacing w:before="30" w:after="30" w:line="276" w:lineRule="auto"/>
               <w:jc w:val="right"/>
             </w:pPr>
             <w:r>
@@ -2740,8 +2740,8 @@
           <w:p>
             <w:pPr>
               <w:bidi/>
+              <w:spacing w:before="30" w:after="30" w:line="276" w:lineRule="auto"/>
               <w:ind w:right="340"/>
-              <w:spacing w:before="30" w:after="30" w:line="276" w:lineRule="auto"/>
               <w:jc w:val="right"/>
             </w:pPr>
             <w:r>
@@ -2787,8 +2787,8 @@
           <w:p>
             <w:pPr>
               <w:bidi/>
+              <w:spacing w:before="30" w:after="30" w:line="276" w:lineRule="auto"/>
               <w:ind w:right="340"/>
-              <w:spacing w:before="30" w:after="30" w:line="276" w:lineRule="auto"/>
               <w:jc w:val="right"/>
             </w:pPr>
             <w:r>
@@ -2834,8 +2834,8 @@
           <w:p>
             <w:pPr>
               <w:bidi/>
+              <w:spacing w:before="30" w:after="30" w:line="276" w:lineRule="auto"/>
               <w:ind w:right="340"/>
-              <w:spacing w:before="30" w:after="30" w:line="276" w:lineRule="auto"/>
               <w:jc w:val="right"/>
             </w:pPr>
             <w:r>
@@ -2881,8 +2881,8 @@
           <w:p>
             <w:pPr>
               <w:bidi/>
+              <w:spacing w:before="30" w:after="30" w:line="276" w:lineRule="auto"/>
               <w:ind w:right="340"/>
-              <w:spacing w:before="30" w:after="30" w:line="276" w:lineRule="auto"/>
               <w:jc w:val="right"/>
             </w:pPr>
             <w:r>
@@ -2928,8 +2928,8 @@
           <w:p>
             <w:pPr>
               <w:bidi/>
+              <w:spacing w:before="30" w:after="30" w:line="276" w:lineRule="auto"/>
               <w:ind w:right="340"/>
-              <w:spacing w:before="30" w:after="30" w:line="276" w:lineRule="auto"/>
               <w:jc w:val="right"/>
             </w:pPr>
             <w:r>
@@ -2975,8 +2975,8 @@
           <w:p>
             <w:pPr>
               <w:bidi/>
+              <w:spacing w:before="30" w:after="30" w:line="276" w:lineRule="auto"/>
               <w:ind w:right="340"/>
-              <w:spacing w:before="30" w:after="30" w:line="276" w:lineRule="auto"/>
               <w:jc w:val="right"/>
             </w:pPr>
             <w:r>
@@ -3022,8 +3022,8 @@
           <w:p>
             <w:pPr>
               <w:bidi/>
+              <w:spacing w:before="30" w:after="30" w:line="276" w:lineRule="auto"/>
               <w:ind w:right="340"/>
-              <w:spacing w:before="30" w:after="30" w:line="276" w:lineRule="auto"/>
               <w:jc w:val="right"/>
             </w:pPr>
             <w:r>
@@ -3069,8 +3069,8 @@
           <w:p>
             <w:pPr>
               <w:bidi/>
+              <w:spacing w:before="30" w:after="30" w:line="276" w:lineRule="auto"/>
               <w:ind w:right="340"/>
-              <w:spacing w:before="30" w:after="30" w:line="276" w:lineRule="auto"/>
               <w:jc w:val="right"/>
             </w:pPr>
             <w:r>
@@ -3116,8 +3116,8 @@
           <w:p>
             <w:pPr>
               <w:bidi/>
+              <w:spacing w:before="30" w:after="30" w:line="276" w:lineRule="auto"/>
               <w:ind w:right="340"/>
-              <w:spacing w:before="30" w:after="30" w:line="276" w:lineRule="auto"/>
               <w:jc w:val="right"/>
             </w:pPr>
             <w:r>
@@ -3307,8 +3307,8 @@
           <w:p>
             <w:pPr>
               <w:bidi/>
+              <w:spacing w:before="30" w:after="30" w:line="276" w:lineRule="auto"/>
               <w:ind w:right="340"/>
-              <w:spacing w:before="30" w:after="30" w:line="276" w:lineRule="auto"/>
               <w:jc w:val="right"/>
             </w:pPr>
             <w:r>
@@ -3450,8 +3450,8 @@
           <w:p>
             <w:pPr>
               <w:bidi/>
+              <w:spacing w:before="30" w:after="30" w:line="276" w:lineRule="auto"/>
               <w:ind w:right="340"/>
-              <w:spacing w:before="30" w:after="30" w:line="276" w:lineRule="auto"/>
               <w:jc w:val="right"/>
             </w:pPr>
             <w:r>
@@ -3593,8 +3593,8 @@
           <w:p>
             <w:pPr>
               <w:bidi/>
+              <w:spacing w:before="30" w:after="30" w:line="276" w:lineRule="auto"/>
               <w:ind w:right="340"/>
-              <w:spacing w:before="30" w:after="30" w:line="276" w:lineRule="auto"/>
               <w:jc w:val="right"/>
             </w:pPr>
             <w:r>
@@ -3640,8 +3640,8 @@
           <w:p>
             <w:pPr>
               <w:bidi/>
+              <w:spacing w:before="30" w:after="30" w:line="276" w:lineRule="auto"/>
               <w:ind w:right="340"/>
-              <w:spacing w:before="30" w:after="30" w:line="276" w:lineRule="auto"/>
               <w:jc w:val="right"/>
             </w:pPr>
             <w:r>
@@ -3687,8 +3687,8 @@
           <w:p>
             <w:pPr>
               <w:bidi/>
+              <w:spacing w:before="30" w:after="30" w:line="276" w:lineRule="auto"/>
               <w:ind w:right="340"/>
-              <w:spacing w:before="30" w:after="30" w:line="276" w:lineRule="auto"/>
               <w:jc w:val="right"/>
             </w:pPr>
             <w:r>
@@ -3734,8 +3734,8 @@
           <w:p>
             <w:pPr>
               <w:bidi/>
+              <w:spacing w:before="30" w:after="30" w:line="276" w:lineRule="auto"/>
               <w:ind w:right="340"/>
-              <w:spacing w:before="30" w:after="30" w:line="276" w:lineRule="auto"/>
               <w:jc w:val="right"/>
             </w:pPr>
             <w:r>
@@ -3798,9 +3798,9 @@
     </w:p>
     <w:tbl>
       <w:tblPr>
+        <w:bidiVisual/>
         <w:tblW w:w="9000" w:type="dxa"/>
         <w:jc w:val="center"/>
-        <w:bidiVisual/>
         <w:tblBorders>
           <w:top w:val="single" w:sz="6" w:space="0" w:color="000000"/>
           <w:left w:val="single" w:sz="6" w:space="0" w:color="000000"/>
@@ -6120,9 +6120,9 @@
             <w:rFonts w:ascii="Simplified Arabic" w:hAnsi="Simplified Arabic" w:cs="Simplified Arabic"/>
             <w:b/>
             <w:bCs/>
-            <w:u w:val="single"/>
             <w:sz w:val="28"/>
             <w:szCs w:val="28"/>
+            <w:u w:val="single"/>
             <w:rtl/>
           </w:rPr>
           <w:t>موقع الدراسة</w:t>
@@ -6247,9 +6247,9 @@
             <w:rFonts w:ascii="Simplified Arabic" w:hAnsi="Simplified Arabic" w:cs="Simplified Arabic"/>
             <w:b/>
             <w:bCs/>
-            <w:u w:val="single"/>
             <w:sz w:val="28"/>
             <w:szCs w:val="28"/>
+            <w:u w:val="single"/>
             <w:rtl/>
           </w:rPr>
           <w:t>موقع الدراسة</w:t>
@@ -6374,9 +6374,9 @@
             <w:rFonts w:ascii="Simplified Arabic" w:hAnsi="Simplified Arabic" w:cs="Simplified Arabic"/>
             <w:b/>
             <w:bCs/>
-            <w:u w:val="single"/>
             <w:sz w:val="28"/>
             <w:szCs w:val="28"/>
+            <w:u w:val="single"/>
             <w:rtl/>
           </w:rPr>
           <w:t>موقع الدراسة</w:t>
@@ -6501,9 +6501,9 @@
             <w:rFonts w:ascii="Simplified Arabic" w:hAnsi="Simplified Arabic" w:cs="Simplified Arabic"/>
             <w:b/>
             <w:bCs/>
-            <w:u w:val="single"/>
             <w:sz w:val="28"/>
             <w:szCs w:val="28"/>
+            <w:u w:val="single"/>
             <w:rtl/>
           </w:rPr>
           <w:t>موقع الدراسة</w:t>
@@ -6628,9 +6628,9 @@
             <w:rFonts w:ascii="Simplified Arabic" w:hAnsi="Simplified Arabic" w:cs="Simplified Arabic"/>
             <w:b/>
             <w:bCs/>
-            <w:u w:val="single"/>
             <w:sz w:val="28"/>
             <w:szCs w:val="28"/>
+            <w:u w:val="single"/>
             <w:rtl/>
           </w:rPr>
           <w:t>موقع الدراسة</w:t>
@@ -6755,9 +6755,9 @@
             <w:rFonts w:ascii="Simplified Arabic" w:hAnsi="Simplified Arabic" w:cs="Simplified Arabic"/>
             <w:b/>
             <w:bCs/>
-            <w:u w:val="single"/>
             <w:sz w:val="28"/>
             <w:szCs w:val="28"/>
+            <w:u w:val="single"/>
             <w:rtl/>
           </w:rPr>
           <w:t>موقع الدراسة</w:t>
@@ -6882,9 +6882,9 @@
             <w:rFonts w:ascii="Simplified Arabic" w:hAnsi="Simplified Arabic" w:cs="Simplified Arabic"/>
             <w:b/>
             <w:bCs/>
-            <w:u w:val="single"/>
             <w:sz w:val="28"/>
             <w:szCs w:val="28"/>
+            <w:u w:val="single"/>
             <w:rtl/>
           </w:rPr>
           <w:t>موقع الدراسة</w:t>
@@ -7009,9 +7009,9 @@
             <w:rFonts w:ascii="Simplified Arabic" w:hAnsi="Simplified Arabic" w:cs="Simplified Arabic"/>
             <w:b/>
             <w:bCs/>
-            <w:u w:val="single"/>
             <w:sz w:val="28"/>
             <w:szCs w:val="28"/>
+            <w:u w:val="single"/>
             <w:rtl/>
           </w:rPr>
           <w:t>موقع الدراسة</w:t>
@@ -7136,9 +7136,9 @@
             <w:rFonts w:ascii="Simplified Arabic" w:hAnsi="Simplified Arabic" w:cs="Simplified Arabic"/>
             <w:b/>
             <w:bCs/>
-            <w:u w:val="single"/>
             <w:sz w:val="28"/>
             <w:szCs w:val="28"/>
+            <w:u w:val="single"/>
             <w:rtl/>
           </w:rPr>
           <w:t>موقع الدراسة</w:t>
@@ -7263,9 +7263,9 @@
             <w:rFonts w:ascii="Simplified Arabic" w:hAnsi="Simplified Arabic" w:cs="Simplified Arabic"/>
             <w:b/>
             <w:bCs/>
-            <w:u w:val="single"/>
             <w:sz w:val="28"/>
             <w:szCs w:val="28"/>
+            <w:u w:val="single"/>
             <w:rtl/>
           </w:rPr>
           <w:t>موقع الدراسة</w:t>
@@ -7390,9 +7390,9 @@
             <w:rFonts w:ascii="Simplified Arabic" w:hAnsi="Simplified Arabic" w:cs="Simplified Arabic"/>
             <w:b/>
             <w:bCs/>
-            <w:u w:val="single"/>
             <w:sz w:val="28"/>
             <w:szCs w:val="28"/>
+            <w:u w:val="single"/>
             <w:rtl/>
           </w:rPr>
           <w:t>موقع الدراسة</w:t>
@@ -7517,9 +7517,9 @@
             <w:rFonts w:ascii="Simplified Arabic" w:hAnsi="Simplified Arabic" w:cs="Simplified Arabic"/>
             <w:b/>
             <w:bCs/>
-            <w:u w:val="single"/>
             <w:sz w:val="28"/>
             <w:szCs w:val="28"/>
+            <w:u w:val="single"/>
             <w:rtl/>
           </w:rPr>
           <w:t>موقع الدراسة</w:t>
@@ -7920,9 +7920,9 @@
             <w:rFonts w:ascii="Simplified Arabic" w:hAnsi="Simplified Arabic" w:cs="Simplified Arabic"/>
             <w:b/>
             <w:bCs/>
-            <w:u w:val="single"/>
             <w:sz w:val="28"/>
             <w:szCs w:val="28"/>
+            <w:u w:val="single"/>
             <w:rtl/>
           </w:rPr>
           <w:t>موقع الدراسة</w:t>
@@ -8047,9 +8047,9 @@
             <w:rFonts w:ascii="Simplified Arabic" w:hAnsi="Simplified Arabic" w:cs="Simplified Arabic"/>
             <w:b/>
             <w:bCs/>
-            <w:u w:val="single"/>
             <w:sz w:val="28"/>
             <w:szCs w:val="28"/>
+            <w:u w:val="single"/>
             <w:rtl/>
           </w:rPr>
           <w:t>موقع الدراسة</w:t>
@@ -8174,9 +8174,9 @@
             <w:rFonts w:ascii="Simplified Arabic" w:hAnsi="Simplified Arabic" w:cs="Simplified Arabic"/>
             <w:b/>
             <w:bCs/>
-            <w:u w:val="single"/>
             <w:sz w:val="28"/>
             <w:szCs w:val="28"/>
+            <w:u w:val="single"/>
             <w:rtl/>
           </w:rPr>
           <w:t>موقع الدراسة</w:t>
@@ -8301,9 +8301,9 @@
             <w:rFonts w:ascii="Simplified Arabic" w:hAnsi="Simplified Arabic" w:cs="Simplified Arabic"/>
             <w:b/>
             <w:bCs/>
-            <w:u w:val="single"/>
             <w:sz w:val="28"/>
             <w:szCs w:val="28"/>
+            <w:u w:val="single"/>
             <w:rtl/>
           </w:rPr>
           <w:t>موقع الدراسة</w:t>
@@ -8428,9 +8428,9 @@
             <w:rFonts w:ascii="Simplified Arabic" w:hAnsi="Simplified Arabic" w:cs="Simplified Arabic"/>
             <w:b/>
             <w:bCs/>
-            <w:u w:val="single"/>
             <w:sz w:val="28"/>
             <w:szCs w:val="28"/>
+            <w:u w:val="single"/>
             <w:rtl/>
           </w:rPr>
           <w:t>موقع الدراسة</w:t>
@@ -8555,9 +8555,9 @@
             <w:rFonts w:ascii="Simplified Arabic" w:hAnsi="Simplified Arabic" w:cs="Simplified Arabic"/>
             <w:b/>
             <w:bCs/>
-            <w:u w:val="single"/>
             <w:sz w:val="28"/>
             <w:szCs w:val="28"/>
+            <w:u w:val="single"/>
             <w:rtl/>
           </w:rPr>
           <w:t>موقع الدراسة</w:t>
@@ -44467,9 +44467,9 @@
     </w:p>
     <w:tbl>
       <w:tblPr>
+        <w:bidiVisual/>
         <w:tblW w:w="9000" w:type="dxa"/>
         <w:jc w:val="center"/>
-        <w:bidiVisual/>
         <w:tblBorders>
           <w:top w:val="single" w:sz="6" w:space="0" w:color="000000"/>
           <w:left w:val="single" w:sz="6" w:space="0" w:color="000000"/>
@@ -44637,8 +44637,8 @@
           <w:p>
             <w:pPr>
               <w:bidi/>
+              <w:spacing w:before="30" w:after="30" w:line="276" w:lineRule="auto"/>
               <w:ind w:right="340"/>
-              <w:spacing w:before="30" w:after="30" w:line="276" w:lineRule="auto"/>
               <w:jc w:val="right"/>
             </w:pPr>
             <w:r>
@@ -44684,8 +44684,8 @@
           <w:p>
             <w:pPr>
               <w:bidi/>
+              <w:spacing w:before="30" w:after="30" w:line="276" w:lineRule="auto"/>
               <w:ind w:right="340"/>
-              <w:spacing w:before="30" w:after="30" w:line="276" w:lineRule="auto"/>
               <w:jc w:val="right"/>
             </w:pPr>
             <w:r>
@@ -44731,8 +44731,8 @@
           <w:p>
             <w:pPr>
               <w:bidi/>
+              <w:spacing w:before="30" w:after="30" w:line="276" w:lineRule="auto"/>
               <w:ind w:right="340"/>
-              <w:spacing w:before="30" w:after="30" w:line="276" w:lineRule="auto"/>
               <w:jc w:val="right"/>
             </w:pPr>
             <w:r>
@@ -44778,8 +44778,8 @@
           <w:p>
             <w:pPr>
               <w:bidi/>
+              <w:spacing w:before="30" w:after="30" w:line="276" w:lineRule="auto"/>
               <w:ind w:right="340"/>
-              <w:spacing w:before="30" w:after="30" w:line="276" w:lineRule="auto"/>
               <w:jc w:val="right"/>
             </w:pPr>
             <w:r>
@@ -44825,8 +44825,8 @@
           <w:p>
             <w:pPr>
               <w:bidi/>
+              <w:spacing w:before="30" w:after="30" w:line="276" w:lineRule="auto"/>
               <w:ind w:right="340"/>
-              <w:spacing w:before="30" w:after="30" w:line="276" w:lineRule="auto"/>
               <w:jc w:val="right"/>
             </w:pPr>
             <w:r>
@@ -44872,8 +44872,8 @@
           <w:p>
             <w:pPr>
               <w:bidi/>
+              <w:spacing w:before="30" w:after="30" w:line="276" w:lineRule="auto"/>
               <w:ind w:right="340"/>
-              <w:spacing w:before="30" w:after="30" w:line="276" w:lineRule="auto"/>
               <w:jc w:val="right"/>
             </w:pPr>
             <w:r>
@@ -45464,9 +45464,9 @@
     </w:p>
     <w:tbl>
       <w:tblPr>
+        <w:bidiVisual/>
         <w:tblW w:w="9000" w:type="dxa"/>
         <w:jc w:val="center"/>
-        <w:bidiVisual/>
         <w:tblBorders>
           <w:top w:val="single" w:sz="6" w:space="0" w:color="000000"/>
           <w:left w:val="single" w:sz="6" w:space="0" w:color="000000"/>
@@ -45538,8 +45538,8 @@
           <w:p>
             <w:pPr>
               <w:bidi/>
+              <w:spacing w:before="30" w:after="30" w:line="276" w:lineRule="auto"/>
               <w:ind w:right="340"/>
-              <w:spacing w:before="30" w:after="30" w:line="276" w:lineRule="auto"/>
               <w:jc w:val="right"/>
             </w:pPr>
             <w:r>
@@ -45585,8 +45585,8 @@
           <w:p>
             <w:pPr>
               <w:bidi/>
+              <w:spacing w:before="30" w:after="30" w:line="276" w:lineRule="auto"/>
               <w:ind w:right="340"/>
-              <w:spacing w:before="30" w:after="30" w:line="276" w:lineRule="auto"/>
               <w:jc w:val="right"/>
             </w:pPr>
             <w:r>
@@ -45649,9 +45649,9 @@
     </w:p>
     <w:tbl>
       <w:tblPr>
+        <w:bidiVisual/>
         <w:tblW w:w="9000" w:type="dxa"/>
         <w:jc w:val="center"/>
-        <w:bidiVisual/>
         <w:tblBorders>
           <w:top w:val="single" w:sz="6" w:space="0" w:color="000000"/>
           <w:left w:val="single" w:sz="6" w:space="0" w:color="000000"/>
@@ -45723,8 +45723,8 @@
           <w:p>
             <w:pPr>
               <w:bidi/>
+              <w:spacing w:before="30" w:after="30" w:line="276" w:lineRule="auto"/>
               <w:ind w:right="340"/>
-              <w:spacing w:before="30" w:after="30" w:line="276" w:lineRule="auto"/>
               <w:jc w:val="right"/>
             </w:pPr>
             <w:r>
@@ -45770,8 +45770,8 @@
           <w:p>
             <w:pPr>
               <w:bidi/>
+              <w:spacing w:before="30" w:after="30" w:line="276" w:lineRule="auto"/>
               <w:ind w:right="340"/>
-              <w:spacing w:before="30" w:after="30" w:line="276" w:lineRule="auto"/>
               <w:jc w:val="right"/>
             </w:pPr>
             <w:r>
@@ -45817,8 +45817,8 @@
           <w:p>
             <w:pPr>
               <w:bidi/>
+              <w:spacing w:before="30" w:after="30" w:line="276" w:lineRule="auto"/>
               <w:ind w:right="340"/>
-              <w:spacing w:before="30" w:after="30" w:line="276" w:lineRule="auto"/>
               <w:jc w:val="right"/>
             </w:pPr>
             <w:r>
@@ -45960,8 +45960,8 @@
           <w:p>
             <w:pPr>
               <w:bidi/>
+              <w:spacing w:before="30" w:after="30" w:line="276" w:lineRule="auto"/>
               <w:ind w:right="340"/>
-              <w:spacing w:before="30" w:after="30" w:line="276" w:lineRule="auto"/>
               <w:jc w:val="right"/>
             </w:pPr>
             <w:r>
@@ -46007,8 +46007,8 @@
           <w:p>
             <w:pPr>
               <w:bidi/>
+              <w:spacing w:before="30" w:after="30" w:line="276" w:lineRule="auto"/>
               <w:ind w:right="340"/>
-              <w:spacing w:before="30" w:after="30" w:line="276" w:lineRule="auto"/>
               <w:jc w:val="right"/>
             </w:pPr>
             <w:r>
@@ -46054,8 +46054,8 @@
           <w:p>
             <w:pPr>
               <w:bidi/>
+              <w:spacing w:before="30" w:after="30" w:line="276" w:lineRule="auto"/>
               <w:ind w:right="340"/>
-              <w:spacing w:before="30" w:after="30" w:line="276" w:lineRule="auto"/>
               <w:jc w:val="right"/>
             </w:pPr>
             <w:r>
@@ -46118,9 +46118,9 @@
     </w:p>
     <w:tbl>
       <w:tblPr>
+        <w:bidiVisual/>
         <w:tblW w:w="9000" w:type="dxa"/>
         <w:jc w:val="center"/>
-        <w:bidiVisual/>
         <w:tblBorders>
           <w:top w:val="single" w:sz="6" w:space="0" w:color="000000"/>
           <w:left w:val="single" w:sz="6" w:space="0" w:color="000000"/>
@@ -46192,8 +46192,8 @@
           <w:p>
             <w:pPr>
               <w:bidi/>
+              <w:spacing w:before="30" w:after="30" w:line="276" w:lineRule="auto"/>
               <w:ind w:right="340"/>
-              <w:spacing w:before="30" w:after="30" w:line="276" w:lineRule="auto"/>
               <w:jc w:val="right"/>
             </w:pPr>
             <w:r>
@@ -46239,8 +46239,8 @@
           <w:p>
             <w:pPr>
               <w:bidi/>
+              <w:spacing w:before="30" w:after="30" w:line="276" w:lineRule="auto"/>
               <w:ind w:right="340"/>
-              <w:spacing w:before="30" w:after="30" w:line="276" w:lineRule="auto"/>
               <w:jc w:val="right"/>
             </w:pPr>
             <w:r>
@@ -46286,8 +46286,8 @@
           <w:p>
             <w:pPr>
               <w:bidi/>
+              <w:spacing w:before="30" w:after="30" w:line="276" w:lineRule="auto"/>
               <w:ind w:right="340"/>
-              <w:spacing w:before="30" w:after="30" w:line="276" w:lineRule="auto"/>
               <w:jc w:val="right"/>
             </w:pPr>
             <w:r>
@@ -46333,8 +46333,8 @@
           <w:p>
             <w:pPr>
               <w:bidi/>
+              <w:spacing w:before="30" w:after="30" w:line="276" w:lineRule="auto"/>
               <w:ind w:right="340"/>
-              <w:spacing w:before="30" w:after="30" w:line="276" w:lineRule="auto"/>
               <w:jc w:val="right"/>
             </w:pPr>
             <w:r>
@@ -46397,9 +46397,9 @@
     </w:p>
     <w:tbl>
       <w:tblPr>
+        <w:bidiVisual/>
         <w:tblW w:w="9000" w:type="dxa"/>
         <w:jc w:val="center"/>
-        <w:bidiVisual/>
         <w:tblBorders>
           <w:top w:val="single" w:sz="6" w:space="0" w:color="000000"/>
           <w:left w:val="single" w:sz="6" w:space="0" w:color="000000"/>
@@ -46471,8 +46471,8 @@
           <w:p>
             <w:pPr>
               <w:bidi/>
+              <w:spacing w:before="30" w:after="30" w:line="276" w:lineRule="auto"/>
               <w:ind w:right="340"/>
-              <w:spacing w:before="30" w:after="30" w:line="276" w:lineRule="auto"/>
               <w:jc w:val="right"/>
             </w:pPr>
             <w:r>
@@ -46518,8 +46518,8 @@
           <w:p>
             <w:pPr>
               <w:bidi/>
+              <w:spacing w:before="30" w:after="30" w:line="276" w:lineRule="auto"/>
               <w:ind w:right="340"/>
-              <w:spacing w:before="30" w:after="30" w:line="276" w:lineRule="auto"/>
               <w:jc w:val="right"/>
             </w:pPr>
             <w:r>
@@ -46565,8 +46565,8 @@
           <w:p>
             <w:pPr>
               <w:bidi/>
+              <w:spacing w:before="30" w:after="30" w:line="276" w:lineRule="auto"/>
               <w:ind w:right="340"/>
-              <w:spacing w:before="30" w:after="30" w:line="276" w:lineRule="auto"/>
               <w:jc w:val="right"/>
             </w:pPr>
             <w:r>
@@ -46612,8 +46612,8 @@
           <w:p>
             <w:pPr>
               <w:bidi/>
+              <w:spacing w:before="30" w:after="30" w:line="276" w:lineRule="auto"/>
               <w:ind w:right="340"/>
-              <w:spacing w:before="30" w:after="30" w:line="276" w:lineRule="auto"/>
               <w:jc w:val="right"/>
             </w:pPr>
             <w:r>
@@ -46659,8 +46659,8 @@
           <w:p>
             <w:pPr>
               <w:bidi/>
+              <w:spacing w:before="30" w:after="30" w:line="276" w:lineRule="auto"/>
               <w:ind w:right="340"/>
-              <w:spacing w:before="30" w:after="30" w:line="276" w:lineRule="auto"/>
               <w:jc w:val="right"/>
             </w:pPr>
             <w:r>
@@ -46706,8 +46706,8 @@
           <w:p>
             <w:pPr>
               <w:bidi/>
+              <w:spacing w:before="30" w:after="30" w:line="276" w:lineRule="auto"/>
               <w:ind w:right="340"/>
-              <w:spacing w:before="30" w:after="30" w:line="276" w:lineRule="auto"/>
               <w:jc w:val="right"/>
             </w:pPr>
             <w:r>
@@ -46753,8 +46753,8 @@
           <w:p>
             <w:pPr>
               <w:bidi/>
+              <w:spacing w:before="30" w:after="30" w:line="276" w:lineRule="auto"/>
               <w:ind w:right="340"/>
-              <w:spacing w:before="30" w:after="30" w:line="276" w:lineRule="auto"/>
               <w:jc w:val="right"/>
             </w:pPr>
             <w:r>
@@ -46800,8 +46800,8 @@
           <w:p>
             <w:pPr>
               <w:bidi/>
+              <w:spacing w:before="30" w:after="30" w:line="276" w:lineRule="auto"/>
               <w:ind w:right="340"/>
-              <w:spacing w:before="30" w:after="30" w:line="276" w:lineRule="auto"/>
               <w:jc w:val="right"/>
             </w:pPr>
             <w:r>
@@ -46847,8 +46847,8 @@
           <w:p>
             <w:pPr>
               <w:bidi/>
+              <w:spacing w:before="30" w:after="30" w:line="276" w:lineRule="auto"/>
               <w:ind w:right="340"/>
-              <w:spacing w:before="30" w:after="30" w:line="276" w:lineRule="auto"/>
               <w:jc w:val="right"/>
             </w:pPr>
             <w:r>
@@ -46894,8 +46894,8 @@
           <w:p>
             <w:pPr>
               <w:bidi/>
+              <w:spacing w:before="30" w:after="30" w:line="276" w:lineRule="auto"/>
               <w:ind w:right="340"/>
-              <w:spacing w:before="30" w:after="30" w:line="276" w:lineRule="auto"/>
               <w:jc w:val="right"/>
             </w:pPr>
             <w:r>
@@ -47085,8 +47085,8 @@
           <w:p>
             <w:pPr>
               <w:bidi/>
+              <w:spacing w:before="30" w:after="30" w:line="276" w:lineRule="auto"/>
               <w:ind w:right="340"/>
-              <w:spacing w:before="30" w:after="30" w:line="276" w:lineRule="auto"/>
               <w:jc w:val="right"/>
             </w:pPr>
             <w:r>
@@ -47228,8 +47228,8 @@
           <w:p>
             <w:pPr>
               <w:bidi/>
+              <w:spacing w:before="30" w:after="30" w:line="276" w:lineRule="auto"/>
               <w:ind w:right="340"/>
-              <w:spacing w:before="30" w:after="30" w:line="276" w:lineRule="auto"/>
               <w:jc w:val="right"/>
             </w:pPr>
             <w:r>
@@ -47371,8 +47371,8 @@
           <w:p>
             <w:pPr>
               <w:bidi/>
+              <w:spacing w:before="30" w:after="30" w:line="276" w:lineRule="auto"/>
               <w:ind w:right="340"/>
-              <w:spacing w:before="30" w:after="30" w:line="276" w:lineRule="auto"/>
               <w:jc w:val="right"/>
             </w:pPr>
             <w:r>
@@ -47418,8 +47418,8 @@
           <w:p>
             <w:pPr>
               <w:bidi/>
+              <w:spacing w:before="30" w:after="30" w:line="276" w:lineRule="auto"/>
               <w:ind w:right="340"/>
-              <w:spacing w:before="30" w:after="30" w:line="276" w:lineRule="auto"/>
               <w:jc w:val="right"/>
             </w:pPr>
             <w:r>
@@ -47465,8 +47465,8 @@
           <w:p>
             <w:pPr>
               <w:bidi/>
+              <w:spacing w:before="30" w:after="30" w:line="276" w:lineRule="auto"/>
               <w:ind w:right="340"/>
-              <w:spacing w:before="30" w:after="30" w:line="276" w:lineRule="auto"/>
               <w:jc w:val="right"/>
             </w:pPr>
             <w:r>
@@ -47512,8 +47512,8 @@
           <w:p>
             <w:pPr>
               <w:bidi/>
+              <w:spacing w:before="30" w:after="30" w:line="276" w:lineRule="auto"/>
               <w:ind w:right="340"/>
-              <w:spacing w:before="30" w:after="30" w:line="276" w:lineRule="auto"/>
               <w:jc w:val="right"/>
             </w:pPr>
             <w:r>
@@ -47576,9 +47576,9 @@
     </w:p>
     <w:tbl>
       <w:tblPr>
+        <w:bidiVisual/>
         <w:tblW w:w="9000" w:type="dxa"/>
         <w:jc w:val="center"/>
-        <w:bidiVisual/>
         <w:tblBorders>
           <w:top w:val="single" w:sz="6" w:space="0" w:color="000000"/>
           <w:left w:val="single" w:sz="6" w:space="0" w:color="000000"/>
@@ -60897,14 +60897,14 @@
       <w:b/>
       <w:bCs/>
       <w:i/>
-      <w:color w:val="000000"/>
-      <w:sz w:val="32"/>
-      <w:szCs w:val="32"/>
       <w14:shadow w14:blurRad="38100" w14:dist="25400" w14:dir="5400000" w14:sx="100000" w14:sy="100000" w14:kx="0" w14:ky="0" w14:algn="ctr">
         <w14:srgbClr w14:val="6E747A">
           <w14:alpha w14:val="57000"/>
         </w14:srgbClr>
       </w14:shadow>
+      <w:color w:val="000000"/>
+      <w:sz w:val="32"/>
+      <w:szCs w:val="32"/>
       <w14:textOutline w14:w="0" w14:cap="flat" w14:cmpd="sng" w14:algn="ctr">
         <w14:noFill/>
         <w14:prstDash w14:val="solid"/>
@@ -61016,14 +61016,14 @@
       <w:b/>
       <w:bCs/>
       <w:i/>
-      <w:color w:val="000000"/>
-      <w:sz w:val="32"/>
-      <w:szCs w:val="32"/>
       <w14:shadow w14:blurRad="38100" w14:dist="25400" w14:dir="5400000" w14:sx="100000" w14:sy="100000" w14:kx="0" w14:ky="0" w14:algn="ctr">
         <w14:srgbClr w14:val="6E747A">
           <w14:alpha w14:val="57000"/>
         </w14:srgbClr>
       </w14:shadow>
+      <w:color w:val="000000"/>
+      <w:sz w:val="32"/>
+      <w:szCs w:val="32"/>
       <w14:textOutline w14:w="0" w14:cap="flat" w14:cmpd="sng" w14:algn="ctr">
         <w14:noFill/>
         <w14:prstDash w14:val="solid"/>

</xml_diff>

<commit_message>
Remove orphan TOC field-end run left after replacing the front TOC
The old Word TOC's closing fldChar paragraph was not TOC-styled and survived
the replacement, leaving an unbalanced field that made Word refuse to open
the document.

Co-Authored-By: Claude Fable 5 <noreply@anthropic.com>
Claude-Session: https://claude.ai/code/session_01ESPDZE2KAqBUfzv5HLVvG7
</commit_message>
<xml_diff>
--- a/seminar/Khaled Othman Baransi 212165096.docx
+++ b/seminar/Khaled Othman Baransi 212165096.docx
@@ -4210,13 +4210,6 @@
           <w:rtl/>
         </w:rPr>
       </w:pPr>
-      <w:r>
-        <w:rPr>
-          <w:sz w:val="32"/>
-          <w:szCs w:val="44"/>
-        </w:rPr>
-        <w:fldChar w:fldCharType="end"/>
-      </w:r>
     </w:p>
     <w:p>
       <w:pPr>

</xml_diff>

<commit_message>
Recalibrate all page numbers to Word's actual 156-page layout
Calibrate the pagination model to the page count reported by the user's
Word save, then rewrite 128 contents-table page cells and all 55 index
page references accordingly.

Co-Authored-By: Claude Fable 5 <noreply@anthropic.com>
Claude-Session: https://claude.ai/code/session_01ESPDZE2KAqBUfzv5HLVvG7
</commit_message>
<xml_diff>
--- a/seminar/Khaled Othman Baransi 212165096.docx
+++ b/seminar/Khaled Othman Baransi 212165096.docx
@@ -625,7 +625,7 @@
                 <w:szCs w:val="26"/>
                 <w:rtl/>
               </w:rPr>
-              <w:t xml:space="preserve">2</w:t>
+              <w:t xml:space="preserve">3</w:t>
             </w:r>
           </w:p>
         </w:tc>
@@ -675,7 +675,7 @@
                 <w:szCs w:val="26"/>
                 <w:rtl/>
               </w:rPr>
-              <w:t xml:space="preserve">8</w:t>
+              <w:t xml:space="preserve">10</w:t>
             </w:r>
           </w:p>
         </w:tc>
@@ -725,7 +725,7 @@
                 <w:szCs w:val="26"/>
                 <w:rtl/>
               </w:rPr>
-              <w:t xml:space="preserve">6</w:t>
+              <w:t xml:space="preserve">9</w:t>
             </w:r>
           </w:p>
         </w:tc>
@@ -775,7 +775,7 @@
                 <w:szCs w:val="26"/>
                 <w:rtl/>
               </w:rPr>
-              <w:t xml:space="preserve">9</w:t>
+              <w:t xml:space="preserve">12</w:t>
             </w:r>
           </w:p>
         </w:tc>
@@ -825,7 +825,7 @@
                 <w:szCs w:val="26"/>
                 <w:rtl/>
               </w:rPr>
-              <w:t xml:space="preserve">10</w:t>
+              <w:t xml:space="preserve">13</w:t>
             </w:r>
           </w:p>
         </w:tc>
@@ -875,7 +875,7 @@
                 <w:szCs w:val="26"/>
                 <w:rtl/>
               </w:rPr>
-              <w:t xml:space="preserve">10</w:t>
+              <w:t xml:space="preserve">15</w:t>
             </w:r>
           </w:p>
         </w:tc>
@@ -925,7 +925,7 @@
                 <w:szCs w:val="26"/>
                 <w:rtl/>
               </w:rPr>
-              <w:t xml:space="preserve">11</w:t>
+              <w:t xml:space="preserve">16</w:t>
             </w:r>
           </w:p>
         </w:tc>
@@ -975,7 +975,7 @@
                 <w:szCs w:val="26"/>
                 <w:rtl/>
               </w:rPr>
-              <w:t xml:space="preserve">11</w:t>
+              <w:t xml:space="preserve">17</w:t>
             </w:r>
           </w:p>
         </w:tc>
@@ -1025,7 +1025,7 @@
                 <w:szCs w:val="26"/>
                 <w:rtl/>
               </w:rPr>
-              <w:t xml:space="preserve">12</w:t>
+              <w:t xml:space="preserve">18</w:t>
             </w:r>
           </w:p>
         </w:tc>
@@ -1075,7 +1075,7 @@
                 <w:szCs w:val="26"/>
                 <w:rtl/>
               </w:rPr>
-              <w:t xml:space="preserve">8</w:t>
+              <w:t xml:space="preserve">11</w:t>
             </w:r>
           </w:p>
         </w:tc>
@@ -1125,7 +1125,7 @@
                 <w:szCs w:val="26"/>
                 <w:rtl/>
               </w:rPr>
-              <w:t xml:space="preserve">1</w:t>
+              <w:t xml:space="preserve">2</w:t>
             </w:r>
           </w:p>
         </w:tc>
@@ -1225,7 +1225,7 @@
                 <w:szCs w:val="26"/>
                 <w:rtl/>
               </w:rPr>
-              <w:t xml:space="preserve">6</w:t>
+              <w:t xml:space="preserve">9</w:t>
             </w:r>
           </w:p>
         </w:tc>
@@ -1275,7 +1275,7 @@
                 <w:szCs w:val="26"/>
                 <w:rtl/>
               </w:rPr>
-              <w:t xml:space="preserve">8</w:t>
+              <w:t xml:space="preserve">11</w:t>
             </w:r>
           </w:p>
         </w:tc>
@@ -1325,7 +1325,7 @@
                 <w:szCs w:val="26"/>
                 <w:rtl/>
               </w:rPr>
-              <w:t xml:space="preserve">10</w:t>
+              <w:t xml:space="preserve">13</w:t>
             </w:r>
           </w:p>
         </w:tc>
@@ -1375,7 +1375,7 @@
                 <w:szCs w:val="26"/>
                 <w:rtl/>
               </w:rPr>
-              <w:t xml:space="preserve">10</w:t>
+              <w:t xml:space="preserve">14</w:t>
             </w:r>
           </w:p>
         </w:tc>
@@ -1425,7 +1425,7 @@
                 <w:szCs w:val="26"/>
                 <w:rtl/>
               </w:rPr>
-              <w:t xml:space="preserve">10</w:t>
+              <w:t xml:space="preserve">15</w:t>
             </w:r>
           </w:p>
         </w:tc>
@@ -1475,7 +1475,7 @@
                 <w:szCs w:val="26"/>
                 <w:rtl/>
               </w:rPr>
-              <w:t xml:space="preserve">11</w:t>
+              <w:t xml:space="preserve">16</w:t>
             </w:r>
           </w:p>
         </w:tc>
@@ -1525,7 +1525,7 @@
                 <w:szCs w:val="26"/>
                 <w:rtl/>
               </w:rPr>
-              <w:t xml:space="preserve">11</w:t>
+              <w:t xml:space="preserve">17</w:t>
             </w:r>
           </w:p>
         </w:tc>
@@ -1575,7 +1575,7 @@
                 <w:szCs w:val="26"/>
                 <w:rtl/>
               </w:rPr>
-              <w:t xml:space="preserve">12</w:t>
+              <w:t xml:space="preserve">18</w:t>
             </w:r>
           </w:p>
         </w:tc>
@@ -1661,7 +1661,7 @@
                 <w:szCs w:val="26"/>
                 <w:rtl/>
               </w:rPr>
-              <w:t xml:space="preserve">20</w:t>
+              <w:t xml:space="preserve">27</w:t>
             </w:r>
           </w:p>
         </w:tc>
@@ -1711,7 +1711,7 @@
                 <w:szCs w:val="26"/>
                 <w:rtl/>
               </w:rPr>
-              <w:t xml:space="preserve">20</w:t>
+              <w:t xml:space="preserve">27</w:t>
             </w:r>
           </w:p>
         </w:tc>
@@ -1847,7 +1847,7 @@
                 <w:szCs w:val="26"/>
                 <w:rtl/>
               </w:rPr>
-              <w:t xml:space="preserve">25</w:t>
+              <w:t xml:space="preserve">33</w:t>
             </w:r>
           </w:p>
         </w:tc>
@@ -1897,7 +1897,7 @@
                 <w:szCs w:val="26"/>
                 <w:rtl/>
               </w:rPr>
-              <w:t xml:space="preserve">25</w:t>
+              <w:t xml:space="preserve">33</w:t>
             </w:r>
           </w:p>
         </w:tc>
@@ -1947,7 +1947,7 @@
                 <w:szCs w:val="26"/>
                 <w:rtl/>
               </w:rPr>
-              <w:t xml:space="preserve">25</w:t>
+              <w:t xml:space="preserve">33</w:t>
             </w:r>
           </w:p>
         </w:tc>
@@ -1997,7 +1997,7 @@
                 <w:szCs w:val="26"/>
                 <w:rtl/>
               </w:rPr>
-              <w:t xml:space="preserve">26</w:t>
+              <w:t xml:space="preserve">35</w:t>
             </w:r>
           </w:p>
         </w:tc>
@@ -2147,7 +2147,7 @@
                 <w:szCs w:val="26"/>
                 <w:rtl/>
               </w:rPr>
-              <w:t xml:space="preserve">28</w:t>
+              <w:t xml:space="preserve">37</w:t>
             </w:r>
           </w:p>
         </w:tc>
@@ -2197,7 +2197,7 @@
                 <w:szCs w:val="26"/>
                 <w:rtl/>
               </w:rPr>
-              <w:t xml:space="preserve">28</w:t>
+              <w:t xml:space="preserve">38</w:t>
             </w:r>
           </w:p>
         </w:tc>
@@ -2247,7 +2247,7 @@
                 <w:szCs w:val="26"/>
                 <w:rtl/>
               </w:rPr>
-              <w:t xml:space="preserve">29</w:t>
+              <w:t xml:space="preserve">39</w:t>
             </w:r>
           </w:p>
         </w:tc>
@@ -2333,7 +2333,7 @@
                 <w:szCs w:val="26"/>
                 <w:rtl/>
               </w:rPr>
-              <w:t xml:space="preserve">31</w:t>
+              <w:t xml:space="preserve">41</w:t>
             </w:r>
           </w:p>
         </w:tc>
@@ -2383,7 +2383,7 @@
                 <w:szCs w:val="26"/>
                 <w:rtl/>
               </w:rPr>
-              <w:t xml:space="preserve">31</w:t>
+              <w:t xml:space="preserve">41</w:t>
             </w:r>
           </w:p>
         </w:tc>
@@ -2433,7 +2433,7 @@
                 <w:szCs w:val="26"/>
                 <w:rtl/>
               </w:rPr>
-              <w:t xml:space="preserve">31</w:t>
+              <w:t xml:space="preserve">42</w:t>
             </w:r>
           </w:p>
         </w:tc>
@@ -2483,7 +2483,7 @@
                 <w:szCs w:val="26"/>
                 <w:rtl/>
               </w:rPr>
-              <w:t xml:space="preserve">32</w:t>
+              <w:t xml:space="preserve">43</w:t>
             </w:r>
           </w:p>
         </w:tc>
@@ -2533,7 +2533,7 @@
                 <w:szCs w:val="26"/>
                 <w:rtl/>
               </w:rPr>
-              <w:t xml:space="preserve">33</w:t>
+              <w:t xml:space="preserve">43</w:t>
             </w:r>
           </w:p>
         </w:tc>
@@ -2619,7 +2619,7 @@
                 <w:szCs w:val="26"/>
                 <w:rtl/>
               </w:rPr>
-              <w:t xml:space="preserve">34</w:t>
+              <w:t xml:space="preserve">45</w:t>
             </w:r>
           </w:p>
         </w:tc>
@@ -2669,7 +2669,7 @@
                 <w:szCs w:val="26"/>
                 <w:rtl/>
               </w:rPr>
-              <w:t xml:space="preserve">34</w:t>
+              <w:t xml:space="preserve">45</w:t>
             </w:r>
           </w:p>
         </w:tc>
@@ -2719,7 +2719,7 @@
                 <w:szCs w:val="26"/>
                 <w:rtl/>
               </w:rPr>
-              <w:t xml:space="preserve">37</w:t>
+              <w:t xml:space="preserve">49</w:t>
             </w:r>
           </w:p>
         </w:tc>
@@ -2769,7 +2769,7 @@
                 <w:szCs w:val="26"/>
                 <w:rtl/>
               </w:rPr>
-              <w:t xml:space="preserve">38</w:t>
+              <w:t xml:space="preserve">50</w:t>
             </w:r>
           </w:p>
         </w:tc>
@@ -2819,7 +2819,7 @@
                 <w:szCs w:val="26"/>
                 <w:rtl/>
               </w:rPr>
-              <w:t xml:space="preserve">42</w:t>
+              <w:t xml:space="preserve">55</w:t>
             </w:r>
           </w:p>
         </w:tc>
@@ -2869,7 +2869,7 @@
                 <w:szCs w:val="26"/>
                 <w:rtl/>
               </w:rPr>
-              <w:t xml:space="preserve">48</w:t>
+              <w:t xml:space="preserve">63</w:t>
             </w:r>
           </w:p>
         </w:tc>
@@ -2919,7 +2919,7 @@
                 <w:szCs w:val="26"/>
                 <w:rtl/>
               </w:rPr>
-              <w:t xml:space="preserve">51</w:t>
+              <w:t xml:space="preserve">67</w:t>
             </w:r>
           </w:p>
         </w:tc>
@@ -2969,7 +2969,7 @@
                 <w:szCs w:val="26"/>
                 <w:rtl/>
               </w:rPr>
-              <w:t xml:space="preserve">58</w:t>
+              <w:t xml:space="preserve">76</w:t>
             </w:r>
           </w:p>
         </w:tc>
@@ -3019,7 +3019,7 @@
                 <w:szCs w:val="26"/>
                 <w:rtl/>
               </w:rPr>
-              <w:t xml:space="preserve">63</w:t>
+              <w:t xml:space="preserve">84</w:t>
             </w:r>
           </w:p>
         </w:tc>
@@ -3069,7 +3069,7 @@
                 <w:szCs w:val="26"/>
                 <w:rtl/>
               </w:rPr>
-              <w:t xml:space="preserve">69</w:t>
+              <w:t xml:space="preserve">92</w:t>
             </w:r>
           </w:p>
         </w:tc>
@@ -3119,7 +3119,7 @@
                 <w:szCs w:val="26"/>
                 <w:rtl/>
               </w:rPr>
-              <w:t xml:space="preserve">73</w:t>
+              <w:t xml:space="preserve">97</w:t>
             </w:r>
           </w:p>
         </w:tc>
@@ -3169,7 +3169,7 @@
                 <w:szCs w:val="26"/>
                 <w:rtl/>
               </w:rPr>
-              <w:t xml:space="preserve">73</w:t>
+              <w:t xml:space="preserve">98</w:t>
             </w:r>
           </w:p>
         </w:tc>
@@ -3219,7 +3219,7 @@
                 <w:szCs w:val="26"/>
                 <w:rtl/>
               </w:rPr>
-              <w:t xml:space="preserve">74</w:t>
+              <w:t xml:space="preserve">100</w:t>
             </w:r>
           </w:p>
         </w:tc>
@@ -3269,7 +3269,7 @@
                 <w:szCs w:val="26"/>
                 <w:rtl/>
               </w:rPr>
-              <w:t xml:space="preserve">76</w:t>
+              <w:t xml:space="preserve">103</w:t>
             </w:r>
           </w:p>
         </w:tc>
@@ -3319,7 +3319,7 @@
                 <w:szCs w:val="26"/>
                 <w:rtl/>
               </w:rPr>
-              <w:t xml:space="preserve">77</w:t>
+              <w:t xml:space="preserve">104</w:t>
             </w:r>
           </w:p>
         </w:tc>
@@ -3369,7 +3369,7 @@
                 <w:szCs w:val="26"/>
                 <w:rtl/>
               </w:rPr>
-              <w:t xml:space="preserve">77</w:t>
+              <w:t xml:space="preserve">105</w:t>
             </w:r>
           </w:p>
         </w:tc>
@@ -3419,7 +3419,7 @@
                 <w:szCs w:val="26"/>
                 <w:rtl/>
               </w:rPr>
-              <w:t xml:space="preserve">79</w:t>
+              <w:t xml:space="preserve">108</w:t>
             </w:r>
           </w:p>
         </w:tc>
@@ -3469,7 +3469,7 @@
                 <w:szCs w:val="26"/>
                 <w:rtl/>
               </w:rPr>
-              <w:t xml:space="preserve">81</w:t>
+              <w:t xml:space="preserve">110</w:t>
             </w:r>
           </w:p>
         </w:tc>
@@ -3519,7 +3519,7 @@
                 <w:szCs w:val="26"/>
                 <w:rtl/>
               </w:rPr>
-              <w:t xml:space="preserve">81</w:t>
+              <w:t xml:space="preserve">111</w:t>
             </w:r>
           </w:p>
         </w:tc>
@@ -3569,7 +3569,7 @@
                 <w:szCs w:val="26"/>
                 <w:rtl/>
               </w:rPr>
-              <w:t xml:space="preserve">83</w:t>
+              <w:t xml:space="preserve">114</w:t>
             </w:r>
           </w:p>
         </w:tc>
@@ -3619,7 +3619,7 @@
                 <w:szCs w:val="26"/>
                 <w:rtl/>
               </w:rPr>
-              <w:t xml:space="preserve">85</w:t>
+              <w:t xml:space="preserve">116</w:t>
             </w:r>
           </w:p>
         </w:tc>
@@ -3669,7 +3669,7 @@
                 <w:szCs w:val="26"/>
                 <w:rtl/>
               </w:rPr>
-              <w:t xml:space="preserve">89</w:t>
+              <w:t xml:space="preserve">123</w:t>
             </w:r>
           </w:p>
         </w:tc>
@@ -3719,7 +3719,7 @@
                 <w:szCs w:val="26"/>
                 <w:rtl/>
               </w:rPr>
-              <w:t xml:space="preserve">91</w:t>
+              <w:t xml:space="preserve">125</w:t>
             </w:r>
           </w:p>
         </w:tc>
@@ -3769,7 +3769,7 @@
                 <w:szCs w:val="26"/>
                 <w:rtl/>
               </w:rPr>
-              <w:t xml:space="preserve">92</w:t>
+              <w:t xml:space="preserve">126</w:t>
             </w:r>
           </w:p>
         </w:tc>
@@ -3855,7 +3855,7 @@
                 <w:szCs w:val="26"/>
                 <w:rtl/>
               </w:rPr>
-              <w:t xml:space="preserve">94</w:t>
+              <w:t xml:space="preserve">128</w:t>
             </w:r>
           </w:p>
         </w:tc>
@@ -3905,7 +3905,7 @@
                 <w:szCs w:val="26"/>
                 <w:rtl/>
               </w:rPr>
-              <w:t xml:space="preserve">96</w:t>
+              <w:t xml:space="preserve">132</w:t>
             </w:r>
           </w:p>
         </w:tc>
@@ -3955,7 +3955,7 @@
                 <w:szCs w:val="26"/>
                 <w:rtl/>
               </w:rPr>
-              <w:t xml:space="preserve">97</w:t>
+              <w:t xml:space="preserve">133</w:t>
             </w:r>
           </w:p>
         </w:tc>
@@ -4005,7 +4005,7 @@
                 <w:szCs w:val="26"/>
                 <w:rtl/>
               </w:rPr>
-              <w:t xml:space="preserve">97</w:t>
+              <w:t xml:space="preserve">134</w:t>
             </w:r>
           </w:p>
         </w:tc>
@@ -4105,7 +4105,7 @@
                 <w:szCs w:val="26"/>
                 <w:rtl/>
               </w:rPr>
-              <w:t xml:space="preserve">99</w:t>
+              <w:t xml:space="preserve">137</w:t>
             </w:r>
           </w:p>
         </w:tc>
@@ -4155,7 +4155,7 @@
                 <w:szCs w:val="26"/>
                 <w:rtl/>
               </w:rPr>
-              <w:t xml:space="preserve">100</w:t>
+              <w:t xml:space="preserve">138</w:t>
             </w:r>
           </w:p>
         </w:tc>
@@ -4205,7 +4205,7 @@
                 <w:szCs w:val="26"/>
                 <w:rtl/>
               </w:rPr>
-              <w:t xml:space="preserve">100</w:t>
+              <w:t xml:space="preserve">140</w:t>
             </w:r>
           </w:p>
         </w:tc>
@@ -42580,7 +42580,7 @@
           <w:szCs w:val="28"/>
           <w:rtl/>
         </w:rPr>
-        <w:t xml:space="preserve">(الصفحة: 27).</w:t>
+        <w:t xml:space="preserve">(الصفحة: 36).</w:t>
       </w:r>
     </w:p>
     <w:p>
@@ -42609,7 +42609,7 @@
           <w:szCs w:val="28"/>
           <w:rtl/>
         </w:rPr>
-        <w:t xml:space="preserve">(الصفحة: 27).</w:t>
+        <w:t xml:space="preserve">(الصفحة: 36).</w:t>
       </w:r>
     </w:p>
     <w:p>
@@ -42638,7 +42638,7 @@
           <w:szCs w:val="28"/>
           <w:rtl/>
         </w:rPr>
-        <w:t xml:space="preserve">(الصفحة: 35).</w:t>
+        <w:t xml:space="preserve">(الصفحة: 46).</w:t>
       </w:r>
     </w:p>
     <w:p>
@@ -42667,7 +42667,7 @@
           <w:szCs w:val="28"/>
           <w:rtl/>
         </w:rPr>
-        <w:t xml:space="preserve">(الصفحة: 36).</w:t>
+        <w:t xml:space="preserve">(الصفحة: 47).</w:t>
       </w:r>
     </w:p>
     <w:p>
@@ -42696,7 +42696,7 @@
           <w:szCs w:val="28"/>
           <w:rtl/>
         </w:rPr>
-        <w:t xml:space="preserve">(الصفحة: 40).</w:t>
+        <w:t xml:space="preserve">(الصفحة: 53).</w:t>
       </w:r>
     </w:p>
     <w:p>
@@ -42725,7 +42725,7 @@
           <w:szCs w:val="28"/>
           <w:rtl/>
         </w:rPr>
-        <w:t xml:space="preserve">(الصفحة: 40).</w:t>
+        <w:t xml:space="preserve">(الصفحة: 53).</w:t>
       </w:r>
     </w:p>
     <w:p>
@@ -42754,7 +42754,7 @@
           <w:szCs w:val="28"/>
           <w:rtl/>
         </w:rPr>
-        <w:t xml:space="preserve">(الصفحة: 40).</w:t>
+        <w:t xml:space="preserve">(الصفحة: 52).</w:t>
       </w:r>
     </w:p>
     <w:p>
@@ -42783,7 +42783,7 @@
           <w:szCs w:val="28"/>
           <w:rtl/>
         </w:rPr>
-        <w:t xml:space="preserve">(الصفحة: 49).</w:t>
+        <w:t xml:space="preserve">(الصفحة: 64).</w:t>
       </w:r>
     </w:p>
     <w:p>
@@ -42812,7 +42812,7 @@
           <w:szCs w:val="28"/>
           <w:rtl/>
         </w:rPr>
-        <w:t xml:space="preserve">(الصفحة: 50).</w:t>
+        <w:t xml:space="preserve">(الصفحة: 66).</w:t>
       </w:r>
     </w:p>
     <w:p>
@@ -42841,7 +42841,7 @@
           <w:szCs w:val="28"/>
           <w:rtl/>
         </w:rPr>
-        <w:t xml:space="preserve">(الصفحة: 53).</w:t>
+        <w:t xml:space="preserve">(الصفحة: 69).</w:t>
       </w:r>
     </w:p>
     <w:p>
@@ -42870,7 +42870,7 @@
           <w:szCs w:val="28"/>
           <w:rtl/>
         </w:rPr>
-        <w:t xml:space="preserve">(الصفحة: 56).</w:t>
+        <w:t xml:space="preserve">(الصفحة: 74).</w:t>
       </w:r>
     </w:p>
     <w:p>
@@ -42899,7 +42899,7 @@
           <w:szCs w:val="28"/>
           <w:rtl/>
         </w:rPr>
-        <w:t xml:space="preserve">(الصفحة: 61).</w:t>
+        <w:t xml:space="preserve">(الصفحة: 80).</w:t>
       </w:r>
     </w:p>
     <w:p>
@@ -42928,7 +42928,7 @@
           <w:szCs w:val="28"/>
           <w:rtl/>
         </w:rPr>
-        <w:t xml:space="preserve">(الصفحة: 64).</w:t>
+        <w:t xml:space="preserve">(الصفحة: 84).</w:t>
       </w:r>
     </w:p>
     <w:p>
@@ -42957,7 +42957,7 @@
           <w:szCs w:val="28"/>
           <w:rtl/>
         </w:rPr>
-        <w:t xml:space="preserve">(الصفحة: 64).</w:t>
+        <w:t xml:space="preserve">(الصفحة: 84).</w:t>
       </w:r>
     </w:p>
     <w:p>
@@ -42986,7 +42986,7 @@
           <w:szCs w:val="28"/>
           <w:rtl/>
         </w:rPr>
-        <w:t xml:space="preserve">(الصفحة: 68).</w:t>
+        <w:t xml:space="preserve">(الصفحة: 91).</w:t>
       </w:r>
     </w:p>
     <w:p>
@@ -43015,7 +43015,7 @@
           <w:szCs w:val="28"/>
           <w:rtl/>
         </w:rPr>
-        <w:t xml:space="preserve">(الصفحة: 70).</w:t>
+        <w:t xml:space="preserve">(الصفحة: 94).</w:t>
       </w:r>
     </w:p>
     <w:p>
@@ -43044,7 +43044,7 @@
           <w:szCs w:val="28"/>
           <w:rtl/>
         </w:rPr>
-        <w:t xml:space="preserve">(الصفحة: 71).</w:t>
+        <w:t xml:space="preserve">(الصفحة: 95).</w:t>
       </w:r>
     </w:p>
     <w:p>
@@ -43073,7 +43073,7 @@
           <w:szCs w:val="28"/>
           <w:rtl/>
         </w:rPr>
-        <w:t xml:space="preserve">(الصفحة: 72).</w:t>
+        <w:t xml:space="preserve">(الصفحة: 96).</w:t>
       </w:r>
     </w:p>
     <w:p>
@@ -43102,7 +43102,7 @@
           <w:szCs w:val="28"/>
           <w:rtl/>
         </w:rPr>
-        <w:t xml:space="preserve">(الصفحة: 73).</w:t>
+        <w:t xml:space="preserve">(الصفحة: 98).</w:t>
       </w:r>
     </w:p>
     <w:p>
@@ -43131,7 +43131,7 @@
           <w:szCs w:val="28"/>
           <w:rtl/>
         </w:rPr>
-        <w:t xml:space="preserve">(الصفحة: 75).</w:t>
+        <w:t xml:space="preserve">(الصفحة: 100).</w:t>
       </w:r>
     </w:p>
     <w:p>
@@ -43160,7 +43160,7 @@
           <w:szCs w:val="28"/>
           <w:rtl/>
         </w:rPr>
-        <w:t xml:space="preserve">(الصفحة: 77).</w:t>
+        <w:t xml:space="preserve">(الصفحة: 106).</w:t>
       </w:r>
     </w:p>
     <w:p>
@@ -43189,7 +43189,7 @@
           <w:szCs w:val="28"/>
           <w:rtl/>
         </w:rPr>
-        <w:t xml:space="preserve">(الصفحة: 78).</w:t>
+        <w:t xml:space="preserve">(الصفحة: 106).</w:t>
       </w:r>
     </w:p>
     <w:p>
@@ -43218,7 +43218,7 @@
           <w:szCs w:val="28"/>
           <w:rtl/>
         </w:rPr>
-        <w:t xml:space="preserve">(الصفحة: 80).</w:t>
+        <w:t xml:space="preserve">(الصفحة: 109).</w:t>
       </w:r>
     </w:p>
     <w:p>
@@ -43247,7 +43247,7 @@
           <w:szCs w:val="28"/>
           <w:rtl/>
         </w:rPr>
-        <w:t xml:space="preserve">(الصفحة: 81).</w:t>
+        <w:t xml:space="preserve">(الصفحة: 110).</w:t>
       </w:r>
     </w:p>
     <w:p>
@@ -43276,7 +43276,7 @@
           <w:szCs w:val="28"/>
           <w:rtl/>
         </w:rPr>
-        <w:t xml:space="preserve">(الصفحة: 84).</w:t>
+        <w:t xml:space="preserve">(الصفحة: 115).</w:t>
       </w:r>
     </w:p>
     <w:p>
@@ -43305,7 +43305,7 @@
           <w:szCs w:val="28"/>
           <w:rtl/>
         </w:rPr>
-        <w:t xml:space="preserve">(الصفحة: 87).</w:t>
+        <w:t xml:space="preserve">(الصفحة: 120).</w:t>
       </w:r>
     </w:p>
     <w:p>
@@ -43334,7 +43334,7 @@
           <w:szCs w:val="28"/>
           <w:rtl/>
         </w:rPr>
-        <w:t xml:space="preserve">(الصفحة: 95).</w:t>
+        <w:t xml:space="preserve">(الصفحة: 129).</w:t>
       </w:r>
     </w:p>
     <w:p>
@@ -43363,7 +43363,7 @@
           <w:szCs w:val="28"/>
           <w:rtl/>
         </w:rPr>
-        <w:t xml:space="preserve">(الصفحة: 29).</w:t>
+        <w:t xml:space="preserve">(الصفحة: 38).</w:t>
       </w:r>
     </w:p>
     <w:p>
@@ -43411,7 +43411,7 @@
           <w:szCs w:val="28"/>
           <w:rtl/>
         </w:rPr>
-        <w:t xml:space="preserve">(الصفحة: 82).</w:t>
+        <w:t xml:space="preserve">(الصفحة: 112).</w:t>
       </w:r>
     </w:p>
     <w:p>
@@ -43440,7 +43440,7 @@
           <w:szCs w:val="28"/>
           <w:rtl/>
         </w:rPr>
-        <w:t xml:space="preserve">(الصفحة: 38).</w:t>
+        <w:t xml:space="preserve">(الصفحة: 50).</w:t>
       </w:r>
     </w:p>
     <w:p>
@@ -43469,7 +43469,7 @@
           <w:szCs w:val="28"/>
           <w:rtl/>
         </w:rPr>
-        <w:t xml:space="preserve">(الصفحة: 87).</w:t>
+        <w:t xml:space="preserve">(الصفحة: 119).</w:t>
       </w:r>
     </w:p>
     <w:p>
@@ -43498,7 +43498,7 @@
           <w:szCs w:val="28"/>
           <w:rtl/>
         </w:rPr>
-        <w:t xml:space="preserve">(الصفحة: 11).</w:t>
+        <w:t xml:space="preserve">(الصفحة: 16).</w:t>
       </w:r>
     </w:p>
     <w:p>
@@ -43527,7 +43527,7 @@
           <w:szCs w:val="28"/>
           <w:rtl/>
         </w:rPr>
-        <w:t xml:space="preserve">(الصفحة: 11).</w:t>
+        <w:t xml:space="preserve">(الصفحة: 16).</w:t>
       </w:r>
     </w:p>
     <w:p>
@@ -43556,7 +43556,7 @@
           <w:szCs w:val="28"/>
           <w:rtl/>
         </w:rPr>
-        <w:t xml:space="preserve">(الصفحة: 30).</w:t>
+        <w:t xml:space="preserve">(الصفحة: 40).</w:t>
       </w:r>
     </w:p>
     <w:p>
@@ -43585,7 +43585,7 @@
           <w:szCs w:val="28"/>
           <w:rtl/>
         </w:rPr>
-        <w:t xml:space="preserve">(الصفحة: 81).</w:t>
+        <w:t xml:space="preserve">(الصفحة: 111).</w:t>
       </w:r>
     </w:p>
     <w:p>
@@ -43614,7 +43614,7 @@
           <w:szCs w:val="28"/>
           <w:rtl/>
         </w:rPr>
-        <w:t xml:space="preserve">(الصفحة: 34).</w:t>
+        <w:t xml:space="preserve">(الصفحة: 45).</w:t>
       </w:r>
     </w:p>
     <w:p>
@@ -43643,7 +43643,7 @@
           <w:szCs w:val="28"/>
           <w:rtl/>
         </w:rPr>
-        <w:t xml:space="preserve">(الصفحة: 84).</w:t>
+        <w:t xml:space="preserve">(الصفحة: 116).</w:t>
       </w:r>
     </w:p>
     <w:p>
@@ -43672,7 +43672,7 @@
           <w:szCs w:val="28"/>
           <w:rtl/>
         </w:rPr>
-        <w:t xml:space="preserve">(الصفحة: 84).</w:t>
+        <w:t xml:space="preserve">(الصفحة: 116).</w:t>
       </w:r>
     </w:p>
     <w:p>
@@ -43701,7 +43701,7 @@
           <w:szCs w:val="28"/>
           <w:rtl/>
         </w:rPr>
-        <w:t xml:space="preserve">(الصفحة: 12).</w:t>
+        <w:t xml:space="preserve">(الصفحة: 17).</w:t>
       </w:r>
     </w:p>
     <w:p>
@@ -43730,7 +43730,7 @@
           <w:szCs w:val="28"/>
           <w:rtl/>
         </w:rPr>
-        <w:t xml:space="preserve">(الصفحة: 43).</w:t>
+        <w:t xml:space="preserve">(الصفحة: 56).</w:t>
       </w:r>
     </w:p>
     <w:p>
@@ -43759,7 +43759,7 @@
           <w:szCs w:val="28"/>
           <w:rtl/>
         </w:rPr>
-        <w:t xml:space="preserve">(الصفحة: 61).</w:t>
+        <w:t xml:space="preserve">(الصفحة: 81).</w:t>
       </w:r>
     </w:p>
     <w:p>
@@ -43788,7 +43788,7 @@
           <w:szCs w:val="28"/>
           <w:rtl/>
         </w:rPr>
-        <w:t xml:space="preserve">(الصفحة: 34).</w:t>
+        <w:t xml:space="preserve">(الصفحة: 45).</w:t>
       </w:r>
     </w:p>
     <w:p>
@@ -43817,7 +43817,7 @@
           <w:szCs w:val="28"/>
           <w:rtl/>
         </w:rPr>
-        <w:t xml:space="preserve">(الصفحة: 64).</w:t>
+        <w:t xml:space="preserve">(الصفحة: 84).</w:t>
       </w:r>
     </w:p>
     <w:p>
@@ -43846,7 +43846,7 @@
           <w:szCs w:val="28"/>
           <w:rtl/>
         </w:rPr>
-        <w:t xml:space="preserve">(الصفحة: 34).</w:t>
+        <w:t xml:space="preserve">(الصفحة: 45).</w:t>
       </w:r>
     </w:p>
     <w:p>
@@ -43875,7 +43875,7 @@
           <w:szCs w:val="28"/>
           <w:rtl/>
         </w:rPr>
-        <w:t xml:space="preserve">(الصفحة: 86).</w:t>
+        <w:t xml:space="preserve">(الصفحة: 119).</w:t>
       </w:r>
     </w:p>
     <w:p>
@@ -43904,7 +43904,7 @@
           <w:szCs w:val="28"/>
           <w:rtl/>
         </w:rPr>
-        <w:t xml:space="preserve">(الصفحة: 87).</w:t>
+        <w:t xml:space="preserve">(الصفحة: 120).</w:t>
       </w:r>
     </w:p>
     <w:p>
@@ -43933,7 +43933,7 @@
           <w:szCs w:val="28"/>
           <w:rtl/>
         </w:rPr>
-        <w:t xml:space="preserve">(الصفحة: 38).</w:t>
+        <w:t xml:space="preserve">(الصفحة: 50).</w:t>
       </w:r>
     </w:p>
     <w:p>
@@ -43962,7 +43962,7 @@
           <w:szCs w:val="28"/>
           <w:rtl/>
         </w:rPr>
-        <w:t xml:space="preserve">(الصفحة: 16).</w:t>
+        <w:t xml:space="preserve">(الصفحة: 22).</w:t>
       </w:r>
     </w:p>
     <w:p>
@@ -43991,7 +43991,7 @@
           <w:szCs w:val="28"/>
           <w:rtl/>
         </w:rPr>
-        <w:t xml:space="preserve">(الصفحة: 57).</w:t>
+        <w:t xml:space="preserve">(الصفحة: 75).</w:t>
       </w:r>
     </w:p>
     <w:p>
@@ -44020,7 +44020,7 @@
           <w:szCs w:val="28"/>
           <w:rtl/>
         </w:rPr>
-        <w:t xml:space="preserve">(الصفحة: 60).</w:t>
+        <w:t xml:space="preserve">(الصفحة: 80).</w:t>
       </w:r>
     </w:p>
     <w:p>
@@ -44049,7 +44049,7 @@
           <w:szCs w:val="28"/>
           <w:rtl/>
         </w:rPr>
-        <w:t xml:space="preserve">(الصفحة: 52).</w:t>
+        <w:t xml:space="preserve">(الصفحة: 68).</w:t>
       </w:r>
     </w:p>
     <w:p>
@@ -44078,7 +44078,7 @@
           <w:szCs w:val="28"/>
           <w:rtl/>
         </w:rPr>
-        <w:t xml:space="preserve">(الصفحة: 51).</w:t>
+        <w:t xml:space="preserve">(الصفحة: 67).</w:t>
       </w:r>
     </w:p>
     <w:p>
@@ -44107,7 +44107,7 @@
           <w:szCs w:val="28"/>
           <w:rtl/>
         </w:rPr>
-        <w:t xml:space="preserve">(الصفحة: 61).</w:t>
+        <w:t xml:space="preserve">(الصفحة: 80).</w:t>
       </w:r>
     </w:p>
     <w:p>
@@ -44136,7 +44136,7 @@
           <w:szCs w:val="28"/>
           <w:rtl/>
         </w:rPr>
-        <w:t xml:space="preserve">(الصفحة: 68).</w:t>
+        <w:t xml:space="preserve">(الصفحة: 90).</w:t>
       </w:r>
     </w:p>
     <w:p>
@@ -44165,7 +44165,7 @@
           <w:szCs w:val="28"/>
           <w:rtl/>
         </w:rPr>
-        <w:t xml:space="preserve">(الصفحة: 17).</w:t>
+        <w:t xml:space="preserve">(الصفحة: 24).</w:t>
       </w:r>
     </w:p>
     <w:p>
@@ -44249,7 +44249,7 @@
                 <w:szCs w:val="26"/>
                 <w:rtl/>
               </w:rPr>
-              <w:t xml:space="preserve">2</w:t>
+              <w:t xml:space="preserve">3</w:t>
             </w:r>
           </w:p>
         </w:tc>
@@ -44299,7 +44299,7 @@
                 <w:szCs w:val="26"/>
                 <w:rtl/>
               </w:rPr>
-              <w:t xml:space="preserve">8</w:t>
+              <w:t xml:space="preserve">10</w:t>
             </w:r>
           </w:p>
         </w:tc>
@@ -44349,7 +44349,7 @@
                 <w:szCs w:val="26"/>
                 <w:rtl/>
               </w:rPr>
-              <w:t xml:space="preserve">6</w:t>
+              <w:t xml:space="preserve">9</w:t>
             </w:r>
           </w:p>
         </w:tc>
@@ -44399,7 +44399,7 @@
                 <w:szCs w:val="26"/>
                 <w:rtl/>
               </w:rPr>
-              <w:t xml:space="preserve">9</w:t>
+              <w:t xml:space="preserve">12</w:t>
             </w:r>
           </w:p>
         </w:tc>
@@ -44449,7 +44449,7 @@
                 <w:szCs w:val="26"/>
                 <w:rtl/>
               </w:rPr>
-              <w:t xml:space="preserve">10</w:t>
+              <w:t xml:space="preserve">13</w:t>
             </w:r>
           </w:p>
         </w:tc>
@@ -44499,7 +44499,7 @@
                 <w:szCs w:val="26"/>
                 <w:rtl/>
               </w:rPr>
-              <w:t xml:space="preserve">10</w:t>
+              <w:t xml:space="preserve">15</w:t>
             </w:r>
           </w:p>
         </w:tc>
@@ -44549,7 +44549,7 @@
                 <w:szCs w:val="26"/>
                 <w:rtl/>
               </w:rPr>
-              <w:t xml:space="preserve">11</w:t>
+              <w:t xml:space="preserve">16</w:t>
             </w:r>
           </w:p>
         </w:tc>
@@ -44599,7 +44599,7 @@
                 <w:szCs w:val="26"/>
                 <w:rtl/>
               </w:rPr>
-              <w:t xml:space="preserve">11</w:t>
+              <w:t xml:space="preserve">17</w:t>
             </w:r>
           </w:p>
         </w:tc>
@@ -44649,7 +44649,7 @@
                 <w:szCs w:val="26"/>
                 <w:rtl/>
               </w:rPr>
-              <w:t xml:space="preserve">12</w:t>
+              <w:t xml:space="preserve">18</w:t>
             </w:r>
           </w:p>
         </w:tc>
@@ -44699,7 +44699,7 @@
                 <w:szCs w:val="26"/>
                 <w:rtl/>
               </w:rPr>
-              <w:t xml:space="preserve">8</w:t>
+              <w:t xml:space="preserve">11</w:t>
             </w:r>
           </w:p>
         </w:tc>
@@ -44749,7 +44749,7 @@
                 <w:szCs w:val="26"/>
                 <w:rtl/>
               </w:rPr>
-              <w:t xml:space="preserve">1</w:t>
+              <w:t xml:space="preserve">2</w:t>
             </w:r>
           </w:p>
         </w:tc>
@@ -44849,7 +44849,7 @@
                 <w:szCs w:val="26"/>
                 <w:rtl/>
               </w:rPr>
-              <w:t xml:space="preserve">6</w:t>
+              <w:t xml:space="preserve">9</w:t>
             </w:r>
           </w:p>
         </w:tc>
@@ -44899,7 +44899,7 @@
                 <w:szCs w:val="26"/>
                 <w:rtl/>
               </w:rPr>
-              <w:t xml:space="preserve">8</w:t>
+              <w:t xml:space="preserve">11</w:t>
             </w:r>
           </w:p>
         </w:tc>
@@ -44949,7 +44949,7 @@
                 <w:szCs w:val="26"/>
                 <w:rtl/>
               </w:rPr>
-              <w:t xml:space="preserve">10</w:t>
+              <w:t xml:space="preserve">13</w:t>
             </w:r>
           </w:p>
         </w:tc>
@@ -44999,7 +44999,7 @@
                 <w:szCs w:val="26"/>
                 <w:rtl/>
               </w:rPr>
-              <w:t xml:space="preserve">10</w:t>
+              <w:t xml:space="preserve">14</w:t>
             </w:r>
           </w:p>
         </w:tc>
@@ -45049,7 +45049,7 @@
                 <w:szCs w:val="26"/>
                 <w:rtl/>
               </w:rPr>
-              <w:t xml:space="preserve">10</w:t>
+              <w:t xml:space="preserve">15</w:t>
             </w:r>
           </w:p>
         </w:tc>
@@ -45099,7 +45099,7 @@
                 <w:szCs w:val="26"/>
                 <w:rtl/>
               </w:rPr>
-              <w:t xml:space="preserve">11</w:t>
+              <w:t xml:space="preserve">16</w:t>
             </w:r>
           </w:p>
         </w:tc>
@@ -45149,7 +45149,7 @@
                 <w:szCs w:val="26"/>
                 <w:rtl/>
               </w:rPr>
-              <w:t xml:space="preserve">11</w:t>
+              <w:t xml:space="preserve">17</w:t>
             </w:r>
           </w:p>
         </w:tc>
@@ -45199,7 +45199,7 @@
                 <w:szCs w:val="26"/>
                 <w:rtl/>
               </w:rPr>
-              <w:t xml:space="preserve">12</w:t>
+              <w:t xml:space="preserve">18</w:t>
             </w:r>
           </w:p>
         </w:tc>
@@ -45285,7 +45285,7 @@
                 <w:szCs w:val="26"/>
                 <w:rtl/>
               </w:rPr>
-              <w:t xml:space="preserve">20</w:t>
+              <w:t xml:space="preserve">27</w:t>
             </w:r>
           </w:p>
         </w:tc>
@@ -45335,7 +45335,7 @@
                 <w:szCs w:val="26"/>
                 <w:rtl/>
               </w:rPr>
-              <w:t xml:space="preserve">20</w:t>
+              <w:t xml:space="preserve">27</w:t>
             </w:r>
           </w:p>
         </w:tc>
@@ -45471,7 +45471,7 @@
                 <w:szCs w:val="26"/>
                 <w:rtl/>
               </w:rPr>
-              <w:t xml:space="preserve">25</w:t>
+              <w:t xml:space="preserve">33</w:t>
             </w:r>
           </w:p>
         </w:tc>
@@ -45521,7 +45521,7 @@
                 <w:szCs w:val="26"/>
                 <w:rtl/>
               </w:rPr>
-              <w:t xml:space="preserve">25</w:t>
+              <w:t xml:space="preserve">33</w:t>
             </w:r>
           </w:p>
         </w:tc>
@@ -45571,7 +45571,7 @@
                 <w:szCs w:val="26"/>
                 <w:rtl/>
               </w:rPr>
-              <w:t xml:space="preserve">25</w:t>
+              <w:t xml:space="preserve">33</w:t>
             </w:r>
           </w:p>
         </w:tc>
@@ -45621,7 +45621,7 @@
                 <w:szCs w:val="26"/>
                 <w:rtl/>
               </w:rPr>
-              <w:t xml:space="preserve">26</w:t>
+              <w:t xml:space="preserve">35</w:t>
             </w:r>
           </w:p>
         </w:tc>
@@ -45771,7 +45771,7 @@
                 <w:szCs w:val="26"/>
                 <w:rtl/>
               </w:rPr>
-              <w:t xml:space="preserve">28</w:t>
+              <w:t xml:space="preserve">37</w:t>
             </w:r>
           </w:p>
         </w:tc>
@@ -45821,7 +45821,7 @@
                 <w:szCs w:val="26"/>
                 <w:rtl/>
               </w:rPr>
-              <w:t xml:space="preserve">28</w:t>
+              <w:t xml:space="preserve">38</w:t>
             </w:r>
           </w:p>
         </w:tc>
@@ -45871,7 +45871,7 @@
                 <w:szCs w:val="26"/>
                 <w:rtl/>
               </w:rPr>
-              <w:t xml:space="preserve">29</w:t>
+              <w:t xml:space="preserve">39</w:t>
             </w:r>
           </w:p>
         </w:tc>
@@ -45957,7 +45957,7 @@
                 <w:szCs w:val="26"/>
                 <w:rtl/>
               </w:rPr>
-              <w:t xml:space="preserve">31</w:t>
+              <w:t xml:space="preserve">41</w:t>
             </w:r>
           </w:p>
         </w:tc>
@@ -46007,7 +46007,7 @@
                 <w:szCs w:val="26"/>
                 <w:rtl/>
               </w:rPr>
-              <w:t xml:space="preserve">31</w:t>
+              <w:t xml:space="preserve">41</w:t>
             </w:r>
           </w:p>
         </w:tc>
@@ -46057,7 +46057,7 @@
                 <w:szCs w:val="26"/>
                 <w:rtl/>
               </w:rPr>
-              <w:t xml:space="preserve">31</w:t>
+              <w:t xml:space="preserve">42</w:t>
             </w:r>
           </w:p>
         </w:tc>
@@ -46107,7 +46107,7 @@
                 <w:szCs w:val="26"/>
                 <w:rtl/>
               </w:rPr>
-              <w:t xml:space="preserve">32</w:t>
+              <w:t xml:space="preserve">43</w:t>
             </w:r>
           </w:p>
         </w:tc>
@@ -46157,7 +46157,7 @@
                 <w:szCs w:val="26"/>
                 <w:rtl/>
               </w:rPr>
-              <w:t xml:space="preserve">33</w:t>
+              <w:t xml:space="preserve">43</w:t>
             </w:r>
           </w:p>
         </w:tc>
@@ -46243,7 +46243,7 @@
                 <w:szCs w:val="26"/>
                 <w:rtl/>
               </w:rPr>
-              <w:t xml:space="preserve">34</w:t>
+              <w:t xml:space="preserve">45</w:t>
             </w:r>
           </w:p>
         </w:tc>
@@ -46293,7 +46293,7 @@
                 <w:szCs w:val="26"/>
                 <w:rtl/>
               </w:rPr>
-              <w:t xml:space="preserve">34</w:t>
+              <w:t xml:space="preserve">45</w:t>
             </w:r>
           </w:p>
         </w:tc>
@@ -46343,7 +46343,7 @@
                 <w:szCs w:val="26"/>
                 <w:rtl/>
               </w:rPr>
-              <w:t xml:space="preserve">37</w:t>
+              <w:t xml:space="preserve">49</w:t>
             </w:r>
           </w:p>
         </w:tc>
@@ -46393,7 +46393,7 @@
                 <w:szCs w:val="26"/>
                 <w:rtl/>
               </w:rPr>
-              <w:t xml:space="preserve">38</w:t>
+              <w:t xml:space="preserve">50</w:t>
             </w:r>
           </w:p>
         </w:tc>
@@ -46443,7 +46443,7 @@
                 <w:szCs w:val="26"/>
                 <w:rtl/>
               </w:rPr>
-              <w:t xml:space="preserve">42</w:t>
+              <w:t xml:space="preserve">55</w:t>
             </w:r>
           </w:p>
         </w:tc>
@@ -46493,7 +46493,7 @@
                 <w:szCs w:val="26"/>
                 <w:rtl/>
               </w:rPr>
-              <w:t xml:space="preserve">48</w:t>
+              <w:t xml:space="preserve">63</w:t>
             </w:r>
           </w:p>
         </w:tc>
@@ -46543,7 +46543,7 @@
                 <w:szCs w:val="26"/>
                 <w:rtl/>
               </w:rPr>
-              <w:t xml:space="preserve">51</w:t>
+              <w:t xml:space="preserve">67</w:t>
             </w:r>
           </w:p>
         </w:tc>
@@ -46593,7 +46593,7 @@
                 <w:szCs w:val="26"/>
                 <w:rtl/>
               </w:rPr>
-              <w:t xml:space="preserve">58</w:t>
+              <w:t xml:space="preserve">76</w:t>
             </w:r>
           </w:p>
         </w:tc>
@@ -46643,7 +46643,7 @@
                 <w:szCs w:val="26"/>
                 <w:rtl/>
               </w:rPr>
-              <w:t xml:space="preserve">63</w:t>
+              <w:t xml:space="preserve">84</w:t>
             </w:r>
           </w:p>
         </w:tc>
@@ -46693,7 +46693,7 @@
                 <w:szCs w:val="26"/>
                 <w:rtl/>
               </w:rPr>
-              <w:t xml:space="preserve">69</w:t>
+              <w:t xml:space="preserve">92</w:t>
             </w:r>
           </w:p>
         </w:tc>
@@ -46743,7 +46743,7 @@
                 <w:szCs w:val="26"/>
                 <w:rtl/>
               </w:rPr>
-              <w:t xml:space="preserve">73</w:t>
+              <w:t xml:space="preserve">97</w:t>
             </w:r>
           </w:p>
         </w:tc>
@@ -46793,7 +46793,7 @@
                 <w:szCs w:val="26"/>
                 <w:rtl/>
               </w:rPr>
-              <w:t xml:space="preserve">73</w:t>
+              <w:t xml:space="preserve">98</w:t>
             </w:r>
           </w:p>
         </w:tc>
@@ -46843,7 +46843,7 @@
                 <w:szCs w:val="26"/>
                 <w:rtl/>
               </w:rPr>
-              <w:t xml:space="preserve">74</w:t>
+              <w:t xml:space="preserve">100</w:t>
             </w:r>
           </w:p>
         </w:tc>
@@ -46893,7 +46893,7 @@
                 <w:szCs w:val="26"/>
                 <w:rtl/>
               </w:rPr>
-              <w:t xml:space="preserve">76</w:t>
+              <w:t xml:space="preserve">103</w:t>
             </w:r>
           </w:p>
         </w:tc>
@@ -46943,7 +46943,7 @@
                 <w:szCs w:val="26"/>
                 <w:rtl/>
               </w:rPr>
-              <w:t xml:space="preserve">77</w:t>
+              <w:t xml:space="preserve">104</w:t>
             </w:r>
           </w:p>
         </w:tc>
@@ -46993,7 +46993,7 @@
                 <w:szCs w:val="26"/>
                 <w:rtl/>
               </w:rPr>
-              <w:t xml:space="preserve">77</w:t>
+              <w:t xml:space="preserve">105</w:t>
             </w:r>
           </w:p>
         </w:tc>
@@ -47043,7 +47043,7 @@
                 <w:szCs w:val="26"/>
                 <w:rtl/>
               </w:rPr>
-              <w:t xml:space="preserve">79</w:t>
+              <w:t xml:space="preserve">108</w:t>
             </w:r>
           </w:p>
         </w:tc>
@@ -47093,7 +47093,7 @@
                 <w:szCs w:val="26"/>
                 <w:rtl/>
               </w:rPr>
-              <w:t xml:space="preserve">81</w:t>
+              <w:t xml:space="preserve">110</w:t>
             </w:r>
           </w:p>
         </w:tc>
@@ -47143,7 +47143,7 @@
                 <w:szCs w:val="26"/>
                 <w:rtl/>
               </w:rPr>
-              <w:t xml:space="preserve">81</w:t>
+              <w:t xml:space="preserve">111</w:t>
             </w:r>
           </w:p>
         </w:tc>
@@ -47193,7 +47193,7 @@
                 <w:szCs w:val="26"/>
                 <w:rtl/>
               </w:rPr>
-              <w:t xml:space="preserve">83</w:t>
+              <w:t xml:space="preserve">114</w:t>
             </w:r>
           </w:p>
         </w:tc>
@@ -47243,7 +47243,7 @@
                 <w:szCs w:val="26"/>
                 <w:rtl/>
               </w:rPr>
-              <w:t xml:space="preserve">85</w:t>
+              <w:t xml:space="preserve">116</w:t>
             </w:r>
           </w:p>
         </w:tc>
@@ -47293,7 +47293,7 @@
                 <w:szCs w:val="26"/>
                 <w:rtl/>
               </w:rPr>
-              <w:t xml:space="preserve">89</w:t>
+              <w:t xml:space="preserve">123</w:t>
             </w:r>
           </w:p>
         </w:tc>
@@ -47343,7 +47343,7 @@
                 <w:szCs w:val="26"/>
                 <w:rtl/>
               </w:rPr>
-              <w:t xml:space="preserve">91</w:t>
+              <w:t xml:space="preserve">125</w:t>
             </w:r>
           </w:p>
         </w:tc>
@@ -47393,7 +47393,7 @@
                 <w:szCs w:val="26"/>
                 <w:rtl/>
               </w:rPr>
-              <w:t xml:space="preserve">92</w:t>
+              <w:t xml:space="preserve">126</w:t>
             </w:r>
           </w:p>
         </w:tc>
@@ -47479,7 +47479,7 @@
                 <w:szCs w:val="26"/>
                 <w:rtl/>
               </w:rPr>
-              <w:t xml:space="preserve">94</w:t>
+              <w:t xml:space="preserve">128</w:t>
             </w:r>
           </w:p>
         </w:tc>
@@ -47529,7 +47529,7 @@
                 <w:szCs w:val="26"/>
                 <w:rtl/>
               </w:rPr>
-              <w:t xml:space="preserve">96</w:t>
+              <w:t xml:space="preserve">132</w:t>
             </w:r>
           </w:p>
         </w:tc>
@@ -47579,7 +47579,7 @@
                 <w:szCs w:val="26"/>
                 <w:rtl/>
               </w:rPr>
-              <w:t xml:space="preserve">97</w:t>
+              <w:t xml:space="preserve">133</w:t>
             </w:r>
           </w:p>
         </w:tc>
@@ -47629,7 +47629,7 @@
                 <w:szCs w:val="26"/>
                 <w:rtl/>
               </w:rPr>
-              <w:t xml:space="preserve">97</w:t>
+              <w:t xml:space="preserve">134</w:t>
             </w:r>
           </w:p>
         </w:tc>
@@ -47729,7 +47729,7 @@
                 <w:szCs w:val="26"/>
                 <w:rtl/>
               </w:rPr>
-              <w:t xml:space="preserve">99</w:t>
+              <w:t xml:space="preserve">137</w:t>
             </w:r>
           </w:p>
         </w:tc>
@@ -47779,7 +47779,7 @@
                 <w:szCs w:val="26"/>
                 <w:rtl/>
               </w:rPr>
-              <w:t xml:space="preserve">100</w:t>
+              <w:t xml:space="preserve">138</w:t>
             </w:r>
           </w:p>
         </w:tc>
@@ -47829,7 +47829,7 @@
                 <w:szCs w:val="26"/>
                 <w:rtl/>
               </w:rPr>
-              <w:t xml:space="preserve">100</w:t>
+              <w:t xml:space="preserve">140</w:t>
             </w:r>
           </w:p>
         </w:tc>

</xml_diff>